<commit_message>
Cahier des charges : toutes les promesses du dossier envoyé à SENSAT, avec un responsable
</commit_message>
<xml_diff>
--- a/docs/Cahier_des_charges_TefesSat.docx
+++ b/docs/Cahier_des_charges_TefesSat.docx
@@ -643,7 +643,7 @@
                 <w:sz w:val="19"/>
                 <w:szCs w:val="19"/>
               </w:rPr>
-              <w:t xml:space="preserve">Carte des vitesses de recul</w:t>
+              <w:t xml:space="preserve">Animation de la brèche</w:t>
             </w:r>
           </w:p>
         </w:tc>
@@ -673,7 +673,7 @@
                 <w:sz w:val="19"/>
                 <w:szCs w:val="19"/>
               </w:rPr>
-              <w:t xml:space="preserve">Recul en m/an par tronçon de 50 m, avec le niveau de risque</w:t>
+              <w:t xml:space="preserve">Évolution de la brèche depuis 2003, à partir des images Landsat</w:t>
             </w:r>
           </w:p>
         </w:tc>
@@ -703,7 +703,7 @@
                 <w:sz w:val="19"/>
                 <w:szCs w:val="19"/>
               </w:rPr>
-              <w:t xml:space="preserve">Ndèye Fatou</w:t>
+              <w:t xml:space="preserve">Abdoulaye</w:t>
             </w:r>
           </w:p>
         </w:tc>
@@ -737,7 +737,7 @@
                 <w:sz w:val="19"/>
                 <w:szCs w:val="19"/>
               </w:rPr>
-              <w:t xml:space="preserve">Chiffres clés</w:t>
+              <w:t xml:space="preserve">Carte des vitesses de recul</w:t>
             </w:r>
           </w:p>
         </w:tc>
@@ -766,7 +766,7 @@
                 <w:sz w:val="19"/>
                 <w:szCs w:val="19"/>
               </w:rPr>
-              <w:t xml:space="preserve">Recul moyen et maximum, bâtiments et équipements menacés d’ici 2030, par quartier</w:t>
+              <w:t xml:space="preserve">Recul en m/an par tronçon de 50 m, de Guet Ndar à la brèche</w:t>
             </w:r>
           </w:p>
         </w:tc>
@@ -830,7 +830,7 @@
                 <w:sz w:val="19"/>
                 <w:szCs w:val="19"/>
               </w:rPr>
-              <w:t xml:space="preserve">Tableau de bord web</w:t>
+              <w:t xml:space="preserve">Carte de risque</w:t>
             </w:r>
           </w:p>
         </w:tc>
@@ -860,7 +860,7 @@
                 <w:sz w:val="19"/>
                 <w:szCs w:val="19"/>
               </w:rPr>
-              <w:t xml:space="preserve">Carte interactive : on clique sur un tronçon pour voir son historique et son risque</w:t>
+              <w:t xml:space="preserve">Niveau de risque (faible, moyen, élevé, très élevé) par tronçon, selon la vitesse de recul, l’altitude et le nombre de personnes exposées</w:t>
             </w:r>
           </w:p>
         </w:tc>
@@ -890,7 +890,7 @@
                 <w:sz w:val="19"/>
                 <w:szCs w:val="19"/>
               </w:rPr>
-              <w:t xml:space="preserve">Malick</w:t>
+              <w:t xml:space="preserve">Ndèye Fatou</w:t>
             </w:r>
           </w:p>
         </w:tc>
@@ -924,7 +924,7 @@
                 <w:sz w:val="19"/>
                 <w:szCs w:val="19"/>
               </w:rPr>
-              <w:t xml:space="preserve">Vidéo de démonstration</w:t>
+              <w:t xml:space="preserve">Chiffres clés</w:t>
             </w:r>
           </w:p>
         </w:tc>
@@ -953,7 +953,7 @@
                 <w:sz w:val="19"/>
                 <w:szCs w:val="19"/>
               </w:rPr>
-              <w:t xml:space="preserve">2 à 3 minutes, au cas où la connexion lâche pendant l’oral</w:t>
+              <w:t xml:space="preserve">Recul moyen et maximum ; bâtiments, habitants et équipements (écoles, mosquées, postes de santé) menacés d’ici 2030, par quartier ; projection 2035 avec sa marge d’incertitude</w:t>
             </w:r>
           </w:p>
         </w:tc>
@@ -982,7 +982,7 @@
                 <w:sz w:val="19"/>
                 <w:szCs w:val="19"/>
               </w:rPr>
-              <w:t xml:space="preserve">Malick</w:t>
+              <w:t xml:space="preserve">Ndèye Fatou</w:t>
             </w:r>
           </w:p>
         </w:tc>
@@ -1017,6 +1017,474 @@
                 <w:sz w:val="19"/>
                 <w:szCs w:val="19"/>
               </w:rPr>
+              <w:t xml:space="preserve">Effet des ouvrages de protection</w:t>
+            </w:r>
+          </w:p>
+        </w:tc>
+        <w:tc>
+          <w:tcPr>
+            <w:tcW w:type="dxa" w:w="5508"/>
+            <w:tcBorders>
+              <w:top w:val="single" w:color="CFDCD9" w:sz="4"/>
+              <w:left w:val="single" w:color="CFDCD9" w:sz="4"/>
+              <w:bottom w:val="single" w:color="CFDCD9" w:sz="4"/>
+              <w:right w:val="single" w:color="CFDCD9" w:sz="4"/>
+            </w:tcBorders>
+            <w:shd w:fill="F5F9F8" w:color="auto" w:val="clear"/>
+            <w:tcMar>
+              <w:top w:type="dxa" w:w="50"/>
+              <w:left w:type="dxa" w:w="90"/>
+              <w:bottom w:type="dxa" w:w="50"/>
+              <w:right w:type="dxa" w:w="90"/>
+            </w:tcMar>
+          </w:tcPr>
+          <w:p>
+            <w:pPr>
+              <w:jc w:val="left"/>
+            </w:pPr>
+            <w:r>
+              <w:rPr>
+                <w:sz w:val="19"/>
+                <w:szCs w:val="19"/>
+              </w:rPr>
+              <w:t xml:space="preserve">Recul avant et après la digue de Guet Ndar (2021–2022) : la protection fonctionne-t-elle ?</w:t>
+            </w:r>
+          </w:p>
+        </w:tc>
+        <w:tc>
+          <w:tcPr>
+            <w:tcW w:type="dxa" w:w="2012"/>
+            <w:tcBorders>
+              <w:top w:val="single" w:color="CFDCD9" w:sz="4"/>
+              <w:left w:val="single" w:color="CFDCD9" w:sz="4"/>
+              <w:bottom w:val="single" w:color="CFDCD9" w:sz="4"/>
+              <w:right w:val="single" w:color="CFDCD9" w:sz="4"/>
+            </w:tcBorders>
+            <w:shd w:fill="F5F9F8" w:color="auto" w:val="clear"/>
+            <w:tcMar>
+              <w:top w:type="dxa" w:w="50"/>
+              <w:left w:type="dxa" w:w="90"/>
+              <w:bottom w:type="dxa" w:w="50"/>
+              <w:right w:type="dxa" w:w="90"/>
+            </w:tcMar>
+          </w:tcPr>
+          <w:p>
+            <w:pPr>
+              <w:jc w:val="left"/>
+            </w:pPr>
+            <w:r>
+              <w:rPr>
+                <w:sz w:val="19"/>
+                <w:szCs w:val="19"/>
+              </w:rPr>
+              <w:t xml:space="preserve">Ndèye Fatou</w:t>
+            </w:r>
+          </w:p>
+        </w:tc>
+      </w:tr>
+      <w:tr>
+        <w:trPr>
+          <w:cantSplit/>
+        </w:trPr>
+        <w:tc>
+          <w:tcPr>
+            <w:tcW w:type="dxa" w:w="2572"/>
+            <w:tcBorders>
+              <w:top w:val="single" w:color="CFDCD9" w:sz="4"/>
+              <w:left w:val="single" w:color="CFDCD9" w:sz="4"/>
+              <w:bottom w:val="single" w:color="CFDCD9" w:sz="4"/>
+              <w:right w:val="single" w:color="CFDCD9" w:sz="4"/>
+            </w:tcBorders>
+            <w:tcMar>
+              <w:top w:type="dxa" w:w="50"/>
+              <w:left w:type="dxa" w:w="90"/>
+              <w:bottom w:type="dxa" w:w="50"/>
+              <w:right w:type="dxa" w:w="90"/>
+            </w:tcMar>
+          </w:tcPr>
+          <w:p>
+            <w:pPr>
+              <w:jc w:val="left"/>
+            </w:pPr>
+            <w:r>
+              <w:rPr>
+                <w:sz w:val="19"/>
+                <w:szCs w:val="19"/>
+              </w:rPr>
+              <w:t xml:space="preserve">Tableau de bord web</w:t>
+            </w:r>
+          </w:p>
+        </w:tc>
+        <w:tc>
+          <w:tcPr>
+            <w:tcW w:type="dxa" w:w="5508"/>
+            <w:tcBorders>
+              <w:top w:val="single" w:color="CFDCD9" w:sz="4"/>
+              <w:left w:val="single" w:color="CFDCD9" w:sz="4"/>
+              <w:bottom w:val="single" w:color="CFDCD9" w:sz="4"/>
+              <w:right w:val="single" w:color="CFDCD9" w:sz="4"/>
+            </w:tcBorders>
+            <w:tcMar>
+              <w:top w:type="dxa" w:w="50"/>
+              <w:left w:type="dxa" w:w="90"/>
+              <w:bottom w:type="dxa" w:w="50"/>
+              <w:right w:type="dxa" w:w="90"/>
+            </w:tcMar>
+          </w:tcPr>
+          <w:p>
+            <w:pPr>
+              <w:jc w:val="left"/>
+            </w:pPr>
+            <w:r>
+              <w:rPr>
+                <w:sz w:val="19"/>
+                <w:szCs w:val="19"/>
+              </w:rPr>
+              <w:t xml:space="preserve">Carte interactive, lisible sur ordinateur et sur téléphone : on clique sur un tronçon pour voir son historique, sa vitesse de recul, son niveau de risque et ce qui est exposé</w:t>
+            </w:r>
+          </w:p>
+        </w:tc>
+        <w:tc>
+          <w:tcPr>
+            <w:tcW w:type="dxa" w:w="2012"/>
+            <w:tcBorders>
+              <w:top w:val="single" w:color="CFDCD9" w:sz="4"/>
+              <w:left w:val="single" w:color="CFDCD9" w:sz="4"/>
+              <w:bottom w:val="single" w:color="CFDCD9" w:sz="4"/>
+              <w:right w:val="single" w:color="CFDCD9" w:sz="4"/>
+            </w:tcBorders>
+            <w:tcMar>
+              <w:top w:type="dxa" w:w="50"/>
+              <w:left w:type="dxa" w:w="90"/>
+              <w:bottom w:type="dxa" w:w="50"/>
+              <w:right w:type="dxa" w:w="90"/>
+            </w:tcMar>
+          </w:tcPr>
+          <w:p>
+            <w:pPr>
+              <w:jc w:val="left"/>
+            </w:pPr>
+            <w:r>
+              <w:rPr>
+                <w:sz w:val="19"/>
+                <w:szCs w:val="19"/>
+              </w:rPr>
+              <w:t xml:space="preserve">Malick</w:t>
+            </w:r>
+          </w:p>
+        </w:tc>
+      </w:tr>
+      <w:tr>
+        <w:trPr>
+          <w:cantSplit/>
+        </w:trPr>
+        <w:tc>
+          <w:tcPr>
+            <w:tcW w:type="dxa" w:w="2572"/>
+            <w:tcBorders>
+              <w:top w:val="single" w:color="CFDCD9" w:sz="4"/>
+              <w:left w:val="single" w:color="CFDCD9" w:sz="4"/>
+              <w:bottom w:val="single" w:color="CFDCD9" w:sz="4"/>
+              <w:right w:val="single" w:color="CFDCD9" w:sz="4"/>
+            </w:tcBorders>
+            <w:shd w:fill="F5F9F8" w:color="auto" w:val="clear"/>
+            <w:tcMar>
+              <w:top w:type="dxa" w:w="50"/>
+              <w:left w:type="dxa" w:w="90"/>
+              <w:bottom w:type="dxa" w:w="50"/>
+              <w:right w:type="dxa" w:w="90"/>
+            </w:tcMar>
+          </w:tcPr>
+          <w:p>
+            <w:pPr>
+              <w:jc w:val="left"/>
+            </w:pPr>
+            <w:r>
+              <w:rPr>
+                <w:sz w:val="19"/>
+                <w:szCs w:val="19"/>
+              </w:rPr>
+              <w:t xml:space="preserve">Version pour les habitants</w:t>
+            </w:r>
+          </w:p>
+        </w:tc>
+        <w:tc>
+          <w:tcPr>
+            <w:tcW w:type="dxa" w:w="5508"/>
+            <w:tcBorders>
+              <w:top w:val="single" w:color="CFDCD9" w:sz="4"/>
+              <w:left w:val="single" w:color="CFDCD9" w:sz="4"/>
+              <w:bottom w:val="single" w:color="CFDCD9" w:sz="4"/>
+              <w:right w:val="single" w:color="CFDCD9" w:sz="4"/>
+            </w:tcBorders>
+            <w:shd w:fill="F5F9F8" w:color="auto" w:val="clear"/>
+            <w:tcMar>
+              <w:top w:type="dxa" w:w="50"/>
+              <w:left w:type="dxa" w:w="90"/>
+              <w:bottom w:type="dxa" w:w="50"/>
+              <w:right w:type="dxa" w:w="90"/>
+            </w:tcMar>
+          </w:tcPr>
+          <w:p>
+            <w:pPr>
+              <w:jc w:val="left"/>
+            </w:pPr>
+            <w:r>
+              <w:rPr>
+                <w:sz w:val="19"/>
+                <w:szCs w:val="19"/>
+              </w:rPr>
+              <w:t xml:space="preserve">Carte simplifiée en français et en wolof (bouton FR | WO), et un message audio de 30 secondes en wolof à partager sur WhatsApp</w:t>
+            </w:r>
+          </w:p>
+        </w:tc>
+        <w:tc>
+          <w:tcPr>
+            <w:tcW w:type="dxa" w:w="2012"/>
+            <w:tcBorders>
+              <w:top w:val="single" w:color="CFDCD9" w:sz="4"/>
+              <w:left w:val="single" w:color="CFDCD9" w:sz="4"/>
+              <w:bottom w:val="single" w:color="CFDCD9" w:sz="4"/>
+              <w:right w:val="single" w:color="CFDCD9" w:sz="4"/>
+            </w:tcBorders>
+            <w:shd w:fill="F5F9F8" w:color="auto" w:val="clear"/>
+            <w:tcMar>
+              <w:top w:type="dxa" w:w="50"/>
+              <w:left w:type="dxa" w:w="90"/>
+              <w:bottom w:type="dxa" w:w="50"/>
+              <w:right w:type="dxa" w:w="90"/>
+            </w:tcMar>
+          </w:tcPr>
+          <w:p>
+            <w:pPr>
+              <w:jc w:val="left"/>
+            </w:pPr>
+            <w:r>
+              <w:rPr>
+                <w:sz w:val="19"/>
+                <w:szCs w:val="19"/>
+              </w:rPr>
+              <w:t xml:space="preserve">Malick (carte), Ndèye Fatou (audio), les trois (traduction)</w:t>
+            </w:r>
+          </w:p>
+        </w:tc>
+      </w:tr>
+      <w:tr>
+        <w:trPr>
+          <w:cantSplit/>
+        </w:trPr>
+        <w:tc>
+          <w:tcPr>
+            <w:tcW w:type="dxa" w:w="2572"/>
+            <w:tcBorders>
+              <w:top w:val="single" w:color="CFDCD9" w:sz="4"/>
+              <w:left w:val="single" w:color="CFDCD9" w:sz="4"/>
+              <w:bottom w:val="single" w:color="CFDCD9" w:sz="4"/>
+              <w:right w:val="single" w:color="CFDCD9" w:sz="4"/>
+            </w:tcBorders>
+            <w:tcMar>
+              <w:top w:type="dxa" w:w="50"/>
+              <w:left w:type="dxa" w:w="90"/>
+              <w:bottom w:type="dxa" w:w="50"/>
+              <w:right w:type="dxa" w:w="90"/>
+            </w:tcMar>
+          </w:tcPr>
+          <w:p>
+            <w:pPr>
+              <w:jc w:val="left"/>
+            </w:pPr>
+            <w:r>
+              <w:rPr>
+                <w:sz w:val="19"/>
+                <w:szCs w:val="19"/>
+              </w:rPr>
+              <w:t xml:space="preserve">API de diffusion</w:t>
+            </w:r>
+          </w:p>
+        </w:tc>
+        <w:tc>
+          <w:tcPr>
+            <w:tcW w:type="dxa" w:w="5508"/>
+            <w:tcBorders>
+              <w:top w:val="single" w:color="CFDCD9" w:sz="4"/>
+              <w:left w:val="single" w:color="CFDCD9" w:sz="4"/>
+              <w:bottom w:val="single" w:color="CFDCD9" w:sz="4"/>
+              <w:right w:val="single" w:color="CFDCD9" w:sz="4"/>
+            </w:tcBorders>
+            <w:tcMar>
+              <w:top w:type="dxa" w:w="50"/>
+              <w:left w:type="dxa" w:w="90"/>
+              <w:bottom w:type="dxa" w:w="50"/>
+              <w:right w:type="dxa" w:w="90"/>
+            </w:tcMar>
+          </w:tcPr>
+          <w:p>
+            <w:pPr>
+              <w:jc w:val="left"/>
+            </w:pPr>
+            <w:r>
+              <w:rPr>
+                <w:sz w:val="19"/>
+                <w:szCs w:val="19"/>
+              </w:rPr>
+              <w:t xml:space="preserve">Petite API (FastAPI) qui renvoie les résultats en GeoJSON, pour que la mairie ou d’autres outils puissent les réutiliser</w:t>
+            </w:r>
+          </w:p>
+        </w:tc>
+        <w:tc>
+          <w:tcPr>
+            <w:tcW w:type="dxa" w:w="2012"/>
+            <w:tcBorders>
+              <w:top w:val="single" w:color="CFDCD9" w:sz="4"/>
+              <w:left w:val="single" w:color="CFDCD9" w:sz="4"/>
+              <w:bottom w:val="single" w:color="CFDCD9" w:sz="4"/>
+              <w:right w:val="single" w:color="CFDCD9" w:sz="4"/>
+            </w:tcBorders>
+            <w:tcMar>
+              <w:top w:type="dxa" w:w="50"/>
+              <w:left w:type="dxa" w:w="90"/>
+              <w:bottom w:type="dxa" w:w="50"/>
+              <w:right w:type="dxa" w:w="90"/>
+            </w:tcMar>
+          </w:tcPr>
+          <w:p>
+            <w:pPr>
+              <w:jc w:val="left"/>
+            </w:pPr>
+            <w:r>
+              <w:rPr>
+                <w:sz w:val="19"/>
+                <w:szCs w:val="19"/>
+              </w:rPr>
+              <w:t xml:space="preserve">Malick</w:t>
+            </w:r>
+          </w:p>
+        </w:tc>
+      </w:tr>
+      <w:tr>
+        <w:trPr>
+          <w:cantSplit/>
+        </w:trPr>
+        <w:tc>
+          <w:tcPr>
+            <w:tcW w:type="dxa" w:w="2572"/>
+            <w:tcBorders>
+              <w:top w:val="single" w:color="CFDCD9" w:sz="4"/>
+              <w:left w:val="single" w:color="CFDCD9" w:sz="4"/>
+              <w:bottom w:val="single" w:color="CFDCD9" w:sz="4"/>
+              <w:right w:val="single" w:color="CFDCD9" w:sz="4"/>
+            </w:tcBorders>
+            <w:shd w:fill="F5F9F8" w:color="auto" w:val="clear"/>
+            <w:tcMar>
+              <w:top w:type="dxa" w:w="50"/>
+              <w:left w:type="dxa" w:w="90"/>
+              <w:bottom w:type="dxa" w:w="50"/>
+              <w:right w:type="dxa" w:w="90"/>
+            </w:tcMar>
+          </w:tcPr>
+          <w:p>
+            <w:pPr>
+              <w:jc w:val="left"/>
+            </w:pPr>
+            <w:r>
+              <w:rPr>
+                <w:sz w:val="19"/>
+                <w:szCs w:val="19"/>
+              </w:rPr>
+              <w:t xml:space="preserve">Vidéo de démonstration</w:t>
+            </w:r>
+          </w:p>
+        </w:tc>
+        <w:tc>
+          <w:tcPr>
+            <w:tcW w:type="dxa" w:w="5508"/>
+            <w:tcBorders>
+              <w:top w:val="single" w:color="CFDCD9" w:sz="4"/>
+              <w:left w:val="single" w:color="CFDCD9" w:sz="4"/>
+              <w:bottom w:val="single" w:color="CFDCD9" w:sz="4"/>
+              <w:right w:val="single" w:color="CFDCD9" w:sz="4"/>
+            </w:tcBorders>
+            <w:shd w:fill="F5F9F8" w:color="auto" w:val="clear"/>
+            <w:tcMar>
+              <w:top w:type="dxa" w:w="50"/>
+              <w:left w:type="dxa" w:w="90"/>
+              <w:bottom w:type="dxa" w:w="50"/>
+              <w:right w:type="dxa" w:w="90"/>
+            </w:tcMar>
+          </w:tcPr>
+          <w:p>
+            <w:pPr>
+              <w:jc w:val="left"/>
+            </w:pPr>
+            <w:r>
+              <w:rPr>
+                <w:sz w:val="19"/>
+                <w:szCs w:val="19"/>
+              </w:rPr>
+              <w:t xml:space="preserve">2 à 3 minutes, au cas où la connexion lâche pendant l’oral</w:t>
+            </w:r>
+          </w:p>
+        </w:tc>
+        <w:tc>
+          <w:tcPr>
+            <w:tcW w:type="dxa" w:w="2012"/>
+            <w:tcBorders>
+              <w:top w:val="single" w:color="CFDCD9" w:sz="4"/>
+              <w:left w:val="single" w:color="CFDCD9" w:sz="4"/>
+              <w:bottom w:val="single" w:color="CFDCD9" w:sz="4"/>
+              <w:right w:val="single" w:color="CFDCD9" w:sz="4"/>
+            </w:tcBorders>
+            <w:shd w:fill="F5F9F8" w:color="auto" w:val="clear"/>
+            <w:tcMar>
+              <w:top w:type="dxa" w:w="50"/>
+              <w:left w:type="dxa" w:w="90"/>
+              <w:bottom w:type="dxa" w:w="50"/>
+              <w:right w:type="dxa" w:w="90"/>
+            </w:tcMar>
+          </w:tcPr>
+          <w:p>
+            <w:pPr>
+              <w:jc w:val="left"/>
+            </w:pPr>
+            <w:r>
+              <w:rPr>
+                <w:sz w:val="19"/>
+                <w:szCs w:val="19"/>
+              </w:rPr>
+              <w:t xml:space="preserve">Malick</w:t>
+            </w:r>
+          </w:p>
+        </w:tc>
+      </w:tr>
+      <w:tr>
+        <w:trPr>
+          <w:cantSplit/>
+        </w:trPr>
+        <w:tc>
+          <w:tcPr>
+            <w:tcW w:type="dxa" w:w="2572"/>
+            <w:tcBorders>
+              <w:top w:val="single" w:color="CFDCD9" w:sz="4"/>
+              <w:left w:val="single" w:color="CFDCD9" w:sz="4"/>
+              <w:bottom w:val="single" w:color="CFDCD9" w:sz="4"/>
+              <w:right w:val="single" w:color="CFDCD9" w:sz="4"/>
+            </w:tcBorders>
+            <w:tcMar>
+              <w:top w:type="dxa" w:w="50"/>
+              <w:left w:type="dxa" w:w="90"/>
+              <w:bottom w:type="dxa" w:w="50"/>
+              <w:right w:type="dxa" w:w="90"/>
+            </w:tcMar>
+          </w:tcPr>
+          <w:p>
+            <w:pPr>
+              <w:jc w:val="left"/>
+            </w:pPr>
+            <w:r>
+              <w:rPr>
+                <w:sz w:val="19"/>
+                <w:szCs w:val="19"/>
+              </w:rPr>
               <w:t xml:space="preserve">Présentation</w:t>
             </w:r>
           </w:p>
@@ -1030,7 +1498,6 @@
               <w:bottom w:val="single" w:color="CFDCD9" w:sz="4"/>
               <w:right w:val="single" w:color="CFDCD9" w:sz="4"/>
             </w:tcBorders>
-            <w:shd w:fill="F5F9F8" w:color="auto" w:val="clear"/>
             <w:tcMar>
               <w:top w:type="dxa" w:w="50"/>
               <w:left w:type="dxa" w:w="90"/>
@@ -1060,7 +1527,6 @@
               <w:bottom w:val="single" w:color="CFDCD9" w:sz="4"/>
               <w:right w:val="single" w:color="CFDCD9" w:sz="4"/>
             </w:tcBorders>
-            <w:shd w:fill="F5F9F8" w:color="auto" w:val="clear"/>
             <w:tcMar>
               <w:top w:type="dxa" w:w="50"/>
               <w:left w:type="dxa" w:w="90"/>
@@ -1093,7 +1559,2113 @@
         <w:pStyle w:val="Heading2"/>
       </w:pPr>
       <w:r>
-        <w:t xml:space="preserve">2. Rôles</w:t>
+        <w:t xml:space="preserve">2. Ce que nous avons promis dans le dossier envoyé</w:t>
+      </w:r>
+    </w:p>
+    <w:p>
+      <w:pPr>
+        <w:jc w:val="both"/>
+      </w:pPr>
+      <w:r>
+        <w:t xml:space="preserve">Le jury a notre dossier de candidature sous les yeux et va vérifier que nous avons fait ce que nous avons écrit. </w:t>
+      </w:r>
+      <w:r>
+        <w:rPr>
+          <w:b/>
+          <w:bCs/>
+        </w:rPr>
+        <w:t xml:space="preserve">Chaque promesse du dossier a donc un responsable.</w:t>
+      </w:r>
+      <w:r>
+        <w:t xml:space="preserve"> Si l’une d’elles ne peut pas être terminée à temps, nous le disons honnêtement à l’oral, avec la raison et l’étape suivante, sans jamais la passer sous silence.</w:t>
+      </w:r>
+    </w:p>
+    <w:tbl>
+      <w:tblPr>
+        <w:tblW w:type="dxa" w:w="10092"/>
+        <w:tblBorders>
+          <w:top w:val="single" w:color="auto" w:sz="4"/>
+          <w:left w:val="single" w:color="auto" w:sz="4"/>
+          <w:bottom w:val="single" w:color="auto" w:sz="4"/>
+          <w:right w:val="single" w:color="auto" w:sz="4"/>
+          <w:insideH w:val="single" w:color="auto" w:sz="4"/>
+          <w:insideV w:val="single" w:color="auto" w:sz="4"/>
+        </w:tblBorders>
+      </w:tblPr>
+      <w:tblGrid>
+        <w:gridCol w:w="3019"/>
+        <w:gridCol w:w="5061"/>
+        <w:gridCol w:w="2012"/>
+      </w:tblGrid>
+      <w:tr>
+        <w:trPr>
+          <w:tblHeader/>
+        </w:trPr>
+        <w:tc>
+          <w:tcPr>
+            <w:tcW w:type="dxa" w:w="3019"/>
+            <w:tcBorders>
+              <w:top w:val="single" w:color="CFDCD9" w:sz="4"/>
+              <w:left w:val="single" w:color="CFDCD9" w:sz="4"/>
+              <w:bottom w:val="single" w:color="CFDCD9" w:sz="4"/>
+              <w:right w:val="single" w:color="CFDCD9" w:sz="4"/>
+            </w:tcBorders>
+            <w:shd w:fill="0B7A6F" w:color="auto" w:val="clear"/>
+            <w:tcMar>
+              <w:top w:type="dxa" w:w="50"/>
+              <w:left w:type="dxa" w:w="90"/>
+              <w:bottom w:type="dxa" w:w="50"/>
+              <w:right w:type="dxa" w:w="90"/>
+            </w:tcMar>
+          </w:tcPr>
+          <w:p>
+            <w:r>
+              <w:rPr>
+                <w:b/>
+                <w:bCs/>
+                <w:color w:val="FFFFFF"/>
+                <w:sz w:val="19"/>
+                <w:szCs w:val="19"/>
+              </w:rPr>
+              <w:t xml:space="preserve">Promesse du dossier</w:t>
+            </w:r>
+          </w:p>
+        </w:tc>
+        <w:tc>
+          <w:tcPr>
+            <w:tcW w:type="dxa" w:w="5061"/>
+            <w:tcBorders>
+              <w:top w:val="single" w:color="CFDCD9" w:sz="4"/>
+              <w:left w:val="single" w:color="CFDCD9" w:sz="4"/>
+              <w:bottom w:val="single" w:color="CFDCD9" w:sz="4"/>
+              <w:right w:val="single" w:color="CFDCD9" w:sz="4"/>
+            </w:tcBorders>
+            <w:shd w:fill="0B7A6F" w:color="auto" w:val="clear"/>
+            <w:tcMar>
+              <w:top w:type="dxa" w:w="50"/>
+              <w:left w:type="dxa" w:w="90"/>
+              <w:bottom w:type="dxa" w:w="50"/>
+              <w:right w:type="dxa" w:w="90"/>
+            </w:tcMar>
+          </w:tcPr>
+          <w:p>
+            <w:r>
+              <w:rPr>
+                <w:b/>
+                <w:bCs/>
+                <w:color w:val="FFFFFF"/>
+                <w:sz w:val="19"/>
+                <w:szCs w:val="19"/>
+              </w:rPr>
+              <w:t xml:space="preserve">Ce que nous faisons</w:t>
+            </w:r>
+          </w:p>
+        </w:tc>
+        <w:tc>
+          <w:tcPr>
+            <w:tcW w:type="dxa" w:w="2012"/>
+            <w:tcBorders>
+              <w:top w:val="single" w:color="CFDCD9" w:sz="4"/>
+              <w:left w:val="single" w:color="CFDCD9" w:sz="4"/>
+              <w:bottom w:val="single" w:color="CFDCD9" w:sz="4"/>
+              <w:right w:val="single" w:color="CFDCD9" w:sz="4"/>
+            </w:tcBorders>
+            <w:shd w:fill="0B7A6F" w:color="auto" w:val="clear"/>
+            <w:tcMar>
+              <w:top w:type="dxa" w:w="50"/>
+              <w:left w:type="dxa" w:w="90"/>
+              <w:bottom w:type="dxa" w:w="50"/>
+              <w:right w:type="dxa" w:w="90"/>
+            </w:tcMar>
+          </w:tcPr>
+          <w:p>
+            <w:r>
+              <w:rPr>
+                <w:b/>
+                <w:bCs/>
+                <w:color w:val="FFFFFF"/>
+                <w:sz w:val="19"/>
+                <w:szCs w:val="19"/>
+              </w:rPr>
+              <w:t xml:space="preserve">Qui</w:t>
+            </w:r>
+          </w:p>
+        </w:tc>
+      </w:tr>
+      <w:tr>
+        <w:trPr>
+          <w:cantSplit/>
+        </w:trPr>
+        <w:tc>
+          <w:tcPr>
+            <w:tcW w:type="dxa" w:w="3019"/>
+            <w:tcBorders>
+              <w:top w:val="single" w:color="CFDCD9" w:sz="4"/>
+              <w:left w:val="single" w:color="CFDCD9" w:sz="4"/>
+              <w:bottom w:val="single" w:color="CFDCD9" w:sz="4"/>
+              <w:right w:val="single" w:color="CFDCD9" w:sz="4"/>
+            </w:tcBorders>
+            <w:tcMar>
+              <w:top w:type="dxa" w:w="50"/>
+              <w:left w:type="dxa" w:w="90"/>
+              <w:bottom w:type="dxa" w:w="50"/>
+              <w:right w:type="dxa" w:w="90"/>
+            </w:tcMar>
+          </w:tcPr>
+          <w:p>
+            <w:pPr>
+              <w:jc w:val="left"/>
+            </w:pPr>
+            <w:r>
+              <w:rPr>
+                <w:sz w:val="19"/>
+                <w:szCs w:val="19"/>
+              </w:rPr>
+              <w:t xml:space="preserve">Sentinel-2, 2015–2025 (§2)</w:t>
+            </w:r>
+          </w:p>
+        </w:tc>
+        <w:tc>
+          <w:tcPr>
+            <w:tcW w:type="dxa" w:w="5061"/>
+            <w:tcBorders>
+              <w:top w:val="single" w:color="CFDCD9" w:sz="4"/>
+              <w:left w:val="single" w:color="CFDCD9" w:sz="4"/>
+              <w:bottom w:val="single" w:color="CFDCD9" w:sz="4"/>
+              <w:right w:val="single" w:color="CFDCD9" w:sz="4"/>
+            </w:tcBorders>
+            <w:tcMar>
+              <w:top w:type="dxa" w:w="50"/>
+              <w:left w:type="dxa" w:w="90"/>
+              <w:bottom w:type="dxa" w:w="50"/>
+              <w:right w:type="dxa" w:w="90"/>
+            </w:tcMar>
+          </w:tcPr>
+          <w:p>
+            <w:pPr>
+              <w:jc w:val="left"/>
+            </w:pPr>
+            <w:r>
+              <w:rPr>
+                <w:sz w:val="19"/>
+                <w:szCs w:val="19"/>
+              </w:rPr>
+              <w:t xml:space="preserve">Traits de côte, au moins une date par an</w:t>
+            </w:r>
+          </w:p>
+        </w:tc>
+        <w:tc>
+          <w:tcPr>
+            <w:tcW w:type="dxa" w:w="2012"/>
+            <w:tcBorders>
+              <w:top w:val="single" w:color="CFDCD9" w:sz="4"/>
+              <w:left w:val="single" w:color="CFDCD9" w:sz="4"/>
+              <w:bottom w:val="single" w:color="CFDCD9" w:sz="4"/>
+              <w:right w:val="single" w:color="CFDCD9" w:sz="4"/>
+            </w:tcBorders>
+            <w:tcMar>
+              <w:top w:type="dxa" w:w="50"/>
+              <w:left w:type="dxa" w:w="90"/>
+              <w:bottom w:type="dxa" w:w="50"/>
+              <w:right w:type="dxa" w:w="90"/>
+            </w:tcMar>
+          </w:tcPr>
+          <w:p>
+            <w:pPr>
+              <w:jc w:val="left"/>
+            </w:pPr>
+            <w:r>
+              <w:rPr>
+                <w:sz w:val="19"/>
+                <w:szCs w:val="19"/>
+              </w:rPr>
+              <w:t xml:space="preserve">Abdoulaye</w:t>
+            </w:r>
+          </w:p>
+        </w:tc>
+      </w:tr>
+      <w:tr>
+        <w:trPr>
+          <w:cantSplit/>
+        </w:trPr>
+        <w:tc>
+          <w:tcPr>
+            <w:tcW w:type="dxa" w:w="3019"/>
+            <w:tcBorders>
+              <w:top w:val="single" w:color="CFDCD9" w:sz="4"/>
+              <w:left w:val="single" w:color="CFDCD9" w:sz="4"/>
+              <w:bottom w:val="single" w:color="CFDCD9" w:sz="4"/>
+              <w:right w:val="single" w:color="CFDCD9" w:sz="4"/>
+            </w:tcBorders>
+            <w:shd w:fill="F5F9F8" w:color="auto" w:val="clear"/>
+            <w:tcMar>
+              <w:top w:type="dxa" w:w="50"/>
+              <w:left w:type="dxa" w:w="90"/>
+              <w:bottom w:type="dxa" w:w="50"/>
+              <w:right w:type="dxa" w:w="90"/>
+            </w:tcMar>
+          </w:tcPr>
+          <w:p>
+            <w:pPr>
+              <w:jc w:val="left"/>
+            </w:pPr>
+            <w:r>
+              <w:rPr>
+                <w:sz w:val="19"/>
+                <w:szCs w:val="19"/>
+              </w:rPr>
+              <w:t xml:space="preserve">Landsat 7, 8 et 9 depuis 2000 (§2)</w:t>
+            </w:r>
+          </w:p>
+        </w:tc>
+        <w:tc>
+          <w:tcPr>
+            <w:tcW w:type="dxa" w:w="5061"/>
+            <w:tcBorders>
+              <w:top w:val="single" w:color="CFDCD9" w:sz="4"/>
+              <w:left w:val="single" w:color="CFDCD9" w:sz="4"/>
+              <w:bottom w:val="single" w:color="CFDCD9" w:sz="4"/>
+              <w:right w:val="single" w:color="CFDCD9" w:sz="4"/>
+            </w:tcBorders>
+            <w:shd w:fill="F5F9F8" w:color="auto" w:val="clear"/>
+            <w:tcMar>
+              <w:top w:type="dxa" w:w="50"/>
+              <w:left w:type="dxa" w:w="90"/>
+              <w:bottom w:type="dxa" w:w="50"/>
+              <w:right w:type="dxa" w:w="90"/>
+            </w:tcMar>
+          </w:tcPr>
+          <w:p>
+            <w:pPr>
+              <w:jc w:val="left"/>
+            </w:pPr>
+            <w:r>
+              <w:rPr>
+                <w:sz w:val="19"/>
+                <w:szCs w:val="19"/>
+              </w:rPr>
+              <w:t xml:space="preserve">Série longue de la côte et animation de la brèche avant et après 2003</w:t>
+            </w:r>
+          </w:p>
+        </w:tc>
+        <w:tc>
+          <w:tcPr>
+            <w:tcW w:type="dxa" w:w="2012"/>
+            <w:tcBorders>
+              <w:top w:val="single" w:color="CFDCD9" w:sz="4"/>
+              <w:left w:val="single" w:color="CFDCD9" w:sz="4"/>
+              <w:bottom w:val="single" w:color="CFDCD9" w:sz="4"/>
+              <w:right w:val="single" w:color="CFDCD9" w:sz="4"/>
+            </w:tcBorders>
+            <w:shd w:fill="F5F9F8" w:color="auto" w:val="clear"/>
+            <w:tcMar>
+              <w:top w:type="dxa" w:w="50"/>
+              <w:left w:type="dxa" w:w="90"/>
+              <w:bottom w:type="dxa" w:w="50"/>
+              <w:right w:type="dxa" w:w="90"/>
+            </w:tcMar>
+          </w:tcPr>
+          <w:p>
+            <w:pPr>
+              <w:jc w:val="left"/>
+            </w:pPr>
+            <w:r>
+              <w:rPr>
+                <w:sz w:val="19"/>
+                <w:szCs w:val="19"/>
+              </w:rPr>
+              <w:t xml:space="preserve">Abdoulaye</w:t>
+            </w:r>
+          </w:p>
+        </w:tc>
+      </w:tr>
+      <w:tr>
+        <w:trPr>
+          <w:cantSplit/>
+        </w:trPr>
+        <w:tc>
+          <w:tcPr>
+            <w:tcW w:type="dxa" w:w="3019"/>
+            <w:tcBorders>
+              <w:top w:val="single" w:color="CFDCD9" w:sz="4"/>
+              <w:left w:val="single" w:color="CFDCD9" w:sz="4"/>
+              <w:bottom w:val="single" w:color="CFDCD9" w:sz="4"/>
+              <w:right w:val="single" w:color="CFDCD9" w:sz="4"/>
+            </w:tcBorders>
+            <w:tcMar>
+              <w:top w:type="dxa" w:w="50"/>
+              <w:left w:type="dxa" w:w="90"/>
+              <w:bottom w:type="dxa" w:w="50"/>
+              <w:right w:type="dxa" w:w="90"/>
+            </w:tcMar>
+          </w:tcPr>
+          <w:p>
+            <w:pPr>
+              <w:jc w:val="left"/>
+            </w:pPr>
+            <w:r>
+              <w:rPr>
+                <w:sz w:val="19"/>
+                <w:szCs w:val="19"/>
+              </w:rPr>
+              <w:t xml:space="preserve">Sentinel-1 radar (§2)</w:t>
+            </w:r>
+          </w:p>
+        </w:tc>
+        <w:tc>
+          <w:tcPr>
+            <w:tcW w:type="dxa" w:w="5061"/>
+            <w:tcBorders>
+              <w:top w:val="single" w:color="CFDCD9" w:sz="4"/>
+              <w:left w:val="single" w:color="CFDCD9" w:sz="4"/>
+              <w:bottom w:val="single" w:color="CFDCD9" w:sz="4"/>
+              <w:right w:val="single" w:color="CFDCD9" w:sz="4"/>
+            </w:tcBorders>
+            <w:tcMar>
+              <w:top w:type="dxa" w:w="50"/>
+              <w:left w:type="dxa" w:w="90"/>
+              <w:bottom w:type="dxa" w:w="50"/>
+              <w:right w:type="dxa" w:w="90"/>
+            </w:tcMar>
+          </w:tcPr>
+          <w:p>
+            <w:pPr>
+              <w:jc w:val="left"/>
+            </w:pPr>
+            <w:r>
+              <w:rPr>
+                <w:sz w:val="19"/>
+                <w:szCs w:val="19"/>
+              </w:rPr>
+              <w:t xml:space="preserve">Trait de côte radar sur 2 ou 3 dates, comparé à Sentinel-2 : la méthode marche aussi par temps nuageux et après une tempête</w:t>
+            </w:r>
+          </w:p>
+        </w:tc>
+        <w:tc>
+          <w:tcPr>
+            <w:tcW w:type="dxa" w:w="2012"/>
+            <w:tcBorders>
+              <w:top w:val="single" w:color="CFDCD9" w:sz="4"/>
+              <w:left w:val="single" w:color="CFDCD9" w:sz="4"/>
+              <w:bottom w:val="single" w:color="CFDCD9" w:sz="4"/>
+              <w:right w:val="single" w:color="CFDCD9" w:sz="4"/>
+            </w:tcBorders>
+            <w:tcMar>
+              <w:top w:type="dxa" w:w="50"/>
+              <w:left w:type="dxa" w:w="90"/>
+              <w:bottom w:type="dxa" w:w="50"/>
+              <w:right w:type="dxa" w:w="90"/>
+            </w:tcMar>
+          </w:tcPr>
+          <w:p>
+            <w:pPr>
+              <w:jc w:val="left"/>
+            </w:pPr>
+            <w:r>
+              <w:rPr>
+                <w:sz w:val="19"/>
+                <w:szCs w:val="19"/>
+              </w:rPr>
+              <w:t xml:space="preserve">Ndèye Fatou</w:t>
+            </w:r>
+          </w:p>
+        </w:tc>
+      </w:tr>
+      <w:tr>
+        <w:trPr>
+          <w:cantSplit/>
+        </w:trPr>
+        <w:tc>
+          <w:tcPr>
+            <w:tcW w:type="dxa" w:w="3019"/>
+            <w:tcBorders>
+              <w:top w:val="single" w:color="CFDCD9" w:sz="4"/>
+              <w:left w:val="single" w:color="CFDCD9" w:sz="4"/>
+              <w:bottom w:val="single" w:color="CFDCD9" w:sz="4"/>
+              <w:right w:val="single" w:color="CFDCD9" w:sz="4"/>
+            </w:tcBorders>
+            <w:shd w:fill="F5F9F8" w:color="auto" w:val="clear"/>
+            <w:tcMar>
+              <w:top w:type="dxa" w:w="50"/>
+              <w:left w:type="dxa" w:w="90"/>
+              <w:bottom w:type="dxa" w:w="50"/>
+              <w:right w:type="dxa" w:w="90"/>
+            </w:tcMar>
+          </w:tcPr>
+          <w:p>
+            <w:pPr>
+              <w:jc w:val="left"/>
+            </w:pPr>
+            <w:r>
+              <w:rPr>
+                <w:sz w:val="19"/>
+                <w:szCs w:val="19"/>
+              </w:rPr>
+              <w:t xml:space="preserve">Copernicus DEM, altitude (§2)</w:t>
+            </w:r>
+          </w:p>
+        </w:tc>
+        <w:tc>
+          <w:tcPr>
+            <w:tcW w:type="dxa" w:w="5061"/>
+            <w:tcBorders>
+              <w:top w:val="single" w:color="CFDCD9" w:sz="4"/>
+              <w:left w:val="single" w:color="CFDCD9" w:sz="4"/>
+              <w:bottom w:val="single" w:color="CFDCD9" w:sz="4"/>
+              <w:right w:val="single" w:color="CFDCD9" w:sz="4"/>
+            </w:tcBorders>
+            <w:shd w:fill="F5F9F8" w:color="auto" w:val="clear"/>
+            <w:tcMar>
+              <w:top w:type="dxa" w:w="50"/>
+              <w:left w:type="dxa" w:w="90"/>
+              <w:bottom w:type="dxa" w:w="50"/>
+              <w:right w:type="dxa" w:w="90"/>
+            </w:tcMar>
+          </w:tcPr>
+          <w:p>
+            <w:pPr>
+              <w:jc w:val="left"/>
+            </w:pPr>
+            <w:r>
+              <w:rPr>
+                <w:sz w:val="19"/>
+                <w:szCs w:val="19"/>
+              </w:rPr>
+              <w:t xml:space="preserve">Zones basses exposées à la submersion, utilisées dans le niveau de risque</w:t>
+            </w:r>
+          </w:p>
+        </w:tc>
+        <w:tc>
+          <w:tcPr>
+            <w:tcW w:type="dxa" w:w="2012"/>
+            <w:tcBorders>
+              <w:top w:val="single" w:color="CFDCD9" w:sz="4"/>
+              <w:left w:val="single" w:color="CFDCD9" w:sz="4"/>
+              <w:bottom w:val="single" w:color="CFDCD9" w:sz="4"/>
+              <w:right w:val="single" w:color="CFDCD9" w:sz="4"/>
+            </w:tcBorders>
+            <w:shd w:fill="F5F9F8" w:color="auto" w:val="clear"/>
+            <w:tcMar>
+              <w:top w:type="dxa" w:w="50"/>
+              <w:left w:type="dxa" w:w="90"/>
+              <w:bottom w:type="dxa" w:w="50"/>
+              <w:right w:type="dxa" w:w="90"/>
+            </w:tcMar>
+          </w:tcPr>
+          <w:p>
+            <w:pPr>
+              <w:jc w:val="left"/>
+            </w:pPr>
+            <w:r>
+              <w:rPr>
+                <w:sz w:val="19"/>
+                <w:szCs w:val="19"/>
+              </w:rPr>
+              <w:t xml:space="preserve">Ndèye Fatou</w:t>
+            </w:r>
+          </w:p>
+        </w:tc>
+      </w:tr>
+      <w:tr>
+        <w:trPr>
+          <w:cantSplit/>
+        </w:trPr>
+        <w:tc>
+          <w:tcPr>
+            <w:tcW w:type="dxa" w:w="3019"/>
+            <w:tcBorders>
+              <w:top w:val="single" w:color="CFDCD9" w:sz="4"/>
+              <w:left w:val="single" w:color="CFDCD9" w:sz="4"/>
+              <w:bottom w:val="single" w:color="CFDCD9" w:sz="4"/>
+              <w:right w:val="single" w:color="CFDCD9" w:sz="4"/>
+            </w:tcBorders>
+            <w:tcMar>
+              <w:top w:type="dxa" w:w="50"/>
+              <w:left w:type="dxa" w:w="90"/>
+              <w:bottom w:type="dxa" w:w="50"/>
+              <w:right w:type="dxa" w:w="90"/>
+            </w:tcMar>
+          </w:tcPr>
+          <w:p>
+            <w:pPr>
+              <w:jc w:val="left"/>
+            </w:pPr>
+            <w:r>
+              <w:rPr>
+                <w:sz w:val="19"/>
+                <w:szCs w:val="19"/>
+              </w:rPr>
+              <w:t xml:space="preserve">OpenStreetMap et Google Open Buildings (§2)</w:t>
+            </w:r>
+          </w:p>
+        </w:tc>
+        <w:tc>
+          <w:tcPr>
+            <w:tcW w:type="dxa" w:w="5061"/>
+            <w:tcBorders>
+              <w:top w:val="single" w:color="CFDCD9" w:sz="4"/>
+              <w:left w:val="single" w:color="CFDCD9" w:sz="4"/>
+              <w:bottom w:val="single" w:color="CFDCD9" w:sz="4"/>
+              <w:right w:val="single" w:color="CFDCD9" w:sz="4"/>
+            </w:tcBorders>
+            <w:tcMar>
+              <w:top w:type="dxa" w:w="50"/>
+              <w:left w:type="dxa" w:w="90"/>
+              <w:bottom w:type="dxa" w:w="50"/>
+              <w:right w:type="dxa" w:w="90"/>
+            </w:tcMar>
+          </w:tcPr>
+          <w:p>
+            <w:pPr>
+              <w:jc w:val="left"/>
+            </w:pPr>
+            <w:r>
+              <w:rPr>
+                <w:sz w:val="19"/>
+                <w:szCs w:val="19"/>
+              </w:rPr>
+              <w:t xml:space="preserve">Bâtiments des deux sources, comparés, pour ne pas oublier de maisons</w:t>
+            </w:r>
+          </w:p>
+        </w:tc>
+        <w:tc>
+          <w:tcPr>
+            <w:tcW w:type="dxa" w:w="2012"/>
+            <w:tcBorders>
+              <w:top w:val="single" w:color="CFDCD9" w:sz="4"/>
+              <w:left w:val="single" w:color="CFDCD9" w:sz="4"/>
+              <w:bottom w:val="single" w:color="CFDCD9" w:sz="4"/>
+              <w:right w:val="single" w:color="CFDCD9" w:sz="4"/>
+            </w:tcBorders>
+            <w:tcMar>
+              <w:top w:type="dxa" w:w="50"/>
+              <w:left w:type="dxa" w:w="90"/>
+              <w:bottom w:type="dxa" w:w="50"/>
+              <w:right w:type="dxa" w:w="90"/>
+            </w:tcMar>
+          </w:tcPr>
+          <w:p>
+            <w:pPr>
+              <w:jc w:val="left"/>
+            </w:pPr>
+            <w:r>
+              <w:rPr>
+                <w:sz w:val="19"/>
+                <w:szCs w:val="19"/>
+              </w:rPr>
+              <w:t xml:space="preserve">Ndèye Fatou</w:t>
+            </w:r>
+          </w:p>
+        </w:tc>
+      </w:tr>
+      <w:tr>
+        <w:trPr>
+          <w:cantSplit/>
+        </w:trPr>
+        <w:tc>
+          <w:tcPr>
+            <w:tcW w:type="dxa" w:w="3019"/>
+            <w:tcBorders>
+              <w:top w:val="single" w:color="CFDCD9" w:sz="4"/>
+              <w:left w:val="single" w:color="CFDCD9" w:sz="4"/>
+              <w:bottom w:val="single" w:color="CFDCD9" w:sz="4"/>
+              <w:right w:val="single" w:color="CFDCD9" w:sz="4"/>
+            </w:tcBorders>
+            <w:shd w:fill="F5F9F8" w:color="auto" w:val="clear"/>
+            <w:tcMar>
+              <w:top w:type="dxa" w:w="50"/>
+              <w:left w:type="dxa" w:w="90"/>
+              <w:bottom w:type="dxa" w:w="50"/>
+              <w:right w:type="dxa" w:w="90"/>
+            </w:tcMar>
+          </w:tcPr>
+          <w:p>
+            <w:pPr>
+              <w:jc w:val="left"/>
+            </w:pPr>
+            <w:r>
+              <w:rPr>
+                <w:sz w:val="19"/>
+                <w:szCs w:val="19"/>
+              </w:rPr>
+              <w:t xml:space="preserve">Population WorldPop et ANSD (§2)</w:t>
+            </w:r>
+          </w:p>
+        </w:tc>
+        <w:tc>
+          <w:tcPr>
+            <w:tcW w:type="dxa" w:w="5061"/>
+            <w:tcBorders>
+              <w:top w:val="single" w:color="CFDCD9" w:sz="4"/>
+              <w:left w:val="single" w:color="CFDCD9" w:sz="4"/>
+              <w:bottom w:val="single" w:color="CFDCD9" w:sz="4"/>
+              <w:right w:val="single" w:color="CFDCD9" w:sz="4"/>
+            </w:tcBorders>
+            <w:shd w:fill="F5F9F8" w:color="auto" w:val="clear"/>
+            <w:tcMar>
+              <w:top w:type="dxa" w:w="50"/>
+              <w:left w:type="dxa" w:w="90"/>
+              <w:bottom w:type="dxa" w:w="50"/>
+              <w:right w:type="dxa" w:w="90"/>
+            </w:tcMar>
+          </w:tcPr>
+          <w:p>
+            <w:pPr>
+              <w:jc w:val="left"/>
+            </w:pPr>
+            <w:r>
+              <w:rPr>
+                <w:sz w:val="19"/>
+                <w:szCs w:val="19"/>
+              </w:rPr>
+              <w:t xml:space="preserve">Nombre d’habitants dans la bande menacée, par quartier</w:t>
+            </w:r>
+          </w:p>
+        </w:tc>
+        <w:tc>
+          <w:tcPr>
+            <w:tcW w:type="dxa" w:w="2012"/>
+            <w:tcBorders>
+              <w:top w:val="single" w:color="CFDCD9" w:sz="4"/>
+              <w:left w:val="single" w:color="CFDCD9" w:sz="4"/>
+              <w:bottom w:val="single" w:color="CFDCD9" w:sz="4"/>
+              <w:right w:val="single" w:color="CFDCD9" w:sz="4"/>
+            </w:tcBorders>
+            <w:shd w:fill="F5F9F8" w:color="auto" w:val="clear"/>
+            <w:tcMar>
+              <w:top w:type="dxa" w:w="50"/>
+              <w:left w:type="dxa" w:w="90"/>
+              <w:bottom w:type="dxa" w:w="50"/>
+              <w:right w:type="dxa" w:w="90"/>
+            </w:tcMar>
+          </w:tcPr>
+          <w:p>
+            <w:pPr>
+              <w:jc w:val="left"/>
+            </w:pPr>
+            <w:r>
+              <w:rPr>
+                <w:sz w:val="19"/>
+                <w:szCs w:val="19"/>
+              </w:rPr>
+              <w:t xml:space="preserve">Ndèye Fatou</w:t>
+            </w:r>
+          </w:p>
+        </w:tc>
+      </w:tr>
+      <w:tr>
+        <w:trPr>
+          <w:cantSplit/>
+        </w:trPr>
+        <w:tc>
+          <w:tcPr>
+            <w:tcW w:type="dxa" w:w="3019"/>
+            <w:tcBorders>
+              <w:top w:val="single" w:color="CFDCD9" w:sz="4"/>
+              <w:left w:val="single" w:color="CFDCD9" w:sz="4"/>
+              <w:bottom w:val="single" w:color="CFDCD9" w:sz="4"/>
+              <w:right w:val="single" w:color="CFDCD9" w:sz="4"/>
+            </w:tcBorders>
+            <w:tcMar>
+              <w:top w:type="dxa" w:w="50"/>
+              <w:left w:type="dxa" w:w="90"/>
+              <w:bottom w:type="dxa" w:w="50"/>
+              <w:right w:type="dxa" w:w="90"/>
+            </w:tcMar>
+          </w:tcPr>
+          <w:p>
+            <w:pPr>
+              <w:jc w:val="left"/>
+            </w:pPr>
+            <w:r>
+              <w:rPr>
+                <w:sz w:val="19"/>
+                <w:szCs w:val="19"/>
+              </w:rPr>
+              <w:t xml:space="preserve">Écoles et équipements (§2)</w:t>
+            </w:r>
+          </w:p>
+        </w:tc>
+        <w:tc>
+          <w:tcPr>
+            <w:tcW w:type="dxa" w:w="5061"/>
+            <w:tcBorders>
+              <w:top w:val="single" w:color="CFDCD9" w:sz="4"/>
+              <w:left w:val="single" w:color="CFDCD9" w:sz="4"/>
+              <w:bottom w:val="single" w:color="CFDCD9" w:sz="4"/>
+              <w:right w:val="single" w:color="CFDCD9" w:sz="4"/>
+            </w:tcBorders>
+            <w:tcMar>
+              <w:top w:type="dxa" w:w="50"/>
+              <w:left w:type="dxa" w:w="90"/>
+              <w:bottom w:type="dxa" w:w="50"/>
+              <w:right w:type="dxa" w:w="90"/>
+            </w:tcMar>
+          </w:tcPr>
+          <w:p>
+            <w:pPr>
+              <w:jc w:val="left"/>
+            </w:pPr>
+            <w:r>
+              <w:rPr>
+                <w:sz w:val="19"/>
+                <w:szCs w:val="19"/>
+              </w:rPr>
+              <w:t xml:space="preserve">Écoles, mosquées, postes de santé menacés</w:t>
+            </w:r>
+          </w:p>
+        </w:tc>
+        <w:tc>
+          <w:tcPr>
+            <w:tcW w:type="dxa" w:w="2012"/>
+            <w:tcBorders>
+              <w:top w:val="single" w:color="CFDCD9" w:sz="4"/>
+              <w:left w:val="single" w:color="CFDCD9" w:sz="4"/>
+              <w:bottom w:val="single" w:color="CFDCD9" w:sz="4"/>
+              <w:right w:val="single" w:color="CFDCD9" w:sz="4"/>
+            </w:tcBorders>
+            <w:tcMar>
+              <w:top w:type="dxa" w:w="50"/>
+              <w:left w:type="dxa" w:w="90"/>
+              <w:bottom w:type="dxa" w:w="50"/>
+              <w:right w:type="dxa" w:w="90"/>
+            </w:tcMar>
+          </w:tcPr>
+          <w:p>
+            <w:pPr>
+              <w:jc w:val="left"/>
+            </w:pPr>
+            <w:r>
+              <w:rPr>
+                <w:sz w:val="19"/>
+                <w:szCs w:val="19"/>
+              </w:rPr>
+              <w:t xml:space="preserve">Ndèye Fatou</w:t>
+            </w:r>
+          </w:p>
+        </w:tc>
+      </w:tr>
+      <w:tr>
+        <w:trPr>
+          <w:cantSplit/>
+        </w:trPr>
+        <w:tc>
+          <w:tcPr>
+            <w:tcW w:type="dxa" w:w="3019"/>
+            <w:tcBorders>
+              <w:top w:val="single" w:color="CFDCD9" w:sz="4"/>
+              <w:left w:val="single" w:color="CFDCD9" w:sz="4"/>
+              <w:bottom w:val="single" w:color="CFDCD9" w:sz="4"/>
+              <w:right w:val="single" w:color="CFDCD9" w:sz="4"/>
+            </w:tcBorders>
+            <w:shd w:fill="F5F9F8" w:color="auto" w:val="clear"/>
+            <w:tcMar>
+              <w:top w:type="dxa" w:w="50"/>
+              <w:left w:type="dxa" w:w="90"/>
+              <w:bottom w:type="dxa" w:w="50"/>
+              <w:right w:type="dxa" w:w="90"/>
+            </w:tcMar>
+          </w:tcPr>
+          <w:p>
+            <w:pPr>
+              <w:jc w:val="left"/>
+            </w:pPr>
+            <w:r>
+              <w:rPr>
+                <w:sz w:val="19"/>
+                <w:szCs w:val="19"/>
+              </w:rPr>
+              <w:t xml:space="preserve">Données de terrain et des collectivités (§2)</w:t>
+            </w:r>
+          </w:p>
+        </w:tc>
+        <w:tc>
+          <w:tcPr>
+            <w:tcW w:type="dxa" w:w="5061"/>
+            <w:tcBorders>
+              <w:top w:val="single" w:color="CFDCD9" w:sz="4"/>
+              <w:left w:val="single" w:color="CFDCD9" w:sz="4"/>
+              <w:bottom w:val="single" w:color="CFDCD9" w:sz="4"/>
+              <w:right w:val="single" w:color="CFDCD9" w:sz="4"/>
+            </w:tcBorders>
+            <w:shd w:fill="F5F9F8" w:color="auto" w:val="clear"/>
+            <w:tcMar>
+              <w:top w:type="dxa" w:w="50"/>
+              <w:left w:type="dxa" w:w="90"/>
+              <w:bottom w:type="dxa" w:w="50"/>
+              <w:right w:type="dxa" w:w="90"/>
+            </w:tcMar>
+          </w:tcPr>
+          <w:p>
+            <w:pPr>
+              <w:jc w:val="left"/>
+            </w:pPr>
+            <w:r>
+              <w:rPr>
+                <w:sz w:val="19"/>
+                <w:szCs w:val="19"/>
+              </w:rPr>
+              <w:t xml:space="preserve">Les demander à SENSAT, à TRL et à la mairie ; les utiliser si elles arrivent</w:t>
+            </w:r>
+          </w:p>
+        </w:tc>
+        <w:tc>
+          <w:tcPr>
+            <w:tcW w:type="dxa" w:w="2012"/>
+            <w:tcBorders>
+              <w:top w:val="single" w:color="CFDCD9" w:sz="4"/>
+              <w:left w:val="single" w:color="CFDCD9" w:sz="4"/>
+              <w:bottom w:val="single" w:color="CFDCD9" w:sz="4"/>
+              <w:right w:val="single" w:color="CFDCD9" w:sz="4"/>
+            </w:tcBorders>
+            <w:shd w:fill="F5F9F8" w:color="auto" w:val="clear"/>
+            <w:tcMar>
+              <w:top w:type="dxa" w:w="50"/>
+              <w:left w:type="dxa" w:w="90"/>
+              <w:bottom w:type="dxa" w:w="50"/>
+              <w:right w:type="dxa" w:w="90"/>
+            </w:tcMar>
+          </w:tcPr>
+          <w:p>
+            <w:pPr>
+              <w:jc w:val="left"/>
+            </w:pPr>
+            <w:r>
+              <w:rPr>
+                <w:sz w:val="19"/>
+                <w:szCs w:val="19"/>
+              </w:rPr>
+              <w:t xml:space="preserve">Ndèye Fatou</w:t>
+            </w:r>
+          </w:p>
+        </w:tc>
+      </w:tr>
+      <w:tr>
+        <w:trPr>
+          <w:cantSplit/>
+        </w:trPr>
+        <w:tc>
+          <w:tcPr>
+            <w:tcW w:type="dxa" w:w="3019"/>
+            <w:tcBorders>
+              <w:top w:val="single" w:color="CFDCD9" w:sz="4"/>
+              <w:left w:val="single" w:color="CFDCD9" w:sz="4"/>
+              <w:bottom w:val="single" w:color="CFDCD9" w:sz="4"/>
+              <w:right w:val="single" w:color="CFDCD9" w:sz="4"/>
+            </w:tcBorders>
+            <w:tcMar>
+              <w:top w:type="dxa" w:w="50"/>
+              <w:left w:type="dxa" w:w="90"/>
+              <w:bottom w:type="dxa" w:w="50"/>
+              <w:right w:type="dxa" w:w="90"/>
+            </w:tcMar>
+          </w:tcPr>
+          <w:p>
+            <w:pPr>
+              <w:jc w:val="left"/>
+            </w:pPr>
+            <w:r>
+              <w:rPr>
+                <w:sz w:val="19"/>
+                <w:szCs w:val="19"/>
+              </w:rPr>
+              <w:t xml:space="preserve">Google Earth Engine et CoastSat (§3)</w:t>
+            </w:r>
+          </w:p>
+        </w:tc>
+        <w:tc>
+          <w:tcPr>
+            <w:tcW w:type="dxa" w:w="5061"/>
+            <w:tcBorders>
+              <w:top w:val="single" w:color="CFDCD9" w:sz="4"/>
+              <w:left w:val="single" w:color="CFDCD9" w:sz="4"/>
+              <w:bottom w:val="single" w:color="CFDCD9" w:sz="4"/>
+              <w:right w:val="single" w:color="CFDCD9" w:sz="4"/>
+            </w:tcBorders>
+            <w:tcMar>
+              <w:top w:type="dxa" w:w="50"/>
+              <w:left w:type="dxa" w:w="90"/>
+              <w:bottom w:type="dxa" w:w="50"/>
+              <w:right w:type="dxa" w:w="90"/>
+            </w:tcMar>
+          </w:tcPr>
+          <w:p>
+            <w:pPr>
+              <w:jc w:val="left"/>
+            </w:pPr>
+            <w:r>
+              <w:rPr>
+                <w:sz w:val="19"/>
+                <w:szCs w:val="19"/>
+              </w:rPr>
+              <w:t xml:space="preserve">Extraction des traits de côte</w:t>
+            </w:r>
+          </w:p>
+        </w:tc>
+        <w:tc>
+          <w:tcPr>
+            <w:tcW w:type="dxa" w:w="2012"/>
+            <w:tcBorders>
+              <w:top w:val="single" w:color="CFDCD9" w:sz="4"/>
+              <w:left w:val="single" w:color="CFDCD9" w:sz="4"/>
+              <w:bottom w:val="single" w:color="CFDCD9" w:sz="4"/>
+              <w:right w:val="single" w:color="CFDCD9" w:sz="4"/>
+            </w:tcBorders>
+            <w:tcMar>
+              <w:top w:type="dxa" w:w="50"/>
+              <w:left w:type="dxa" w:w="90"/>
+              <w:bottom w:type="dxa" w:w="50"/>
+              <w:right w:type="dxa" w:w="90"/>
+            </w:tcMar>
+          </w:tcPr>
+          <w:p>
+            <w:pPr>
+              <w:jc w:val="left"/>
+            </w:pPr>
+            <w:r>
+              <w:rPr>
+                <w:sz w:val="19"/>
+                <w:szCs w:val="19"/>
+              </w:rPr>
+              <w:t xml:space="preserve">Abdoulaye</w:t>
+            </w:r>
+          </w:p>
+        </w:tc>
+      </w:tr>
+      <w:tr>
+        <w:trPr>
+          <w:cantSplit/>
+        </w:trPr>
+        <w:tc>
+          <w:tcPr>
+            <w:tcW w:type="dxa" w:w="3019"/>
+            <w:tcBorders>
+              <w:top w:val="single" w:color="CFDCD9" w:sz="4"/>
+              <w:left w:val="single" w:color="CFDCD9" w:sz="4"/>
+              <w:bottom w:val="single" w:color="CFDCD9" w:sz="4"/>
+              <w:right w:val="single" w:color="CFDCD9" w:sz="4"/>
+            </w:tcBorders>
+            <w:shd w:fill="F5F9F8" w:color="auto" w:val="clear"/>
+            <w:tcMar>
+              <w:top w:type="dxa" w:w="50"/>
+              <w:left w:type="dxa" w:w="90"/>
+              <w:bottom w:type="dxa" w:w="50"/>
+              <w:right w:type="dxa" w:w="90"/>
+            </w:tcMar>
+          </w:tcPr>
+          <w:p>
+            <w:pPr>
+              <w:jc w:val="left"/>
+            </w:pPr>
+            <w:r>
+              <w:rPr>
+                <w:sz w:val="19"/>
+                <w:szCs w:val="19"/>
+              </w:rPr>
+              <w:t xml:space="preserve">Indice MNDWI et seuil d’Otsu (§3)</w:t>
+            </w:r>
+          </w:p>
+        </w:tc>
+        <w:tc>
+          <w:tcPr>
+            <w:tcW w:type="dxa" w:w="5061"/>
+            <w:tcBorders>
+              <w:top w:val="single" w:color="CFDCD9" w:sz="4"/>
+              <w:left w:val="single" w:color="CFDCD9" w:sz="4"/>
+              <w:bottom w:val="single" w:color="CFDCD9" w:sz="4"/>
+              <w:right w:val="single" w:color="CFDCD9" w:sz="4"/>
+            </w:tcBorders>
+            <w:shd w:fill="F5F9F8" w:color="auto" w:val="clear"/>
+            <w:tcMar>
+              <w:top w:type="dxa" w:w="50"/>
+              <w:left w:type="dxa" w:w="90"/>
+              <w:bottom w:type="dxa" w:w="50"/>
+              <w:right w:type="dxa" w:w="90"/>
+            </w:tcMar>
+          </w:tcPr>
+          <w:p>
+            <w:pPr>
+              <w:jc w:val="left"/>
+            </w:pPr>
+            <w:r>
+              <w:rPr>
+                <w:sz w:val="19"/>
+                <w:szCs w:val="19"/>
+              </w:rPr>
+              <w:t xml:space="preserve">Déjà en place dans le code ; à comparer avec CoastSat</w:t>
+            </w:r>
+          </w:p>
+        </w:tc>
+        <w:tc>
+          <w:tcPr>
+            <w:tcW w:type="dxa" w:w="2012"/>
+            <w:tcBorders>
+              <w:top w:val="single" w:color="CFDCD9" w:sz="4"/>
+              <w:left w:val="single" w:color="CFDCD9" w:sz="4"/>
+              <w:bottom w:val="single" w:color="CFDCD9" w:sz="4"/>
+              <w:right w:val="single" w:color="CFDCD9" w:sz="4"/>
+            </w:tcBorders>
+            <w:shd w:fill="F5F9F8" w:color="auto" w:val="clear"/>
+            <w:tcMar>
+              <w:top w:type="dxa" w:w="50"/>
+              <w:left w:type="dxa" w:w="90"/>
+              <w:bottom w:type="dxa" w:w="50"/>
+              <w:right w:type="dxa" w:w="90"/>
+            </w:tcMar>
+          </w:tcPr>
+          <w:p>
+            <w:pPr>
+              <w:jc w:val="left"/>
+            </w:pPr>
+            <w:r>
+              <w:rPr>
+                <w:sz w:val="19"/>
+                <w:szCs w:val="19"/>
+              </w:rPr>
+              <w:t xml:space="preserve">Abdoulaye et Ndèye Fatou</w:t>
+            </w:r>
+          </w:p>
+        </w:tc>
+      </w:tr>
+      <w:tr>
+        <w:trPr>
+          <w:cantSplit/>
+        </w:trPr>
+        <w:tc>
+          <w:tcPr>
+            <w:tcW w:type="dxa" w:w="3019"/>
+            <w:tcBorders>
+              <w:top w:val="single" w:color="CFDCD9" w:sz="4"/>
+              <w:left w:val="single" w:color="CFDCD9" w:sz="4"/>
+              <w:bottom w:val="single" w:color="CFDCD9" w:sz="4"/>
+              <w:right w:val="single" w:color="CFDCD9" w:sz="4"/>
+            </w:tcBorders>
+            <w:tcMar>
+              <w:top w:type="dxa" w:w="50"/>
+              <w:left w:type="dxa" w:w="90"/>
+              <w:bottom w:type="dxa" w:w="50"/>
+              <w:right w:type="dxa" w:w="90"/>
+            </w:tcMar>
+          </w:tcPr>
+          <w:p>
+            <w:pPr>
+              <w:jc w:val="left"/>
+            </w:pPr>
+            <w:r>
+              <w:rPr>
+                <w:sz w:val="19"/>
+                <w:szCs w:val="19"/>
+              </w:rPr>
+              <w:t xml:space="preserve">Classification eau / sable par apprentissage automatique (§8)</w:t>
+            </w:r>
+          </w:p>
+        </w:tc>
+        <w:tc>
+          <w:tcPr>
+            <w:tcW w:type="dxa" w:w="5061"/>
+            <w:tcBorders>
+              <w:top w:val="single" w:color="CFDCD9" w:sz="4"/>
+              <w:left w:val="single" w:color="CFDCD9" w:sz="4"/>
+              <w:bottom w:val="single" w:color="CFDCD9" w:sz="4"/>
+              <w:right w:val="single" w:color="CFDCD9" w:sz="4"/>
+            </w:tcBorders>
+            <w:tcMar>
+              <w:top w:type="dxa" w:w="50"/>
+              <w:left w:type="dxa" w:w="90"/>
+              <w:bottom w:type="dxa" w:w="50"/>
+              <w:right w:type="dxa" w:w="90"/>
+            </w:tcMar>
+          </w:tcPr>
+          <w:p>
+            <w:pPr>
+              <w:jc w:val="left"/>
+            </w:pPr>
+            <w:r>
+              <w:rPr>
+                <w:sz w:val="19"/>
+                <w:szCs w:val="19"/>
+              </w:rPr>
+              <w:t xml:space="preserve">Modèle (par exemple Random Forest dans Google Earth Engine) comparé au seuil d’Otsu</w:t>
+            </w:r>
+          </w:p>
+        </w:tc>
+        <w:tc>
+          <w:tcPr>
+            <w:tcW w:type="dxa" w:w="2012"/>
+            <w:tcBorders>
+              <w:top w:val="single" w:color="CFDCD9" w:sz="4"/>
+              <w:left w:val="single" w:color="CFDCD9" w:sz="4"/>
+              <w:bottom w:val="single" w:color="CFDCD9" w:sz="4"/>
+              <w:right w:val="single" w:color="CFDCD9" w:sz="4"/>
+            </w:tcBorders>
+            <w:tcMar>
+              <w:top w:type="dxa" w:w="50"/>
+              <w:left w:type="dxa" w:w="90"/>
+              <w:bottom w:type="dxa" w:w="50"/>
+              <w:right w:type="dxa" w:w="90"/>
+            </w:tcMar>
+          </w:tcPr>
+          <w:p>
+            <w:pPr>
+              <w:jc w:val="left"/>
+            </w:pPr>
+            <w:r>
+              <w:rPr>
+                <w:sz w:val="19"/>
+                <w:szCs w:val="19"/>
+              </w:rPr>
+              <w:t xml:space="preserve">Abdoulaye</w:t>
+            </w:r>
+          </w:p>
+        </w:tc>
+      </w:tr>
+      <w:tr>
+        <w:trPr>
+          <w:cantSplit/>
+        </w:trPr>
+        <w:tc>
+          <w:tcPr>
+            <w:tcW w:type="dxa" w:w="3019"/>
+            <w:tcBorders>
+              <w:top w:val="single" w:color="CFDCD9" w:sz="4"/>
+              <w:left w:val="single" w:color="CFDCD9" w:sz="4"/>
+              <w:bottom w:val="single" w:color="CFDCD9" w:sz="4"/>
+              <w:right w:val="single" w:color="CFDCD9" w:sz="4"/>
+            </w:tcBorders>
+            <w:shd w:fill="F5F9F8" w:color="auto" w:val="clear"/>
+            <w:tcMar>
+              <w:top w:type="dxa" w:w="50"/>
+              <w:left w:type="dxa" w:w="90"/>
+              <w:bottom w:type="dxa" w:w="50"/>
+              <w:right w:type="dxa" w:w="90"/>
+            </w:tcMar>
+          </w:tcPr>
+          <w:p>
+            <w:pPr>
+              <w:jc w:val="left"/>
+            </w:pPr>
+            <w:r>
+              <w:rPr>
+                <w:sz w:val="19"/>
+                <w:szCs w:val="19"/>
+              </w:rPr>
+              <w:t xml:space="preserve">Transects tous les 50 m, régression type DSAS (§3)</w:t>
+            </w:r>
+          </w:p>
+        </w:tc>
+        <w:tc>
+          <w:tcPr>
+            <w:tcW w:type="dxa" w:w="5061"/>
+            <w:tcBorders>
+              <w:top w:val="single" w:color="CFDCD9" w:sz="4"/>
+              <w:left w:val="single" w:color="CFDCD9" w:sz="4"/>
+              <w:bottom w:val="single" w:color="CFDCD9" w:sz="4"/>
+              <w:right w:val="single" w:color="CFDCD9" w:sz="4"/>
+            </w:tcBorders>
+            <w:shd w:fill="F5F9F8" w:color="auto" w:val="clear"/>
+            <w:tcMar>
+              <w:top w:type="dxa" w:w="50"/>
+              <w:left w:type="dxa" w:w="90"/>
+              <w:bottom w:type="dxa" w:w="50"/>
+              <w:right w:type="dxa" w:w="90"/>
+            </w:tcMar>
+          </w:tcPr>
+          <w:p>
+            <w:pPr>
+              <w:jc w:val="left"/>
+            </w:pPr>
+            <w:r>
+              <w:rPr>
+                <w:sz w:val="19"/>
+                <w:szCs w:val="19"/>
+              </w:rPr>
+              <w:t xml:space="preserve">Recul total et vitesse par transect</w:t>
+            </w:r>
+          </w:p>
+        </w:tc>
+        <w:tc>
+          <w:tcPr>
+            <w:tcW w:type="dxa" w:w="2012"/>
+            <w:tcBorders>
+              <w:top w:val="single" w:color="CFDCD9" w:sz="4"/>
+              <w:left w:val="single" w:color="CFDCD9" w:sz="4"/>
+              <w:bottom w:val="single" w:color="CFDCD9" w:sz="4"/>
+              <w:right w:val="single" w:color="CFDCD9" w:sz="4"/>
+            </w:tcBorders>
+            <w:shd w:fill="F5F9F8" w:color="auto" w:val="clear"/>
+            <w:tcMar>
+              <w:top w:type="dxa" w:w="50"/>
+              <w:left w:type="dxa" w:w="90"/>
+              <w:bottom w:type="dxa" w:w="50"/>
+              <w:right w:type="dxa" w:w="90"/>
+            </w:tcMar>
+          </w:tcPr>
+          <w:p>
+            <w:pPr>
+              <w:jc w:val="left"/>
+            </w:pPr>
+            <w:r>
+              <w:rPr>
+                <w:sz w:val="19"/>
+                <w:szCs w:val="19"/>
+              </w:rPr>
+              <w:t xml:space="preserve">Ndèye Fatou</w:t>
+            </w:r>
+          </w:p>
+        </w:tc>
+      </w:tr>
+      <w:tr>
+        <w:trPr>
+          <w:cantSplit/>
+        </w:trPr>
+        <w:tc>
+          <w:tcPr>
+            <w:tcW w:type="dxa" w:w="3019"/>
+            <w:tcBorders>
+              <w:top w:val="single" w:color="CFDCD9" w:sz="4"/>
+              <w:left w:val="single" w:color="CFDCD9" w:sz="4"/>
+              <w:bottom w:val="single" w:color="CFDCD9" w:sz="4"/>
+              <w:right w:val="single" w:color="CFDCD9" w:sz="4"/>
+            </w:tcBorders>
+            <w:tcMar>
+              <w:top w:type="dxa" w:w="50"/>
+              <w:left w:type="dxa" w:w="90"/>
+              <w:bottom w:type="dxa" w:w="50"/>
+              <w:right w:type="dxa" w:w="90"/>
+            </w:tcMar>
+          </w:tcPr>
+          <w:p>
+            <w:pPr>
+              <w:jc w:val="left"/>
+            </w:pPr>
+            <w:r>
+              <w:rPr>
+                <w:sz w:val="19"/>
+                <w:szCs w:val="19"/>
+              </w:rPr>
+              <w:t xml:space="preserve">Projection 2030 et 2035 avec incertitude (§3)</w:t>
+            </w:r>
+          </w:p>
+        </w:tc>
+        <w:tc>
+          <w:tcPr>
+            <w:tcW w:type="dxa" w:w="5061"/>
+            <w:tcBorders>
+              <w:top w:val="single" w:color="CFDCD9" w:sz="4"/>
+              <w:left w:val="single" w:color="CFDCD9" w:sz="4"/>
+              <w:bottom w:val="single" w:color="CFDCD9" w:sz="4"/>
+              <w:right w:val="single" w:color="CFDCD9" w:sz="4"/>
+            </w:tcBorders>
+            <w:tcMar>
+              <w:top w:type="dxa" w:w="50"/>
+              <w:left w:type="dxa" w:w="90"/>
+              <w:bottom w:type="dxa" w:w="50"/>
+              <w:right w:type="dxa" w:w="90"/>
+            </w:tcMar>
+          </w:tcPr>
+          <w:p>
+            <w:pPr>
+              <w:jc w:val="left"/>
+            </w:pPr>
+            <w:r>
+              <w:rPr>
+                <w:sz w:val="19"/>
+                <w:szCs w:val="19"/>
+              </w:rPr>
+              <w:t xml:space="preserve">Position probable de la côte et marge d’erreur</w:t>
+            </w:r>
+          </w:p>
+        </w:tc>
+        <w:tc>
+          <w:tcPr>
+            <w:tcW w:type="dxa" w:w="2012"/>
+            <w:tcBorders>
+              <w:top w:val="single" w:color="CFDCD9" w:sz="4"/>
+              <w:left w:val="single" w:color="CFDCD9" w:sz="4"/>
+              <w:bottom w:val="single" w:color="CFDCD9" w:sz="4"/>
+              <w:right w:val="single" w:color="CFDCD9" w:sz="4"/>
+            </w:tcBorders>
+            <w:tcMar>
+              <w:top w:type="dxa" w:w="50"/>
+              <w:left w:type="dxa" w:w="90"/>
+              <w:bottom w:type="dxa" w:w="50"/>
+              <w:right w:type="dxa" w:w="90"/>
+            </w:tcMar>
+          </w:tcPr>
+          <w:p>
+            <w:pPr>
+              <w:jc w:val="left"/>
+            </w:pPr>
+            <w:r>
+              <w:rPr>
+                <w:sz w:val="19"/>
+                <w:szCs w:val="19"/>
+              </w:rPr>
+              <w:t xml:space="preserve">Ndèye Fatou</w:t>
+            </w:r>
+          </w:p>
+        </w:tc>
+      </w:tr>
+      <w:tr>
+        <w:trPr>
+          <w:cantSplit/>
+        </w:trPr>
+        <w:tc>
+          <w:tcPr>
+            <w:tcW w:type="dxa" w:w="3019"/>
+            <w:tcBorders>
+              <w:top w:val="single" w:color="CFDCD9" w:sz="4"/>
+              <w:left w:val="single" w:color="CFDCD9" w:sz="4"/>
+              <w:bottom w:val="single" w:color="CFDCD9" w:sz="4"/>
+              <w:right w:val="single" w:color="CFDCD9" w:sz="4"/>
+            </w:tcBorders>
+            <w:shd w:fill="F5F9F8" w:color="auto" w:val="clear"/>
+            <w:tcMar>
+              <w:top w:type="dxa" w:w="50"/>
+              <w:left w:type="dxa" w:w="90"/>
+              <w:bottom w:type="dxa" w:w="50"/>
+              <w:right w:type="dxa" w:w="90"/>
+            </w:tcMar>
+          </w:tcPr>
+          <w:p>
+            <w:pPr>
+              <w:jc w:val="left"/>
+            </w:pPr>
+            <w:r>
+              <w:rPr>
+                <w:sz w:val="19"/>
+                <w:szCs w:val="19"/>
+              </w:rPr>
+              <w:t xml:space="preserve">Risque selon vitesse, altitude et personnes (§3)</w:t>
+            </w:r>
+          </w:p>
+        </w:tc>
+        <w:tc>
+          <w:tcPr>
+            <w:tcW w:type="dxa" w:w="5061"/>
+            <w:tcBorders>
+              <w:top w:val="single" w:color="CFDCD9" w:sz="4"/>
+              <w:left w:val="single" w:color="CFDCD9" w:sz="4"/>
+              <w:bottom w:val="single" w:color="CFDCD9" w:sz="4"/>
+              <w:right w:val="single" w:color="CFDCD9" w:sz="4"/>
+            </w:tcBorders>
+            <w:shd w:fill="F5F9F8" w:color="auto" w:val="clear"/>
+            <w:tcMar>
+              <w:top w:type="dxa" w:w="50"/>
+              <w:left w:type="dxa" w:w="90"/>
+              <w:bottom w:type="dxa" w:w="50"/>
+              <w:right w:type="dxa" w:w="90"/>
+            </w:tcMar>
+          </w:tcPr>
+          <w:p>
+            <w:pPr>
+              <w:jc w:val="left"/>
+            </w:pPr>
+            <w:r>
+              <w:rPr>
+                <w:sz w:val="19"/>
+                <w:szCs w:val="19"/>
+              </w:rPr>
+              <w:t xml:space="preserve">Carte de risque à 4 niveaux</w:t>
+            </w:r>
+          </w:p>
+        </w:tc>
+        <w:tc>
+          <w:tcPr>
+            <w:tcW w:type="dxa" w:w="2012"/>
+            <w:tcBorders>
+              <w:top w:val="single" w:color="CFDCD9" w:sz="4"/>
+              <w:left w:val="single" w:color="CFDCD9" w:sz="4"/>
+              <w:bottom w:val="single" w:color="CFDCD9" w:sz="4"/>
+              <w:right w:val="single" w:color="CFDCD9" w:sz="4"/>
+            </w:tcBorders>
+            <w:shd w:fill="F5F9F8" w:color="auto" w:val="clear"/>
+            <w:tcMar>
+              <w:top w:type="dxa" w:w="50"/>
+              <w:left w:type="dxa" w:w="90"/>
+              <w:bottom w:type="dxa" w:w="50"/>
+              <w:right w:type="dxa" w:w="90"/>
+            </w:tcMar>
+          </w:tcPr>
+          <w:p>
+            <w:pPr>
+              <w:jc w:val="left"/>
+            </w:pPr>
+            <w:r>
+              <w:rPr>
+                <w:sz w:val="19"/>
+                <w:szCs w:val="19"/>
+              </w:rPr>
+              <w:t xml:space="preserve">Ndèye Fatou</w:t>
+            </w:r>
+          </w:p>
+        </w:tc>
+      </w:tr>
+      <w:tr>
+        <w:trPr>
+          <w:cantSplit/>
+        </w:trPr>
+        <w:tc>
+          <w:tcPr>
+            <w:tcW w:type="dxa" w:w="3019"/>
+            <w:tcBorders>
+              <w:top w:val="single" w:color="CFDCD9" w:sz="4"/>
+              <w:left w:val="single" w:color="CFDCD9" w:sz="4"/>
+              <w:bottom w:val="single" w:color="CFDCD9" w:sz="4"/>
+              <w:right w:val="single" w:color="CFDCD9" w:sz="4"/>
+            </w:tcBorders>
+            <w:tcMar>
+              <w:top w:type="dxa" w:w="50"/>
+              <w:left w:type="dxa" w:w="90"/>
+              <w:bottom w:type="dxa" w:w="50"/>
+              <w:right w:type="dxa" w:w="90"/>
+            </w:tcMar>
+          </w:tcPr>
+          <w:p>
+            <w:pPr>
+              <w:jc w:val="left"/>
+            </w:pPr>
+            <w:r>
+              <w:rPr>
+                <w:sz w:val="19"/>
+                <w:szCs w:val="19"/>
+              </w:rPr>
+              <w:t xml:space="preserve">Tableau de bord sur ordinateur et téléphone (§3, §5)</w:t>
+            </w:r>
+          </w:p>
+        </w:tc>
+        <w:tc>
+          <w:tcPr>
+            <w:tcW w:type="dxa" w:w="5061"/>
+            <w:tcBorders>
+              <w:top w:val="single" w:color="CFDCD9" w:sz="4"/>
+              <w:left w:val="single" w:color="CFDCD9" w:sz="4"/>
+              <w:bottom w:val="single" w:color="CFDCD9" w:sz="4"/>
+              <w:right w:val="single" w:color="CFDCD9" w:sz="4"/>
+            </w:tcBorders>
+            <w:tcMar>
+              <w:top w:type="dxa" w:w="50"/>
+              <w:left w:type="dxa" w:w="90"/>
+              <w:bottom w:type="dxa" w:w="50"/>
+              <w:right w:type="dxa" w:w="90"/>
+            </w:tcMar>
+          </w:tcPr>
+          <w:p>
+            <w:pPr>
+              <w:jc w:val="left"/>
+            </w:pPr>
+            <w:r>
+              <w:rPr>
+                <w:sz w:val="19"/>
+                <w:szCs w:val="19"/>
+              </w:rPr>
+              <w:t xml:space="preserve">Site web adapté aux petits écrans</w:t>
+            </w:r>
+          </w:p>
+        </w:tc>
+        <w:tc>
+          <w:tcPr>
+            <w:tcW w:type="dxa" w:w="2012"/>
+            <w:tcBorders>
+              <w:top w:val="single" w:color="CFDCD9" w:sz="4"/>
+              <w:left w:val="single" w:color="CFDCD9" w:sz="4"/>
+              <w:bottom w:val="single" w:color="CFDCD9" w:sz="4"/>
+              <w:right w:val="single" w:color="CFDCD9" w:sz="4"/>
+            </w:tcBorders>
+            <w:tcMar>
+              <w:top w:type="dxa" w:w="50"/>
+              <w:left w:type="dxa" w:w="90"/>
+              <w:bottom w:type="dxa" w:w="50"/>
+              <w:right w:type="dxa" w:w="90"/>
+            </w:tcMar>
+          </w:tcPr>
+          <w:p>
+            <w:pPr>
+              <w:jc w:val="left"/>
+            </w:pPr>
+            <w:r>
+              <w:rPr>
+                <w:sz w:val="19"/>
+                <w:szCs w:val="19"/>
+              </w:rPr>
+              <w:t xml:space="preserve">Malick</w:t>
+            </w:r>
+          </w:p>
+        </w:tc>
+      </w:tr>
+      <w:tr>
+        <w:trPr>
+          <w:cantSplit/>
+        </w:trPr>
+        <w:tc>
+          <w:tcPr>
+            <w:tcW w:type="dxa" w:w="3019"/>
+            <w:tcBorders>
+              <w:top w:val="single" w:color="CFDCD9" w:sz="4"/>
+              <w:left w:val="single" w:color="CFDCD9" w:sz="4"/>
+              <w:bottom w:val="single" w:color="CFDCD9" w:sz="4"/>
+              <w:right w:val="single" w:color="CFDCD9" w:sz="4"/>
+            </w:tcBorders>
+            <w:shd w:fill="F5F9F8" w:color="auto" w:val="clear"/>
+            <w:tcMar>
+              <w:top w:type="dxa" w:w="50"/>
+              <w:left w:type="dxa" w:w="90"/>
+              <w:bottom w:type="dxa" w:w="50"/>
+              <w:right w:type="dxa" w:w="90"/>
+            </w:tcMar>
+          </w:tcPr>
+          <w:p>
+            <w:pPr>
+              <w:jc w:val="left"/>
+            </w:pPr>
+            <w:r>
+              <w:rPr>
+                <w:sz w:val="19"/>
+                <w:szCs w:val="19"/>
+              </w:rPr>
+              <w:t xml:space="preserve">Version mobile pour les habitants (§8)</w:t>
+            </w:r>
+          </w:p>
+        </w:tc>
+        <w:tc>
+          <w:tcPr>
+            <w:tcW w:type="dxa" w:w="5061"/>
+            <w:tcBorders>
+              <w:top w:val="single" w:color="CFDCD9" w:sz="4"/>
+              <w:left w:val="single" w:color="CFDCD9" w:sz="4"/>
+              <w:bottom w:val="single" w:color="CFDCD9" w:sz="4"/>
+              <w:right w:val="single" w:color="CFDCD9" w:sz="4"/>
+            </w:tcBorders>
+            <w:shd w:fill="F5F9F8" w:color="auto" w:val="clear"/>
+            <w:tcMar>
+              <w:top w:type="dxa" w:w="50"/>
+              <w:left w:type="dxa" w:w="90"/>
+              <w:bottom w:type="dxa" w:w="50"/>
+              <w:right w:type="dxa" w:w="90"/>
+            </w:tcMar>
+          </w:tcPr>
+          <w:p>
+            <w:pPr>
+              <w:jc w:val="left"/>
+            </w:pPr>
+            <w:r>
+              <w:rPr>
+                <w:sz w:val="19"/>
+                <w:szCs w:val="19"/>
+              </w:rPr>
+              <w:t xml:space="preserve">Même tableau de bord, mode simplifié sur téléphone</w:t>
+            </w:r>
+          </w:p>
+        </w:tc>
+        <w:tc>
+          <w:tcPr>
+            <w:tcW w:type="dxa" w:w="2012"/>
+            <w:tcBorders>
+              <w:top w:val="single" w:color="CFDCD9" w:sz="4"/>
+              <w:left w:val="single" w:color="CFDCD9" w:sz="4"/>
+              <w:bottom w:val="single" w:color="CFDCD9" w:sz="4"/>
+              <w:right w:val="single" w:color="CFDCD9" w:sz="4"/>
+            </w:tcBorders>
+            <w:shd w:fill="F5F9F8" w:color="auto" w:val="clear"/>
+            <w:tcMar>
+              <w:top w:type="dxa" w:w="50"/>
+              <w:left w:type="dxa" w:w="90"/>
+              <w:bottom w:type="dxa" w:w="50"/>
+              <w:right w:type="dxa" w:w="90"/>
+            </w:tcMar>
+          </w:tcPr>
+          <w:p>
+            <w:pPr>
+              <w:jc w:val="left"/>
+            </w:pPr>
+            <w:r>
+              <w:rPr>
+                <w:sz w:val="19"/>
+                <w:szCs w:val="19"/>
+              </w:rPr>
+              <w:t xml:space="preserve">Malick</w:t>
+            </w:r>
+          </w:p>
+        </w:tc>
+      </w:tr>
+      <w:tr>
+        <w:trPr>
+          <w:cantSplit/>
+        </w:trPr>
+        <w:tc>
+          <w:tcPr>
+            <w:tcW w:type="dxa" w:w="3019"/>
+            <w:tcBorders>
+              <w:top w:val="single" w:color="CFDCD9" w:sz="4"/>
+              <w:left w:val="single" w:color="CFDCD9" w:sz="4"/>
+              <w:bottom w:val="single" w:color="CFDCD9" w:sz="4"/>
+              <w:right w:val="single" w:color="CFDCD9" w:sz="4"/>
+            </w:tcBorders>
+            <w:tcMar>
+              <w:top w:type="dxa" w:w="50"/>
+              <w:left w:type="dxa" w:w="90"/>
+              <w:bottom w:type="dxa" w:w="50"/>
+              <w:right w:type="dxa" w:w="90"/>
+            </w:tcMar>
+          </w:tcPr>
+          <w:p>
+            <w:pPr>
+              <w:jc w:val="left"/>
+            </w:pPr>
+            <w:r>
+              <w:rPr>
+                <w:sz w:val="19"/>
+                <w:szCs w:val="19"/>
+              </w:rPr>
+              <w:t xml:space="preserve">Version en français et en wolof (§4)</w:t>
+            </w:r>
+          </w:p>
+        </w:tc>
+        <w:tc>
+          <w:tcPr>
+            <w:tcW w:type="dxa" w:w="5061"/>
+            <w:tcBorders>
+              <w:top w:val="single" w:color="CFDCD9" w:sz="4"/>
+              <w:left w:val="single" w:color="CFDCD9" w:sz="4"/>
+              <w:bottom w:val="single" w:color="CFDCD9" w:sz="4"/>
+              <w:right w:val="single" w:color="CFDCD9" w:sz="4"/>
+            </w:tcBorders>
+            <w:tcMar>
+              <w:top w:type="dxa" w:w="50"/>
+              <w:left w:type="dxa" w:w="90"/>
+              <w:bottom w:type="dxa" w:w="50"/>
+              <w:right w:type="dxa" w:w="90"/>
+            </w:tcMar>
+          </w:tcPr>
+          <w:p>
+            <w:pPr>
+              <w:jc w:val="left"/>
+            </w:pPr>
+            <w:r>
+              <w:rPr>
+                <w:sz w:val="19"/>
+                <w:szCs w:val="19"/>
+              </w:rPr>
+              <w:t xml:space="preserve">Bouton FR | WO et message audio en wolof</w:t>
+            </w:r>
+          </w:p>
+        </w:tc>
+        <w:tc>
+          <w:tcPr>
+            <w:tcW w:type="dxa" w:w="2012"/>
+            <w:tcBorders>
+              <w:top w:val="single" w:color="CFDCD9" w:sz="4"/>
+              <w:left w:val="single" w:color="CFDCD9" w:sz="4"/>
+              <w:bottom w:val="single" w:color="CFDCD9" w:sz="4"/>
+              <w:right w:val="single" w:color="CFDCD9" w:sz="4"/>
+            </w:tcBorders>
+            <w:tcMar>
+              <w:top w:type="dxa" w:w="50"/>
+              <w:left w:type="dxa" w:w="90"/>
+              <w:bottom w:type="dxa" w:w="50"/>
+              <w:right w:type="dxa" w:w="90"/>
+            </w:tcMar>
+          </w:tcPr>
+          <w:p>
+            <w:pPr>
+              <w:jc w:val="left"/>
+            </w:pPr>
+            <w:r>
+              <w:rPr>
+                <w:sz w:val="19"/>
+                <w:szCs w:val="19"/>
+              </w:rPr>
+              <w:t xml:space="preserve">Les trois</w:t>
+            </w:r>
+          </w:p>
+        </w:tc>
+      </w:tr>
+      <w:tr>
+        <w:trPr>
+          <w:cantSplit/>
+        </w:trPr>
+        <w:tc>
+          <w:tcPr>
+            <w:tcW w:type="dxa" w:w="3019"/>
+            <w:tcBorders>
+              <w:top w:val="single" w:color="CFDCD9" w:sz="4"/>
+              <w:left w:val="single" w:color="CFDCD9" w:sz="4"/>
+              <w:bottom w:val="single" w:color="CFDCD9" w:sz="4"/>
+              <w:right w:val="single" w:color="CFDCD9" w:sz="4"/>
+            </w:tcBorders>
+            <w:shd w:fill="F5F9F8" w:color="auto" w:val="clear"/>
+            <w:tcMar>
+              <w:top w:type="dxa" w:w="50"/>
+              <w:left w:type="dxa" w:w="90"/>
+              <w:bottom w:type="dxa" w:w="50"/>
+              <w:right w:type="dxa" w:w="90"/>
+            </w:tcMar>
+          </w:tcPr>
+          <w:p>
+            <w:pPr>
+              <w:jc w:val="left"/>
+            </w:pPr>
+            <w:r>
+              <w:rPr>
+                <w:sz w:val="19"/>
+                <w:szCs w:val="19"/>
+              </w:rPr>
+              <w:t xml:space="preserve">API de diffusion des résultats (§8)</w:t>
+            </w:r>
+          </w:p>
+        </w:tc>
+        <w:tc>
+          <w:tcPr>
+            <w:tcW w:type="dxa" w:w="5061"/>
+            <w:tcBorders>
+              <w:top w:val="single" w:color="CFDCD9" w:sz="4"/>
+              <w:left w:val="single" w:color="CFDCD9" w:sz="4"/>
+              <w:bottom w:val="single" w:color="CFDCD9" w:sz="4"/>
+              <w:right w:val="single" w:color="CFDCD9" w:sz="4"/>
+            </w:tcBorders>
+            <w:shd w:fill="F5F9F8" w:color="auto" w:val="clear"/>
+            <w:tcMar>
+              <w:top w:type="dxa" w:w="50"/>
+              <w:left w:type="dxa" w:w="90"/>
+              <w:bottom w:type="dxa" w:w="50"/>
+              <w:right w:type="dxa" w:w="90"/>
+            </w:tcMar>
+          </w:tcPr>
+          <w:p>
+            <w:pPr>
+              <w:jc w:val="left"/>
+            </w:pPr>
+            <w:r>
+              <w:rPr>
+                <w:sz w:val="19"/>
+                <w:szCs w:val="19"/>
+              </w:rPr>
+              <w:t xml:space="preserve">Petite API FastAPI</w:t>
+            </w:r>
+          </w:p>
+        </w:tc>
+        <w:tc>
+          <w:tcPr>
+            <w:tcW w:type="dxa" w:w="2012"/>
+            <w:tcBorders>
+              <w:top w:val="single" w:color="CFDCD9" w:sz="4"/>
+              <w:left w:val="single" w:color="CFDCD9" w:sz="4"/>
+              <w:bottom w:val="single" w:color="CFDCD9" w:sz="4"/>
+              <w:right w:val="single" w:color="CFDCD9" w:sz="4"/>
+            </w:tcBorders>
+            <w:shd w:fill="F5F9F8" w:color="auto" w:val="clear"/>
+            <w:tcMar>
+              <w:top w:type="dxa" w:w="50"/>
+              <w:left w:type="dxa" w:w="90"/>
+              <w:bottom w:type="dxa" w:w="50"/>
+              <w:right w:type="dxa" w:w="90"/>
+            </w:tcMar>
+          </w:tcPr>
+          <w:p>
+            <w:pPr>
+              <w:jc w:val="left"/>
+            </w:pPr>
+            <w:r>
+              <w:rPr>
+                <w:sz w:val="19"/>
+                <w:szCs w:val="19"/>
+              </w:rPr>
+              <w:t xml:space="preserve">Malick</w:t>
+            </w:r>
+          </w:p>
+        </w:tc>
+      </w:tr>
+      <w:tr>
+        <w:trPr>
+          <w:cantSplit/>
+        </w:trPr>
+        <w:tc>
+          <w:tcPr>
+            <w:tcW w:type="dxa" w:w="3019"/>
+            <w:tcBorders>
+              <w:top w:val="single" w:color="CFDCD9" w:sz="4"/>
+              <w:left w:val="single" w:color="CFDCD9" w:sz="4"/>
+              <w:bottom w:val="single" w:color="CFDCD9" w:sz="4"/>
+              <w:right w:val="single" w:color="CFDCD9" w:sz="4"/>
+            </w:tcBorders>
+            <w:tcMar>
+              <w:top w:type="dxa" w:w="50"/>
+              <w:left w:type="dxa" w:w="90"/>
+              <w:bottom w:type="dxa" w:w="50"/>
+              <w:right w:type="dxa" w:w="90"/>
+            </w:tcMar>
+          </w:tcPr>
+          <w:p>
+            <w:pPr>
+              <w:jc w:val="left"/>
+            </w:pPr>
+            <w:r>
+              <w:rPr>
+                <w:sz w:val="19"/>
+                <w:szCs w:val="19"/>
+              </w:rPr>
+              <w:t xml:space="preserve">Comparaison avant / après les ouvrages (§4)</w:t>
+            </w:r>
+          </w:p>
+        </w:tc>
+        <w:tc>
+          <w:tcPr>
+            <w:tcW w:type="dxa" w:w="5061"/>
+            <w:tcBorders>
+              <w:top w:val="single" w:color="CFDCD9" w:sz="4"/>
+              <w:left w:val="single" w:color="CFDCD9" w:sz="4"/>
+              <w:bottom w:val="single" w:color="CFDCD9" w:sz="4"/>
+              <w:right w:val="single" w:color="CFDCD9" w:sz="4"/>
+            </w:tcBorders>
+            <w:tcMar>
+              <w:top w:type="dxa" w:w="50"/>
+              <w:left w:type="dxa" w:w="90"/>
+              <w:bottom w:type="dxa" w:w="50"/>
+              <w:right w:type="dxa" w:w="90"/>
+            </w:tcMar>
+          </w:tcPr>
+          <w:p>
+            <w:pPr>
+              <w:jc w:val="left"/>
+            </w:pPr>
+            <w:r>
+              <w:rPr>
+                <w:sz w:val="19"/>
+                <w:szCs w:val="19"/>
+              </w:rPr>
+              <w:t xml:space="preserve">Effet de la digue de Guet Ndar</w:t>
+            </w:r>
+          </w:p>
+        </w:tc>
+        <w:tc>
+          <w:tcPr>
+            <w:tcW w:type="dxa" w:w="2012"/>
+            <w:tcBorders>
+              <w:top w:val="single" w:color="CFDCD9" w:sz="4"/>
+              <w:left w:val="single" w:color="CFDCD9" w:sz="4"/>
+              <w:bottom w:val="single" w:color="CFDCD9" w:sz="4"/>
+              <w:right w:val="single" w:color="CFDCD9" w:sz="4"/>
+            </w:tcBorders>
+            <w:tcMar>
+              <w:top w:type="dxa" w:w="50"/>
+              <w:left w:type="dxa" w:w="90"/>
+              <w:bottom w:type="dxa" w:w="50"/>
+              <w:right w:type="dxa" w:w="90"/>
+            </w:tcMar>
+          </w:tcPr>
+          <w:p>
+            <w:pPr>
+              <w:jc w:val="left"/>
+            </w:pPr>
+            <w:r>
+              <w:rPr>
+                <w:sz w:val="19"/>
+                <w:szCs w:val="19"/>
+              </w:rPr>
+              <w:t xml:space="preserve">Ndèye Fatou</w:t>
+            </w:r>
+          </w:p>
+        </w:tc>
+      </w:tr>
+      <w:tr>
+        <w:trPr>
+          <w:cantSplit/>
+        </w:trPr>
+        <w:tc>
+          <w:tcPr>
+            <w:tcW w:type="dxa" w:w="3019"/>
+            <w:tcBorders>
+              <w:top w:val="single" w:color="CFDCD9" w:sz="4"/>
+              <w:left w:val="single" w:color="CFDCD9" w:sz="4"/>
+              <w:bottom w:val="single" w:color="CFDCD9" w:sz="4"/>
+              <w:right w:val="single" w:color="CFDCD9" w:sz="4"/>
+            </w:tcBorders>
+            <w:shd w:fill="F5F9F8" w:color="auto" w:val="clear"/>
+            <w:tcMar>
+              <w:top w:type="dxa" w:w="50"/>
+              <w:left w:type="dxa" w:w="90"/>
+              <w:bottom w:type="dxa" w:w="50"/>
+              <w:right w:type="dxa" w:w="90"/>
+            </w:tcMar>
+          </w:tcPr>
+          <w:p>
+            <w:pPr>
+              <w:jc w:val="left"/>
+            </w:pPr>
+            <w:r>
+              <w:rPr>
+                <w:sz w:val="19"/>
+                <w:szCs w:val="19"/>
+              </w:rPr>
+              <w:t xml:space="preserve">QGIS (§8)</w:t>
+            </w:r>
+          </w:p>
+        </w:tc>
+        <w:tc>
+          <w:tcPr>
+            <w:tcW w:type="dxa" w:w="5061"/>
+            <w:tcBorders>
+              <w:top w:val="single" w:color="CFDCD9" w:sz="4"/>
+              <w:left w:val="single" w:color="CFDCD9" w:sz="4"/>
+              <w:bottom w:val="single" w:color="CFDCD9" w:sz="4"/>
+              <w:right w:val="single" w:color="CFDCD9" w:sz="4"/>
+            </w:tcBorders>
+            <w:shd w:fill="F5F9F8" w:color="auto" w:val="clear"/>
+            <w:tcMar>
+              <w:top w:type="dxa" w:w="50"/>
+              <w:left w:type="dxa" w:w="90"/>
+              <w:bottom w:type="dxa" w:w="50"/>
+              <w:right w:type="dxa" w:w="90"/>
+            </w:tcMar>
+          </w:tcPr>
+          <w:p>
+            <w:pPr>
+              <w:jc w:val="left"/>
+            </w:pPr>
+            <w:r>
+              <w:rPr>
+                <w:sz w:val="19"/>
+                <w:szCs w:val="19"/>
+              </w:rPr>
+              <w:t xml:space="preserve">Vérification visuelle des traits de côte et plan de secours</w:t>
+            </w:r>
+          </w:p>
+        </w:tc>
+        <w:tc>
+          <w:tcPr>
+            <w:tcW w:type="dxa" w:w="2012"/>
+            <w:tcBorders>
+              <w:top w:val="single" w:color="CFDCD9" w:sz="4"/>
+              <w:left w:val="single" w:color="CFDCD9" w:sz="4"/>
+              <w:bottom w:val="single" w:color="CFDCD9" w:sz="4"/>
+              <w:right w:val="single" w:color="CFDCD9" w:sz="4"/>
+            </w:tcBorders>
+            <w:shd w:fill="F5F9F8" w:color="auto" w:val="clear"/>
+            <w:tcMar>
+              <w:top w:type="dxa" w:w="50"/>
+              <w:left w:type="dxa" w:w="90"/>
+              <w:bottom w:type="dxa" w:w="50"/>
+              <w:right w:type="dxa" w:w="90"/>
+            </w:tcMar>
+          </w:tcPr>
+          <w:p>
+            <w:pPr>
+              <w:jc w:val="left"/>
+            </w:pPr>
+            <w:r>
+              <w:rPr>
+                <w:sz w:val="19"/>
+                <w:szCs w:val="19"/>
+              </w:rPr>
+              <w:t xml:space="preserve">Abdoulaye</w:t>
+            </w:r>
+          </w:p>
+        </w:tc>
+      </w:tr>
+      <w:tr>
+        <w:trPr>
+          <w:cantSplit/>
+        </w:trPr>
+        <w:tc>
+          <w:tcPr>
+            <w:tcW w:type="dxa" w:w="3019"/>
+            <w:tcBorders>
+              <w:top w:val="single" w:color="CFDCD9" w:sz="4"/>
+              <w:left w:val="single" w:color="CFDCD9" w:sz="4"/>
+              <w:bottom w:val="single" w:color="CFDCD9" w:sz="4"/>
+              <w:right w:val="single" w:color="CFDCD9" w:sz="4"/>
+            </w:tcBorders>
+            <w:tcMar>
+              <w:top w:type="dxa" w:w="50"/>
+              <w:left w:type="dxa" w:w="90"/>
+              <w:bottom w:type="dxa" w:w="50"/>
+              <w:right w:type="dxa" w:w="90"/>
+            </w:tcMar>
+          </w:tcPr>
+          <w:p>
+            <w:pPr>
+              <w:jc w:val="left"/>
+            </w:pPr>
+            <w:r>
+              <w:rPr>
+                <w:sz w:val="19"/>
+                <w:szCs w:val="19"/>
+              </w:rPr>
+              <w:t xml:space="preserve">Méthode reproductible, applicable à Rufisque, Bargny, Mbour, Joal, Casamance (§6)</w:t>
+            </w:r>
+          </w:p>
+        </w:tc>
+        <w:tc>
+          <w:tcPr>
+            <w:tcW w:type="dxa" w:w="5061"/>
+            <w:tcBorders>
+              <w:top w:val="single" w:color="CFDCD9" w:sz="4"/>
+              <w:left w:val="single" w:color="CFDCD9" w:sz="4"/>
+              <w:bottom w:val="single" w:color="CFDCD9" w:sz="4"/>
+              <w:right w:val="single" w:color="CFDCD9" w:sz="4"/>
+            </w:tcBorders>
+            <w:tcMar>
+              <w:top w:type="dxa" w:w="50"/>
+              <w:left w:type="dxa" w:w="90"/>
+              <w:bottom w:type="dxa" w:w="50"/>
+              <w:right w:type="dxa" w:w="90"/>
+            </w:tcMar>
+          </w:tcPr>
+          <w:p>
+            <w:pPr>
+              <w:jc w:val="left"/>
+            </w:pPr>
+            <w:r>
+              <w:rPr>
+                <w:sz w:val="19"/>
+                <w:szCs w:val="19"/>
+              </w:rPr>
+              <w:t xml:space="preserve">Tout le code sur GitHub ; on change seulement la zone d’étude</w:t>
+            </w:r>
+          </w:p>
+        </w:tc>
+        <w:tc>
+          <w:tcPr>
+            <w:tcW w:type="dxa" w:w="2012"/>
+            <w:tcBorders>
+              <w:top w:val="single" w:color="CFDCD9" w:sz="4"/>
+              <w:left w:val="single" w:color="CFDCD9" w:sz="4"/>
+              <w:bottom w:val="single" w:color="CFDCD9" w:sz="4"/>
+              <w:right w:val="single" w:color="CFDCD9" w:sz="4"/>
+            </w:tcBorders>
+            <w:tcMar>
+              <w:top w:type="dxa" w:w="50"/>
+              <w:left w:type="dxa" w:w="90"/>
+              <w:bottom w:type="dxa" w:w="50"/>
+              <w:right w:type="dxa" w:w="90"/>
+            </w:tcMar>
+          </w:tcPr>
+          <w:p>
+            <w:pPr>
+              <w:jc w:val="left"/>
+            </w:pPr>
+            <w:r>
+              <w:rPr>
+                <w:sz w:val="19"/>
+                <w:szCs w:val="19"/>
+              </w:rPr>
+              <w:t xml:space="preserve">Les trois</w:t>
+            </w:r>
+          </w:p>
+        </w:tc>
+      </w:tr>
+    </w:tbl>
+    <w:p>
+      <w:pPr>
+        <w:spacing w:after="60"/>
+      </w:pPr>
+    </w:p>
+    <w:p>
+      <w:pPr>
+        <w:pStyle w:val="Heading2"/>
+      </w:pPr>
+      <w:r>
+        <w:t xml:space="preserve">3. Rôles</w:t>
       </w:r>
     </w:p>
     <w:tbl>
@@ -1266,7 +3838,7 @@
                 <w:sz w:val="19"/>
                 <w:szCs w:val="19"/>
               </w:rPr>
-              <w:t xml:space="preserve">Images satellites et extraction du trait de côte (Google Earth Engine, CoastSat)</w:t>
+              <w:t xml:space="preserve">Images satellites (Google Earth Engine, CoastSat, Landsat), extraction du trait de côte, classification eau / sable par apprentissage automatique</w:t>
             </w:r>
           </w:p>
         </w:tc>
@@ -1295,7 +3867,7 @@
                 <w:sz w:val="19"/>
                 <w:szCs w:val="19"/>
               </w:rPr>
-              <w:t xml:space="preserve">traits_de_cote.geojson : une ligne par date, côté océan uniquement, colonne « date »</w:t>
+              <w:t xml:space="preserve">traits_de_cote.geojson : une ligne par date, côté océan uniquement, colonne « date » ; carte avant / après ; animation de la brèche</w:t>
             </w:r>
           </w:p>
         </w:tc>
@@ -1360,7 +3932,7 @@
                 <w:sz w:val="19"/>
                 <w:szCs w:val="19"/>
               </w:rPr>
-              <w:t xml:space="preserve">Coordination, analyse (transects, vitesses de recul, projections, exposition), relations avec SENSAT</w:t>
+              <w:t xml:space="preserve">Coordination, analyse (transects, vitesses de recul, projections, altitude, population, exposition, risque), Sentinel-1, effet de la digue, relations avec SENSAT</w:t>
             </w:r>
           </w:p>
         </w:tc>
@@ -1390,7 +3962,7 @@
                 <w:sz w:val="19"/>
                 <w:szCs w:val="19"/>
               </w:rPr>
-              <w:t xml:space="preserve">Les fichiers du dossier resultats/ (GeoJSON et CSV) et les chiffres clés</w:t>
+              <w:t xml:space="preserve">Les fichiers du dossier resultats/ (GeoJSON et CSV), les chiffres clés et le message audio en wolof</w:t>
             </w:r>
           </w:p>
         </w:tc>
@@ -1453,7 +4025,7 @@
                 <w:sz w:val="19"/>
                 <w:szCs w:val="19"/>
               </w:rPr>
-              <w:t xml:space="preserve">Tableau de bord web (React, Leaflet), vidéo de démonstration, mise en forme de la présentation</w:t>
+              <w:t xml:space="preserve">Tableau de bord web (React, Leaflet) lisible sur téléphone, version FR | WO, API, vidéo de démonstration, mise en forme de la présentation</w:t>
             </w:r>
           </w:p>
         </w:tc>
@@ -1482,7 +4054,7 @@
                 <w:sz w:val="19"/>
                 <w:szCs w:val="19"/>
               </w:rPr>
-              <w:t xml:space="preserve">Le lien du tableau de bord et la vidéo</w:t>
+              <w:t xml:space="preserve">Le lien du tableau de bord, l’API et la vidéo</w:t>
             </w:r>
           </w:p>
         </w:tc>
@@ -1498,7 +4070,7 @@
         <w:pStyle w:val="Heading2"/>
       </w:pPr>
       <w:r>
-        <w:t xml:space="preserve">3. Planning jour par jour</w:t>
+        <w:t xml:space="preserve">4. Planning jour par jour</w:t>
       </w:r>
     </w:p>
     <w:p>
@@ -1865,7 +4437,7 @@
                 <w:sz w:val="19"/>
                 <w:szCs w:val="19"/>
               </w:rPr>
-              <w:t xml:space="preserve">Lire la note d’orientation et adapter le plan ; lancer l’analyse dès réception des traits de côte</w:t>
+              <w:t xml:space="preserve">Lire la note d’orientation et adapter le plan ; demander les données de terrain à SENSAT, à TRL et à la mairie</w:t>
             </w:r>
           </w:p>
         </w:tc>
@@ -1895,7 +4467,7 @@
                 <w:sz w:val="19"/>
                 <w:szCs w:val="19"/>
               </w:rPr>
-              <w:t xml:space="preserve">22 h</w:t>
+              <w:t xml:space="preserve">12 h</w:t>
             </w:r>
           </w:p>
         </w:tc>
@@ -1929,6 +4501,193 @@
                 <w:sz w:val="19"/>
                 <w:szCs w:val="19"/>
               </w:rPr>
+              <w:t xml:space="preserve">Ndèye Fatou</w:t>
+            </w:r>
+          </w:p>
+        </w:tc>
+        <w:tc>
+          <w:tcPr>
+            <w:tcW w:type="dxa" w:w="6290"/>
+            <w:tcBorders>
+              <w:top w:val="single" w:color="CFDCD9" w:sz="4"/>
+              <w:left w:val="single" w:color="CFDCD9" w:sz="4"/>
+              <w:bottom w:val="single" w:color="CFDCD9" w:sz="4"/>
+              <w:right w:val="single" w:color="CFDCD9" w:sz="4"/>
+            </w:tcBorders>
+            <w:tcMar>
+              <w:top w:type="dxa" w:w="50"/>
+              <w:left w:type="dxa" w:w="90"/>
+              <w:bottom w:type="dxa" w:w="50"/>
+              <w:right w:type="dxa" w:w="90"/>
+            </w:tcMar>
+          </w:tcPr>
+          <w:p>
+            <w:pPr>
+              <w:jc w:val="left"/>
+            </w:pPr>
+            <w:r>
+              <w:rPr>
+                <w:sz w:val="19"/>
+                <w:szCs w:val="19"/>
+              </w:rPr>
+              <w:t xml:space="preserve">Télécharger l’altitude (Copernicus DEM), la population (WorldPop), les bâtiments Google Open Buildings ; vérification Sentinel-1 sur 2 ou 3 dates</w:t>
+            </w:r>
+          </w:p>
+        </w:tc>
+        <w:tc>
+          <w:tcPr>
+            <w:tcW w:type="dxa" w:w="1901"/>
+            <w:tcBorders>
+              <w:top w:val="single" w:color="CFDCD9" w:sz="4"/>
+              <w:left w:val="single" w:color="CFDCD9" w:sz="4"/>
+              <w:bottom w:val="single" w:color="CFDCD9" w:sz="4"/>
+              <w:right w:val="single" w:color="CFDCD9" w:sz="4"/>
+            </w:tcBorders>
+            <w:tcMar>
+              <w:top w:type="dxa" w:w="50"/>
+              <w:left w:type="dxa" w:w="90"/>
+              <w:bottom w:type="dxa" w:w="50"/>
+              <w:right w:type="dxa" w:w="90"/>
+            </w:tcMar>
+          </w:tcPr>
+          <w:p>
+            <w:pPr>
+              <w:jc w:val="left"/>
+            </w:pPr>
+            <w:r>
+              <w:rPr>
+                <w:sz w:val="19"/>
+                <w:szCs w:val="19"/>
+              </w:rPr>
+              <w:t xml:space="preserve">20 h</w:t>
+            </w:r>
+          </w:p>
+        </w:tc>
+      </w:tr>
+      <w:tr>
+        <w:trPr>
+          <w:cantSplit/>
+        </w:trPr>
+        <w:tc>
+          <w:tcPr>
+            <w:tcW w:type="dxa" w:w="1901"/>
+            <w:tcBorders>
+              <w:top w:val="single" w:color="CFDCD9" w:sz="4"/>
+              <w:left w:val="single" w:color="CFDCD9" w:sz="4"/>
+              <w:bottom w:val="single" w:color="CFDCD9" w:sz="4"/>
+              <w:right w:val="single" w:color="CFDCD9" w:sz="4"/>
+            </w:tcBorders>
+            <w:shd w:fill="F5F9F8" w:color="auto" w:val="clear"/>
+            <w:tcMar>
+              <w:top w:type="dxa" w:w="50"/>
+              <w:left w:type="dxa" w:w="90"/>
+              <w:bottom w:type="dxa" w:w="50"/>
+              <w:right w:type="dxa" w:w="90"/>
+            </w:tcMar>
+          </w:tcPr>
+          <w:p>
+            <w:pPr>
+              <w:jc w:val="left"/>
+            </w:pPr>
+            <w:r>
+              <w:rPr>
+                <w:sz w:val="19"/>
+                <w:szCs w:val="19"/>
+              </w:rPr>
+              <w:t xml:space="preserve">Ndèye Fatou</w:t>
+            </w:r>
+          </w:p>
+        </w:tc>
+        <w:tc>
+          <w:tcPr>
+            <w:tcW w:type="dxa" w:w="6290"/>
+            <w:tcBorders>
+              <w:top w:val="single" w:color="CFDCD9" w:sz="4"/>
+              <w:left w:val="single" w:color="CFDCD9" w:sz="4"/>
+              <w:bottom w:val="single" w:color="CFDCD9" w:sz="4"/>
+              <w:right w:val="single" w:color="CFDCD9" w:sz="4"/>
+            </w:tcBorders>
+            <w:shd w:fill="F5F9F8" w:color="auto" w:val="clear"/>
+            <w:tcMar>
+              <w:top w:type="dxa" w:w="50"/>
+              <w:left w:type="dxa" w:w="90"/>
+              <w:bottom w:type="dxa" w:w="50"/>
+              <w:right w:type="dxa" w:w="90"/>
+            </w:tcMar>
+          </w:tcPr>
+          <w:p>
+            <w:pPr>
+              <w:jc w:val="left"/>
+            </w:pPr>
+            <w:r>
+              <w:rPr>
+                <w:sz w:val="19"/>
+                <w:szCs w:val="19"/>
+              </w:rPr>
+              <w:t xml:space="preserve">Lancer l’analyse dès réception des traits de côte</w:t>
+            </w:r>
+          </w:p>
+        </w:tc>
+        <w:tc>
+          <w:tcPr>
+            <w:tcW w:type="dxa" w:w="1901"/>
+            <w:tcBorders>
+              <w:top w:val="single" w:color="CFDCD9" w:sz="4"/>
+              <w:left w:val="single" w:color="CFDCD9" w:sz="4"/>
+              <w:bottom w:val="single" w:color="CFDCD9" w:sz="4"/>
+              <w:right w:val="single" w:color="CFDCD9" w:sz="4"/>
+            </w:tcBorders>
+            <w:shd w:fill="F5F9F8" w:color="auto" w:val="clear"/>
+            <w:tcMar>
+              <w:top w:type="dxa" w:w="50"/>
+              <w:left w:type="dxa" w:w="90"/>
+              <w:bottom w:type="dxa" w:w="50"/>
+              <w:right w:type="dxa" w:w="90"/>
+            </w:tcMar>
+          </w:tcPr>
+          <w:p>
+            <w:pPr>
+              <w:jc w:val="left"/>
+            </w:pPr>
+            <w:r>
+              <w:rPr>
+                <w:sz w:val="19"/>
+                <w:szCs w:val="19"/>
+              </w:rPr>
+              <w:t xml:space="preserve">22 h</w:t>
+            </w:r>
+          </w:p>
+        </w:tc>
+      </w:tr>
+      <w:tr>
+        <w:trPr>
+          <w:cantSplit/>
+        </w:trPr>
+        <w:tc>
+          <w:tcPr>
+            <w:tcW w:type="dxa" w:w="1901"/>
+            <w:tcBorders>
+              <w:top w:val="single" w:color="CFDCD9" w:sz="4"/>
+              <w:left w:val="single" w:color="CFDCD9" w:sz="4"/>
+              <w:bottom w:val="single" w:color="CFDCD9" w:sz="4"/>
+              <w:right w:val="single" w:color="CFDCD9" w:sz="4"/>
+            </w:tcBorders>
+            <w:tcMar>
+              <w:top w:type="dxa" w:w="50"/>
+              <w:left w:type="dxa" w:w="90"/>
+              <w:bottom w:type="dxa" w:w="50"/>
+              <w:right w:type="dxa" w:w="90"/>
+            </w:tcMar>
+          </w:tcPr>
+          <w:p>
+            <w:pPr>
+              <w:jc w:val="left"/>
+            </w:pPr>
+            <w:r>
+              <w:rPr>
+                <w:sz w:val="19"/>
+                <w:szCs w:val="19"/>
+              </w:rPr>
               <w:t xml:space="preserve">Malick</w:t>
             </w:r>
           </w:p>
@@ -1958,7 +4717,7 @@
                 <w:sz w:val="19"/>
                 <w:szCs w:val="19"/>
               </w:rPr>
-              <w:t xml:space="preserve">Afficher sur la carte les fichiers de test (transects colorés selon le risque, bande menacée)</w:t>
+              <w:t xml:space="preserve">Afficher sur la carte les fichiers de test (transects colorés selon le risque, bande menacée) ; affichage correct sur téléphone</w:t>
             </w:r>
           </w:p>
         </w:tc>
@@ -1988,6 +4747,101 @@
                 <w:szCs w:val="19"/>
               </w:rPr>
               <w:t xml:space="preserve">20 h</w:t>
+            </w:r>
+          </w:p>
+        </w:tc>
+      </w:tr>
+      <w:tr>
+        <w:trPr>
+          <w:cantSplit/>
+        </w:trPr>
+        <w:tc>
+          <w:tcPr>
+            <w:tcW w:type="dxa" w:w="1901"/>
+            <w:tcBorders>
+              <w:top w:val="single" w:color="CFDCD9" w:sz="4"/>
+              <w:left w:val="single" w:color="CFDCD9" w:sz="4"/>
+              <w:bottom w:val="single" w:color="CFDCD9" w:sz="4"/>
+              <w:right w:val="single" w:color="CFDCD9" w:sz="4"/>
+            </w:tcBorders>
+            <w:shd w:fill="F5F9F8" w:color="auto" w:val="clear"/>
+            <w:tcMar>
+              <w:top w:type="dxa" w:w="50"/>
+              <w:left w:type="dxa" w:w="90"/>
+              <w:bottom w:type="dxa" w:w="50"/>
+              <w:right w:type="dxa" w:w="90"/>
+            </w:tcMar>
+          </w:tcPr>
+          <w:p>
+            <w:pPr>
+              <w:jc w:val="left"/>
+            </w:pPr>
+            <w:r>
+              <w:rPr>
+                <w:sz w:val="19"/>
+                <w:szCs w:val="19"/>
+              </w:rPr>
+              <w:t xml:space="preserve">Malick</w:t>
+            </w:r>
+          </w:p>
+        </w:tc>
+        <w:tc>
+          <w:tcPr>
+            <w:tcW w:type="dxa" w:w="6290"/>
+            <w:tcBorders>
+              <w:top w:val="single" w:color="CFDCD9" w:sz="4"/>
+              <w:left w:val="single" w:color="CFDCD9" w:sz="4"/>
+              <w:bottom w:val="single" w:color="CFDCD9" w:sz="4"/>
+              <w:right w:val="single" w:color="CFDCD9" w:sz="4"/>
+            </w:tcBorders>
+            <w:shd w:fill="F5F9F8" w:color="auto" w:val="clear"/>
+            <w:tcMar>
+              <w:top w:type="dxa" w:w="50"/>
+              <w:left w:type="dxa" w:w="90"/>
+              <w:bottom w:type="dxa" w:w="50"/>
+              <w:right w:type="dxa" w:w="90"/>
+            </w:tcMar>
+          </w:tcPr>
+          <w:p>
+            <w:pPr>
+              <w:jc w:val="left"/>
+            </w:pPr>
+            <w:r>
+              <w:rPr>
+                <w:sz w:val="19"/>
+                <w:szCs w:val="19"/>
+              </w:rPr>
+              <w:t xml:space="preserve">Petite API FastAPI qui renvoie les fichiers de résultats</w:t>
+            </w:r>
+          </w:p>
+        </w:tc>
+        <w:tc>
+          <w:tcPr>
+            <w:tcW w:type="dxa" w:w="1901"/>
+            <w:tcBorders>
+              <w:top w:val="single" w:color="CFDCD9" w:sz="4"/>
+              <w:left w:val="single" w:color="CFDCD9" w:sz="4"/>
+              <w:bottom w:val="single" w:color="CFDCD9" w:sz="4"/>
+              <w:right w:val="single" w:color="CFDCD9" w:sz="4"/>
+            </w:tcBorders>
+            <w:shd w:fill="F5F9F8" w:color="auto" w:val="clear"/>
+            <w:tcMar>
+              <w:top w:type="dxa" w:w="50"/>
+              <w:left w:type="dxa" w:w="90"/>
+              <w:bottom w:type="dxa" w:w="50"/>
+              <w:right w:type="dxa" w:w="90"/>
+            </w:tcMar>
+          </w:tcPr>
+          <w:p>
+            <w:pPr>
+              <w:jc w:val="left"/>
+            </w:pPr>
+            <w:r>
+              <w:rPr>
+                <w:sz w:val="19"/>
+                <w:szCs w:val="19"/>
+              </w:rPr>
+              <w:t xml:space="preserve">22 h</w:t>
             </w:r>
           </w:p>
         </w:tc>
@@ -2180,7 +5034,7 @@
                 <w:sz w:val="19"/>
                 <w:szCs w:val="19"/>
               </w:rPr>
-              <w:t xml:space="preserve">Vérifier les résultats (valeurs aberrantes, R²), ajuster les seuils de risque, produire les chiffres clés par quartier</w:t>
+              <w:t xml:space="preserve">Vérifier les résultats (valeurs aberrantes, R²) ; carte de risque (vitesse, altitude, habitants) ; chiffres clés par quartier (bâtiments, habitants, équipements)</w:t>
             </w:r>
           </w:p>
         </w:tc>
@@ -2244,7 +5098,7 @@
                 <w:sz w:val="19"/>
                 <w:szCs w:val="19"/>
               </w:rPr>
-              <w:t xml:space="preserve">Abdoulaye</w:t>
+              <w:t xml:space="preserve">Ndèye Fatou</w:t>
             </w:r>
           </w:p>
         </w:tc>
@@ -2274,7 +5128,7 @@
                 <w:sz w:val="19"/>
                 <w:szCs w:val="19"/>
               </w:rPr>
-              <w:t xml:space="preserve">Carte avant / après et animation de la brèche depuis 2003 (Landsat)</w:t>
+              <w:t xml:space="preserve">Effet de la digue de Guet Ndar : recul avant et après 2021–2022</w:t>
             </w:r>
           </w:p>
         </w:tc>
@@ -2338,7 +5192,7 @@
                 <w:sz w:val="19"/>
                 <w:szCs w:val="19"/>
               </w:rPr>
-              <w:t xml:space="preserve">Malick</w:t>
+              <w:t xml:space="preserve">Abdoulaye</w:t>
             </w:r>
           </w:p>
         </w:tc>
@@ -2367,7 +5221,7 @@
                 <w:sz w:val="19"/>
                 <w:szCs w:val="19"/>
               </w:rPr>
-              <w:t xml:space="preserve">Brancher les vrais résultats sur le tableau de bord, fiche détaillée de chaque tronçon</w:t>
+              <w:t xml:space="preserve">Carte avant / après et animation de la brèche depuis 2003 (Landsat)</w:t>
             </w:r>
           </w:p>
         </w:tc>
@@ -2396,7 +5250,7 @@
                 <w:sz w:val="19"/>
                 <w:szCs w:val="19"/>
               </w:rPr>
-              <w:t xml:space="preserve">20 h</w:t>
+              <w:t xml:space="preserve">16 h</w:t>
             </w:r>
           </w:p>
         </w:tc>
@@ -2431,6 +5285,193 @@
                 <w:sz w:val="19"/>
                 <w:szCs w:val="19"/>
               </w:rPr>
+              <w:t xml:space="preserve">Abdoulaye</w:t>
+            </w:r>
+          </w:p>
+        </w:tc>
+        <w:tc>
+          <w:tcPr>
+            <w:tcW w:type="dxa" w:w="6290"/>
+            <w:tcBorders>
+              <w:top w:val="single" w:color="CFDCD9" w:sz="4"/>
+              <w:left w:val="single" w:color="CFDCD9" w:sz="4"/>
+              <w:bottom w:val="single" w:color="CFDCD9" w:sz="4"/>
+              <w:right w:val="single" w:color="CFDCD9" w:sz="4"/>
+            </w:tcBorders>
+            <w:shd w:fill="F5F9F8" w:color="auto" w:val="clear"/>
+            <w:tcMar>
+              <w:top w:type="dxa" w:w="50"/>
+              <w:left w:type="dxa" w:w="90"/>
+              <w:bottom w:type="dxa" w:w="50"/>
+              <w:right w:type="dxa" w:w="90"/>
+            </w:tcMar>
+          </w:tcPr>
+          <w:p>
+            <w:pPr>
+              <w:jc w:val="left"/>
+            </w:pPr>
+            <w:r>
+              <w:rPr>
+                <w:sz w:val="19"/>
+                <w:szCs w:val="19"/>
+              </w:rPr>
+              <w:t xml:space="preserve">Classification eau / sable par apprentissage automatique, comparée au seuil d’Otsu</w:t>
+            </w:r>
+          </w:p>
+        </w:tc>
+        <w:tc>
+          <w:tcPr>
+            <w:tcW w:type="dxa" w:w="1901"/>
+            <w:tcBorders>
+              <w:top w:val="single" w:color="CFDCD9" w:sz="4"/>
+              <w:left w:val="single" w:color="CFDCD9" w:sz="4"/>
+              <w:bottom w:val="single" w:color="CFDCD9" w:sz="4"/>
+              <w:right w:val="single" w:color="CFDCD9" w:sz="4"/>
+            </w:tcBorders>
+            <w:shd w:fill="F5F9F8" w:color="auto" w:val="clear"/>
+            <w:tcMar>
+              <w:top w:type="dxa" w:w="50"/>
+              <w:left w:type="dxa" w:w="90"/>
+              <w:bottom w:type="dxa" w:w="50"/>
+              <w:right w:type="dxa" w:w="90"/>
+            </w:tcMar>
+          </w:tcPr>
+          <w:p>
+            <w:pPr>
+              <w:jc w:val="left"/>
+            </w:pPr>
+            <w:r>
+              <w:rPr>
+                <w:sz w:val="19"/>
+                <w:szCs w:val="19"/>
+              </w:rPr>
+              <w:t xml:space="preserve">20 h</w:t>
+            </w:r>
+          </w:p>
+        </w:tc>
+      </w:tr>
+      <w:tr>
+        <w:trPr>
+          <w:cantSplit/>
+        </w:trPr>
+        <w:tc>
+          <w:tcPr>
+            <w:tcW w:type="dxa" w:w="1901"/>
+            <w:tcBorders>
+              <w:top w:val="single" w:color="CFDCD9" w:sz="4"/>
+              <w:left w:val="single" w:color="CFDCD9" w:sz="4"/>
+              <w:bottom w:val="single" w:color="CFDCD9" w:sz="4"/>
+              <w:right w:val="single" w:color="CFDCD9" w:sz="4"/>
+            </w:tcBorders>
+            <w:tcMar>
+              <w:top w:type="dxa" w:w="50"/>
+              <w:left w:type="dxa" w:w="90"/>
+              <w:bottom w:type="dxa" w:w="50"/>
+              <w:right w:type="dxa" w:w="90"/>
+            </w:tcMar>
+          </w:tcPr>
+          <w:p>
+            <w:pPr>
+              <w:jc w:val="left"/>
+            </w:pPr>
+            <w:r>
+              <w:rPr>
+                <w:sz w:val="19"/>
+                <w:szCs w:val="19"/>
+              </w:rPr>
+              <w:t xml:space="preserve">Malick</w:t>
+            </w:r>
+          </w:p>
+        </w:tc>
+        <w:tc>
+          <w:tcPr>
+            <w:tcW w:type="dxa" w:w="6290"/>
+            <w:tcBorders>
+              <w:top w:val="single" w:color="CFDCD9" w:sz="4"/>
+              <w:left w:val="single" w:color="CFDCD9" w:sz="4"/>
+              <w:bottom w:val="single" w:color="CFDCD9" w:sz="4"/>
+              <w:right w:val="single" w:color="CFDCD9" w:sz="4"/>
+            </w:tcBorders>
+            <w:tcMar>
+              <w:top w:type="dxa" w:w="50"/>
+              <w:left w:type="dxa" w:w="90"/>
+              <w:bottom w:type="dxa" w:w="50"/>
+              <w:right w:type="dxa" w:w="90"/>
+            </w:tcMar>
+          </w:tcPr>
+          <w:p>
+            <w:pPr>
+              <w:jc w:val="left"/>
+            </w:pPr>
+            <w:r>
+              <w:rPr>
+                <w:sz w:val="19"/>
+                <w:szCs w:val="19"/>
+              </w:rPr>
+              <w:t xml:space="preserve">Brancher les vrais résultats sur le tableau de bord ; fiche de chaque tronçon (historique, vitesse, risque, ce qui est exposé) ; bouton FR | WO</w:t>
+            </w:r>
+          </w:p>
+        </w:tc>
+        <w:tc>
+          <w:tcPr>
+            <w:tcW w:type="dxa" w:w="1901"/>
+            <w:tcBorders>
+              <w:top w:val="single" w:color="CFDCD9" w:sz="4"/>
+              <w:left w:val="single" w:color="CFDCD9" w:sz="4"/>
+              <w:bottom w:val="single" w:color="CFDCD9" w:sz="4"/>
+              <w:right w:val="single" w:color="CFDCD9" w:sz="4"/>
+            </w:tcBorders>
+            <w:tcMar>
+              <w:top w:type="dxa" w:w="50"/>
+              <w:left w:type="dxa" w:w="90"/>
+              <w:bottom w:type="dxa" w:w="50"/>
+              <w:right w:type="dxa" w:w="90"/>
+            </w:tcMar>
+          </w:tcPr>
+          <w:p>
+            <w:pPr>
+              <w:jc w:val="left"/>
+            </w:pPr>
+            <w:r>
+              <w:rPr>
+                <w:sz w:val="19"/>
+                <w:szCs w:val="19"/>
+              </w:rPr>
+              <w:t xml:space="preserve">20 h</w:t>
+            </w:r>
+          </w:p>
+        </w:tc>
+      </w:tr>
+      <w:tr>
+        <w:trPr>
+          <w:cantSplit/>
+        </w:trPr>
+        <w:tc>
+          <w:tcPr>
+            <w:tcW w:type="dxa" w:w="1901"/>
+            <w:tcBorders>
+              <w:top w:val="single" w:color="CFDCD9" w:sz="4"/>
+              <w:left w:val="single" w:color="CFDCD9" w:sz="4"/>
+              <w:bottom w:val="single" w:color="CFDCD9" w:sz="4"/>
+              <w:right w:val="single" w:color="CFDCD9" w:sz="4"/>
+            </w:tcBorders>
+            <w:shd w:fill="F5F9F8" w:color="auto" w:val="clear"/>
+            <w:tcMar>
+              <w:top w:type="dxa" w:w="50"/>
+              <w:left w:type="dxa" w:w="90"/>
+              <w:bottom w:type="dxa" w:w="50"/>
+              <w:right w:type="dxa" w:w="90"/>
+            </w:tcMar>
+          </w:tcPr>
+          <w:p>
+            <w:pPr>
+              <w:jc w:val="left"/>
+            </w:pPr>
+            <w:r>
+              <w:rPr>
+                <w:sz w:val="19"/>
+                <w:szCs w:val="19"/>
+              </w:rPr>
               <w:t xml:space="preserve">Les trois</w:t>
             </w:r>
           </w:p>
@@ -2461,6 +5502,99 @@
                 <w:sz w:val="19"/>
                 <w:szCs w:val="19"/>
               </w:rPr>
+              <w:t xml:space="preserve">Traduire et corriger en wolof les mots de la carte (environ 20)</w:t>
+            </w:r>
+          </w:p>
+        </w:tc>
+        <w:tc>
+          <w:tcPr>
+            <w:tcW w:type="dxa" w:w="1901"/>
+            <w:tcBorders>
+              <w:top w:val="single" w:color="CFDCD9" w:sz="4"/>
+              <w:left w:val="single" w:color="CFDCD9" w:sz="4"/>
+              <w:bottom w:val="single" w:color="CFDCD9" w:sz="4"/>
+              <w:right w:val="single" w:color="CFDCD9" w:sz="4"/>
+            </w:tcBorders>
+            <w:shd w:fill="F5F9F8" w:color="auto" w:val="clear"/>
+            <w:tcMar>
+              <w:top w:type="dxa" w:w="50"/>
+              <w:left w:type="dxa" w:w="90"/>
+              <w:bottom w:type="dxa" w:w="50"/>
+              <w:right w:type="dxa" w:w="90"/>
+            </w:tcMar>
+          </w:tcPr>
+          <w:p>
+            <w:pPr>
+              <w:jc w:val="left"/>
+            </w:pPr>
+            <w:r>
+              <w:rPr>
+                <w:sz w:val="19"/>
+                <w:szCs w:val="19"/>
+              </w:rPr>
+              <w:t xml:space="preserve">21 h</w:t>
+            </w:r>
+          </w:p>
+        </w:tc>
+      </w:tr>
+      <w:tr>
+        <w:trPr>
+          <w:cantSplit/>
+        </w:trPr>
+        <w:tc>
+          <w:tcPr>
+            <w:tcW w:type="dxa" w:w="1901"/>
+            <w:tcBorders>
+              <w:top w:val="single" w:color="CFDCD9" w:sz="4"/>
+              <w:left w:val="single" w:color="CFDCD9" w:sz="4"/>
+              <w:bottom w:val="single" w:color="CFDCD9" w:sz="4"/>
+              <w:right w:val="single" w:color="CFDCD9" w:sz="4"/>
+            </w:tcBorders>
+            <w:tcMar>
+              <w:top w:type="dxa" w:w="50"/>
+              <w:left w:type="dxa" w:w="90"/>
+              <w:bottom w:type="dxa" w:w="50"/>
+              <w:right w:type="dxa" w:w="90"/>
+            </w:tcMar>
+          </w:tcPr>
+          <w:p>
+            <w:pPr>
+              <w:jc w:val="left"/>
+            </w:pPr>
+            <w:r>
+              <w:rPr>
+                <w:sz w:val="19"/>
+                <w:szCs w:val="19"/>
+              </w:rPr>
+              <w:t xml:space="preserve">Les trois</w:t>
+            </w:r>
+          </w:p>
+        </w:tc>
+        <w:tc>
+          <w:tcPr>
+            <w:tcW w:type="dxa" w:w="6290"/>
+            <w:tcBorders>
+              <w:top w:val="single" w:color="CFDCD9" w:sz="4"/>
+              <w:left w:val="single" w:color="CFDCD9" w:sz="4"/>
+              <w:bottom w:val="single" w:color="CFDCD9" w:sz="4"/>
+              <w:right w:val="single" w:color="CFDCD9" w:sz="4"/>
+            </w:tcBorders>
+            <w:tcMar>
+              <w:top w:type="dxa" w:w="50"/>
+              <w:left w:type="dxa" w:w="90"/>
+              <w:bottom w:type="dxa" w:w="50"/>
+              <w:right w:type="dxa" w:w="90"/>
+            </w:tcMar>
+          </w:tcPr>
+          <w:p>
+            <w:pPr>
+              <w:jc w:val="left"/>
+            </w:pPr>
+            <w:r>
+              <w:rPr>
+                <w:sz w:val="19"/>
+                <w:szCs w:val="19"/>
+              </w:rPr>
               <w:t xml:space="preserve">Premier brouillon de la présentation</w:t>
             </w:r>
           </w:p>
@@ -2474,7 +5608,6 @@
               <w:bottom w:val="single" w:color="CFDCD9" w:sz="4"/>
               <w:right w:val="single" w:color="CFDCD9" w:sz="4"/>
             </w:tcBorders>
-            <w:shd w:fill="F5F9F8" w:color="auto" w:val="clear"/>
             <w:tcMar>
               <w:top w:type="dxa" w:w="50"/>
               <w:left w:type="dxa" w:w="90"/>
@@ -2655,7 +5788,7 @@
                 <w:sz w:val="19"/>
                 <w:szCs w:val="19"/>
               </w:rPr>
-              <w:t xml:space="preserve">Malick</w:t>
+              <w:t xml:space="preserve">Ndèye Fatou</w:t>
             </w:r>
           </w:p>
         </w:tc>
@@ -2684,7 +5817,7 @@
                 <w:sz w:val="19"/>
                 <w:szCs w:val="19"/>
               </w:rPr>
-              <w:t xml:space="preserve">Finaliser le tableau de bord, enregistrer la vidéo de démonstration</w:t>
+              <w:t xml:space="preserve">Enregistrer le message audio en wolof (30 secondes)</w:t>
             </w:r>
           </w:p>
         </w:tc>
@@ -2713,7 +5846,7 @@
                 <w:sz w:val="19"/>
                 <w:szCs w:val="19"/>
               </w:rPr>
-              <w:t xml:space="preserve">14 h</w:t>
+              <w:t xml:space="preserve">12 h</w:t>
             </w:r>
           </w:p>
         </w:tc>
@@ -2748,7 +5881,7 @@
                 <w:sz w:val="19"/>
                 <w:szCs w:val="19"/>
               </w:rPr>
-              <w:t xml:space="preserve">Ndèye Fatou</w:t>
+              <w:t xml:space="preserve">Malick</w:t>
             </w:r>
           </w:p>
         </w:tc>
@@ -2778,7 +5911,7 @@
                 <w:sz w:val="19"/>
                 <w:szCs w:val="19"/>
               </w:rPr>
-              <w:t xml:space="preserve">Finaliser les diapositives et relire tous les chiffres</w:t>
+              <w:t xml:space="preserve">Finaliser le tableau de bord, enregistrer la vidéo de démonstration</w:t>
             </w:r>
           </w:p>
         </w:tc>
@@ -2808,7 +5941,7 @@
                 <w:sz w:val="19"/>
                 <w:szCs w:val="19"/>
               </w:rPr>
-              <w:t xml:space="preserve">17 h</w:t>
+              <w:t xml:space="preserve">14 h</w:t>
             </w:r>
           </w:p>
         </w:tc>
@@ -2842,7 +5975,7 @@
                 <w:sz w:val="19"/>
                 <w:szCs w:val="19"/>
               </w:rPr>
-              <w:t xml:space="preserve">Les trois</w:t>
+              <w:t xml:space="preserve">Ndèye Fatou</w:t>
             </w:r>
           </w:p>
         </w:tc>
@@ -2871,7 +6004,7 @@
                 <w:sz w:val="19"/>
                 <w:szCs w:val="19"/>
               </w:rPr>
-              <w:t xml:space="preserve">Répétition complète avec un minuteur</w:t>
+              <w:t xml:space="preserve">Finaliser les diapositives, relire tous les chiffres, cocher chaque promesse du tableau de la section 2</w:t>
             </w:r>
           </w:p>
         </w:tc>
@@ -2900,7 +6033,7 @@
                 <w:sz w:val="19"/>
                 <w:szCs w:val="19"/>
               </w:rPr>
-              <w:t xml:space="preserve">19 h</w:t>
+              <w:t xml:space="preserve">17 h</w:t>
             </w:r>
           </w:p>
         </w:tc>
@@ -2935,6 +6068,100 @@
                 <w:sz w:val="19"/>
                 <w:szCs w:val="19"/>
               </w:rPr>
+              <w:t xml:space="preserve">Les trois</w:t>
+            </w:r>
+          </w:p>
+        </w:tc>
+        <w:tc>
+          <w:tcPr>
+            <w:tcW w:type="dxa" w:w="6290"/>
+            <w:tcBorders>
+              <w:top w:val="single" w:color="CFDCD9" w:sz="4"/>
+              <w:left w:val="single" w:color="CFDCD9" w:sz="4"/>
+              <w:bottom w:val="single" w:color="CFDCD9" w:sz="4"/>
+              <w:right w:val="single" w:color="CFDCD9" w:sz="4"/>
+            </w:tcBorders>
+            <w:shd w:fill="F5F9F8" w:color="auto" w:val="clear"/>
+            <w:tcMar>
+              <w:top w:type="dxa" w:w="50"/>
+              <w:left w:type="dxa" w:w="90"/>
+              <w:bottom w:type="dxa" w:w="50"/>
+              <w:right w:type="dxa" w:w="90"/>
+            </w:tcMar>
+          </w:tcPr>
+          <w:p>
+            <w:pPr>
+              <w:jc w:val="left"/>
+            </w:pPr>
+            <w:r>
+              <w:rPr>
+                <w:sz w:val="19"/>
+                <w:szCs w:val="19"/>
+              </w:rPr>
+              <w:t xml:space="preserve">Répétition complète avec un minuteur</w:t>
+            </w:r>
+          </w:p>
+        </w:tc>
+        <w:tc>
+          <w:tcPr>
+            <w:tcW w:type="dxa" w:w="1901"/>
+            <w:tcBorders>
+              <w:top w:val="single" w:color="CFDCD9" w:sz="4"/>
+              <w:left w:val="single" w:color="CFDCD9" w:sz="4"/>
+              <w:bottom w:val="single" w:color="CFDCD9" w:sz="4"/>
+              <w:right w:val="single" w:color="CFDCD9" w:sz="4"/>
+            </w:tcBorders>
+            <w:shd w:fill="F5F9F8" w:color="auto" w:val="clear"/>
+            <w:tcMar>
+              <w:top w:type="dxa" w:w="50"/>
+              <w:left w:type="dxa" w:w="90"/>
+              <w:bottom w:type="dxa" w:w="50"/>
+              <w:right w:type="dxa" w:w="90"/>
+            </w:tcMar>
+          </w:tcPr>
+          <w:p>
+            <w:pPr>
+              <w:jc w:val="left"/>
+            </w:pPr>
+            <w:r>
+              <w:rPr>
+                <w:sz w:val="19"/>
+                <w:szCs w:val="19"/>
+              </w:rPr>
+              <w:t xml:space="preserve">19 h</w:t>
+            </w:r>
+          </w:p>
+        </w:tc>
+      </w:tr>
+      <w:tr>
+        <w:trPr>
+          <w:cantSplit/>
+        </w:trPr>
+        <w:tc>
+          <w:tcPr>
+            <w:tcW w:type="dxa" w:w="1901"/>
+            <w:tcBorders>
+              <w:top w:val="single" w:color="CFDCD9" w:sz="4"/>
+              <w:left w:val="single" w:color="CFDCD9" w:sz="4"/>
+              <w:bottom w:val="single" w:color="CFDCD9" w:sz="4"/>
+              <w:right w:val="single" w:color="CFDCD9" w:sz="4"/>
+            </w:tcBorders>
+            <w:tcMar>
+              <w:top w:type="dxa" w:w="50"/>
+              <w:left w:type="dxa" w:w="90"/>
+              <w:bottom w:type="dxa" w:w="50"/>
+              <w:right w:type="dxa" w:w="90"/>
+            </w:tcMar>
+          </w:tcPr>
+          <w:p>
+            <w:pPr>
+              <w:jc w:val="left"/>
+            </w:pPr>
+            <w:r>
+              <w:rPr>
+                <w:sz w:val="19"/>
+                <w:szCs w:val="19"/>
+              </w:rPr>
               <w:t xml:space="preserve">Ndèye Fatou</w:t>
             </w:r>
           </w:p>
@@ -2948,7 +6175,6 @@
               <w:bottom w:val="single" w:color="CFDCD9" w:sz="4"/>
               <w:right w:val="single" w:color="CFDCD9" w:sz="4"/>
             </w:tcBorders>
-            <w:shd w:fill="F5F9F8" w:color="auto" w:val="clear"/>
             <w:tcMar>
               <w:top w:type="dxa" w:w="50"/>
               <w:left w:type="dxa" w:w="90"/>
@@ -2980,7 +6206,6 @@
               <w:bottom w:val="single" w:color="CFDCD9" w:sz="4"/>
               <w:right w:val="single" w:color="CFDCD9" w:sz="4"/>
             </w:tcBorders>
-            <w:shd w:fill="F5F9F8" w:color="auto" w:val="clear"/>
             <w:tcMar>
               <w:top w:type="dxa" w:w="50"/>
               <w:left w:type="dxa" w:w="90"/>
@@ -3022,7 +6247,7 @@
         <w:pStyle w:val="Heading2"/>
       </w:pPr>
       <w:r>
-        <w:t xml:space="preserve">4. Échanges entre nous</w:t>
+        <w:t xml:space="preserve">5. Échanges entre nous</w:t>
       </w:r>
     </w:p>
     <w:p>
@@ -3106,7 +6331,7 @@
         <w:pStyle w:val="Heading2"/>
       </w:pPr>
       <w:r>
-        <w:t xml:space="preserve">5. Plan de secours</w:t>
+        <w:t xml:space="preserve">6. Plan de secours</w:t>
       </w:r>
     </w:p>
     <w:tbl>
@@ -3509,6 +6734,134 @@
           </w:p>
         </w:tc>
       </w:tr>
+      <w:tr>
+        <w:trPr>
+          <w:cantSplit/>
+        </w:trPr>
+        <w:tc>
+          <w:tcPr>
+            <w:tcW w:type="dxa" w:w="4025"/>
+            <w:tcBorders>
+              <w:top w:val="single" w:color="CFDCD9" w:sz="4"/>
+              <w:left w:val="single" w:color="CFDCD9" w:sz="4"/>
+              <w:bottom w:val="single" w:color="CFDCD9" w:sz="4"/>
+              <w:right w:val="single" w:color="CFDCD9" w:sz="4"/>
+            </w:tcBorders>
+            <w:shd w:fill="F5F9F8" w:color="auto" w:val="clear"/>
+            <w:tcMar>
+              <w:top w:type="dxa" w:w="50"/>
+              <w:left w:type="dxa" w:w="90"/>
+              <w:bottom w:type="dxa" w:w="50"/>
+              <w:right w:type="dxa" w:w="90"/>
+            </w:tcMar>
+          </w:tcPr>
+          <w:p>
+            <w:pPr>
+              <w:jc w:val="left"/>
+            </w:pPr>
+            <w:r>
+              <w:rPr>
+                <w:sz w:val="19"/>
+                <w:szCs w:val="19"/>
+              </w:rPr>
+              <w:t xml:space="preserve">La population WorldPop est trop imprécise à l’échelle du quartier</w:t>
+            </w:r>
+          </w:p>
+        </w:tc>
+        <w:tc>
+          <w:tcPr>
+            <w:tcW w:type="dxa" w:w="6067"/>
+            <w:tcBorders>
+              <w:top w:val="single" w:color="CFDCD9" w:sz="4"/>
+              <w:left w:val="single" w:color="CFDCD9" w:sz="4"/>
+              <w:bottom w:val="single" w:color="CFDCD9" w:sz="4"/>
+              <w:right w:val="single" w:color="CFDCD9" w:sz="4"/>
+            </w:tcBorders>
+            <w:shd w:fill="F5F9F8" w:color="auto" w:val="clear"/>
+            <w:tcMar>
+              <w:top w:type="dxa" w:w="50"/>
+              <w:left w:type="dxa" w:w="90"/>
+              <w:bottom w:type="dxa" w:w="50"/>
+              <w:right w:type="dxa" w:w="90"/>
+            </w:tcMar>
+          </w:tcPr>
+          <w:p>
+            <w:pPr>
+              <w:jc w:val="left"/>
+            </w:pPr>
+            <w:r>
+              <w:rPr>
+                <w:sz w:val="19"/>
+                <w:szCs w:val="19"/>
+              </w:rPr>
+              <w:t xml:space="preserve">Estimer les habitants à partir du nombre de bâtiments et de la taille moyenne des ménages (ANSD)</w:t>
+            </w:r>
+          </w:p>
+        </w:tc>
+      </w:tr>
+      <w:tr>
+        <w:trPr>
+          <w:cantSplit/>
+        </w:trPr>
+        <w:tc>
+          <w:tcPr>
+            <w:tcW w:type="dxa" w:w="4025"/>
+            <w:tcBorders>
+              <w:top w:val="single" w:color="CFDCD9" w:sz="4"/>
+              <w:left w:val="single" w:color="CFDCD9" w:sz="4"/>
+              <w:bottom w:val="single" w:color="CFDCD9" w:sz="4"/>
+              <w:right w:val="single" w:color="CFDCD9" w:sz="4"/>
+            </w:tcBorders>
+            <w:tcMar>
+              <w:top w:type="dxa" w:w="50"/>
+              <w:left w:type="dxa" w:w="90"/>
+              <w:bottom w:type="dxa" w:w="50"/>
+              <w:right w:type="dxa" w:w="90"/>
+            </w:tcMar>
+          </w:tcPr>
+          <w:p>
+            <w:pPr>
+              <w:jc w:val="left"/>
+            </w:pPr>
+            <w:r>
+              <w:rPr>
+                <w:sz w:val="19"/>
+                <w:szCs w:val="19"/>
+              </w:rPr>
+              <w:t xml:space="preserve">Une promesse du dossier ne peut pas être terminée à temps</w:t>
+            </w:r>
+          </w:p>
+        </w:tc>
+        <w:tc>
+          <w:tcPr>
+            <w:tcW w:type="dxa" w:w="6067"/>
+            <w:tcBorders>
+              <w:top w:val="single" w:color="CFDCD9" w:sz="4"/>
+              <w:left w:val="single" w:color="CFDCD9" w:sz="4"/>
+              <w:bottom w:val="single" w:color="CFDCD9" w:sz="4"/>
+              <w:right w:val="single" w:color="CFDCD9" w:sz="4"/>
+            </w:tcBorders>
+            <w:tcMar>
+              <w:top w:type="dxa" w:w="50"/>
+              <w:left w:type="dxa" w:w="90"/>
+              <w:bottom w:type="dxa" w:w="50"/>
+              <w:right w:type="dxa" w:w="90"/>
+            </w:tcMar>
+          </w:tcPr>
+          <w:p>
+            <w:pPr>
+              <w:jc w:val="left"/>
+            </w:pPr>
+            <w:r>
+              <w:rPr>
+                <w:sz w:val="19"/>
+                <w:szCs w:val="19"/>
+              </w:rPr>
+              <w:t xml:space="preserve">La présenter honnêtement à l’oral : ce qui est fait, ce qui manque, et quand ce sera fait</w:t>
+            </w:r>
+          </w:p>
+        </w:tc>
+      </w:tr>
     </w:tbl>
     <w:p>
       <w:pPr>
@@ -3520,7 +6873,7 @@
         <w:pStyle w:val="Heading2"/>
       </w:pPr>
       <w:r>
-        <w:t xml:space="preserve">6. Structure de la présentation (10 à 12 diapositives)</w:t>
+        <w:t xml:space="preserve">7. Structure de la présentation (10 à 12 diapositives)</w:t>
       </w:r>
     </w:p>
     <w:p>
@@ -3596,7 +6949,7 @@
         <w:t xml:space="preserve">Les données</w:t>
       </w:r>
       <w:r>
-        <w:t xml:space="preserve"> : Sentinel-2, Landsat, OpenStreetMap, zone et période d’étude.</w:t>
+        <w:t xml:space="preserve"> : Sentinel-2, Landsat, Sentinel-1, Copernicus DEM, OpenStreetMap et Google Open Buildings, WorldPop ; zone et période d’étude.</w:t>
       </w:r>
     </w:p>
     <w:p>
@@ -3615,7 +6968,7 @@
         <w:t xml:space="preserve">La méthode</w:t>
       </w:r>
       <w:r>
-        <w:t xml:space="preserve"> : schéma en 4 étapes (trait de côte → transects → recul → exposition).</w:t>
+        <w:t xml:space="preserve"> : schéma en 4 étapes (trait de côte → transects → recul → exposition), avec la classification par apprentissage automatique.</w:t>
       </w:r>
     </w:p>
     <w:p>
@@ -3634,7 +6987,7 @@
         <w:t xml:space="preserve">Résultat 1</w:t>
       </w:r>
       <w:r>
-        <w:t xml:space="preserve"> : la carte avant / après.</w:t>
+        <w:t xml:space="preserve"> : la carte avant / après et l’animation de la brèche.</w:t>
       </w:r>
     </w:p>
     <w:p>
@@ -3653,7 +7006,7 @@
         <w:t xml:space="preserve">Résultat 2</w:t>
       </w:r>
       <w:r>
-        <w:t xml:space="preserve"> : la carte des vitesses de recul et les chiffres clés.</w:t>
+        <w:t xml:space="preserve"> : la carte des vitesses de recul, les chiffres clés et l’effet de la digue de Guet Ndar.</w:t>
       </w:r>
     </w:p>
     <w:p>
@@ -3672,7 +7025,7 @@
         <w:t xml:space="preserve">Résultat 3</w:t>
       </w:r>
       <w:r>
-        <w:t xml:space="preserve"> : les bâtiments et équipements menacés d’ici 2030.</w:t>
+        <w:t xml:space="preserve"> : la carte de risque ; les bâtiments, habitants et équipements menacés d’ici 2030.</w:t>
       </w:r>
     </w:p>
     <w:p>
@@ -3691,7 +7044,7 @@
         <w:t xml:space="preserve">La solution</w:t>
       </w:r>
       <w:r>
-        <w:t xml:space="preserve"> : démonstration du tableau de bord.</w:t>
+        <w:t xml:space="preserve"> : démonstration du tableau de bord (ordinateur, téléphone, français et wolof).</w:t>
       </w:r>
     </w:p>
     <w:p>
@@ -3710,7 +7063,7 @@
         <w:t xml:space="preserve">Qui l’utilise et pour quelle décision</w:t>
       </w:r>
       <w:r>
-        <w:t xml:space="preserve"> : mairie, ADM, DEEC, protection civile.</w:t>
+        <w:t xml:space="preserve"> : mairie et ADM, DEEC et Urbanisme, protection civile, services techniques, habitants et pêcheurs.</w:t>
       </w:r>
     </w:p>
     <w:p>
@@ -3748,7 +7101,7 @@
         <w:t xml:space="preserve">Limites et suite</w:t>
       </w:r>
       <w:r>
-        <w:t xml:space="preserve"> : extension à Rufisque, Mbour, Joal ; mises à jour plusieurs fois par an.</w:t>
+        <w:t xml:space="preserve"> : marée, précision des images, projection linéaire ; extension à Rufisque, Bargny, Mbour, Joal et la Casamance ; mises à jour plusieurs fois par an.</w:t>
       </w:r>
     </w:p>
     <w:p>
@@ -3771,7 +7124,7 @@
         <w:pStyle w:val="Heading2"/>
       </w:pPr>
       <w:r>
-        <w:t xml:space="preserve">7. Ce qui fera la différence</w:t>
+        <w:t xml:space="preserve">8. Ce qui fera la différence</w:t>
       </w:r>
     </w:p>
     <w:p>
@@ -3791,6 +7144,25 @@
       </w:r>
       <w:r>
         <w:t xml:space="preserve">, jamais sur les données de test.</w:t>
+      </w:r>
+    </w:p>
+    <w:p>
+      <w:pPr>
+        <w:pStyle w:val="ListParagraph"/>
+        <w:numPr>
+          <w:ilvl w:val="0"/>
+          <w:numId w:val="2"/>
+        </w:numPr>
+      </w:pPr>
+      <w:r>
+        <w:rPr>
+          <w:b/>
+          <w:bCs/>
+        </w:rPr>
+        <w:t xml:space="preserve">Tout ce qui est écrit dans le dossier envoyé est fait, ou expliqué honnêtement</w:t>
+      </w:r>
+      <w:r>
+        <w:t xml:space="preserve"> : le jury compare.</w:t>
       </w:r>
     </w:p>
     <w:p>

</xml_diff>

<commit_message>
Altitude, habitants et bâtiments Google dans le risque ; zone de la brèche traitée à part ; projection robuste ; effet de la digue ; vérification Sentinel-1 ; traductions wolof ; README à jour
</commit_message>
<xml_diff>
--- a/docs/Cahier_des_charges_TefesSat.docx
+++ b/docs/Cahier_des_charges_TefesSat.docx
@@ -1234,7 +1234,7 @@
                 <w:sz w:val="19"/>
                 <w:szCs w:val="19"/>
               </w:rPr>
-              <w:t xml:space="preserve">Carte simplifiée en français et en wolof (bouton FR | WO), et un message audio de 30 secondes en wolof à partager sur WhatsApp</w:t>
+              <w:t xml:space="preserve">Carte simplifiée en français et en wolof (bouton FR | WO), et un message audio en wolof à trois voix (15 secondes chacun) à partager sur WhatsApp</w:t>
             </w:r>
           </w:p>
         </w:tc>
@@ -1264,7 +1264,7 @@
                 <w:sz w:val="19"/>
                 <w:szCs w:val="19"/>
               </w:rPr>
-              <w:t xml:space="preserve">Malick (carte), Ndèye Fatou (audio), les trois (traduction)</w:t>
+              <w:t xml:space="preserve">Malick (carte), les trois (traduction et audio)</w:t>
             </w:r>
           </w:p>
         </w:tc>
@@ -3962,7 +3962,7 @@
                 <w:sz w:val="19"/>
                 <w:szCs w:val="19"/>
               </w:rPr>
-              <w:t xml:space="preserve">Les fichiers du dossier resultats/ (GeoJSON et CSV), les chiffres clés et le message audio en wolof</w:t>
+              <w:t xml:space="preserve">Les fichiers du dossier resultats/ (GeoJSON et CSV) et les chiffres clés</w:t>
             </w:r>
           </w:p>
         </w:tc>
@@ -5788,7 +5788,7 @@
                 <w:sz w:val="19"/>
                 <w:szCs w:val="19"/>
               </w:rPr>
-              <w:t xml:space="preserve">Ndèye Fatou</w:t>
+              <w:t xml:space="preserve">Les trois</w:t>
             </w:r>
           </w:p>
         </w:tc>
@@ -5817,7 +5817,7 @@
                 <w:sz w:val="19"/>
                 <w:szCs w:val="19"/>
               </w:rPr>
-              <w:t xml:space="preserve">Enregistrer le message audio en wolof (30 secondes)</w:t>
+              <w:t xml:space="preserve">Enregistrer chacun sa partie du message audio en wolof (15 secondes, texte dans le document du pitch)</w:t>
             </w:r>
           </w:p>
         </w:tc>

</xml_diff>

<commit_message>
Guide officiel : note de concept, inventaire des sources, analyse de sensibilité, cahier des charges mis à jour ; traits de côte Sentinel-2 renommés (données finales)
</commit_message>
<xml_diff>
--- a/docs/Cahier_des_charges_TefesSat.docx
+++ b/docs/Cahier_des_charges_TefesSat.docx
@@ -43,7 +43,7 @@
           <w:sz w:val="25"/>
           <w:szCs w:val="25"/>
         </w:rPr>
-        <w:t xml:space="preserve">TefesSat : qui fait quoi, et pour quand, du 19 au 22 octobre 2026</w:t>
+        <w:t xml:space="preserve">TefesSat : qui fait quoi, et pour quand, du 19 au 23 octobre 2026 (mis à jour avec le guide officiel du 20 octobre)</w:t>
       </w:r>
     </w:p>
     <w:tbl>
@@ -181,7 +181,7 @@
                 <w:sz w:val="20"/>
                 <w:szCs w:val="20"/>
               </w:rPr>
-              <w:t xml:space="preserve">Faire partie des 4 meilleures équipes, invitées à Diamniadio le 26 octobre</w:t>
+              <w:t xml:space="preserve">Être sélectionnés pour présenter à Diamniadio le 26 octobre. Prix : 300 000, 200 000, 150 000 et 100 000 FCFA</w:t>
             </w:r>
           </w:p>
         </w:tc>
@@ -240,10 +240,19 @@
             </w:pPr>
             <w:r>
               <w:rPr>
+                <w:b/>
+                <w:bCs/>
                 <w:sz w:val="20"/>
                 <w:szCs w:val="20"/>
               </w:rPr>
-              <w:t xml:space="preserve">Présentation à envoyer le 22 octobre à 23 h 59 (délai de rigueur). Objectif interne : 20 h.</w:t>
+              <w:t xml:space="preserve">Dossier complet le 23 octobre à 23 h 59 (heure de Dakar)</w:t>
+            </w:r>
+            <w:r>
+              <w:rPr>
+                <w:sz w:val="20"/>
+                <w:szCs w:val="20"/>
+              </w:rPr>
+              <w:t xml:space="preserve"> : dossier Google Drive partagé « Tous les utilisateurs disposant du lien », lien déposé via le formulaire de SENSAT. Objectif interne : 23 octobre, 18 h.</w:t>
             </w:r>
           </w:p>
         </w:tc>
@@ -275,7 +284,7 @@
                 <w:sz w:val="20"/>
                 <w:szCs w:val="20"/>
               </w:rPr>
-              <w:t xml:space="preserve">Jury</w:t>
+              <w:t xml:space="preserve">Calendrier</w:t>
             </w:r>
           </w:p>
         </w:tc>
@@ -305,7 +314,7 @@
                 <w:sz w:val="20"/>
                 <w:szCs w:val="20"/>
               </w:rPr>
-              <w:t xml:space="preserve">Présentation en ligne les 23 et 24 octobre</w:t>
+              <w:t xml:space="preserve">22 octobre : point d’étape et mentorat. 24 octobre : le jury évalue les dossiers (pas de présentation en ligne). 25 octobre : annonce des équipes sélectionnées. 26 octobre : présentation d’environ 7 minutes + 5 minutes de questions, et remise des prix</w:t>
             </w:r>
           </w:p>
         </w:tc>
@@ -337,7 +346,7 @@
                 <w:sz w:val="20"/>
                 <w:szCs w:val="20"/>
               </w:rPr>
-              <w:t xml:space="preserve">Code</w:t>
+              <w:t xml:space="preserve">Données</w:t>
             </w:r>
           </w:p>
         </w:tc>
@@ -367,7 +376,69 @@
                 <w:sz w:val="20"/>
                 <w:szCs w:val="20"/>
               </w:rPr>
-              <w:t xml:space="preserve">Dépôt GitHub privé Ndeye-Fatou-SOW/TefesSat (dossier D:\Hackaton_Sensat)</w:t>
+              <w:t xml:space="preserve">Aucune image n’est envoyée par TRL : nous utilisons les données ouvertes que nous avons téléchargées (Sentinel-2, Sentinel-1, Copernicus DEM, WorldPop, OpenStreetMap, Google Open Buildings)</w:t>
+            </w:r>
+          </w:p>
+        </w:tc>
+      </w:tr>
+      <w:tr>
+        <w:tc>
+          <w:tcPr>
+            <w:tcW w:type="dxa" w:w="1900"/>
+            <w:tcBorders>
+              <w:top w:val="none" w:color="FFFFFF" w:sz="0"/>
+              <w:left w:val="single" w:color="0B7A6F" w:sz="24"/>
+              <w:bottom w:val="none" w:color="FFFFFF" w:sz="0"/>
+              <w:right w:val="none" w:color="FFFFFF" w:sz="0"/>
+            </w:tcBorders>
+            <w:shd w:fill="E6F3F1" w:color="auto" w:val="clear"/>
+            <w:tcMar>
+              <w:top w:type="dxa" w:w="50"/>
+              <w:left w:type="dxa" w:w="90"/>
+              <w:bottom w:type="dxa" w:w="50"/>
+              <w:right w:type="dxa" w:w="90"/>
+            </w:tcMar>
+          </w:tcPr>
+          <w:p>
+            <w:r>
+              <w:rPr>
+                <w:b/>
+                <w:bCs/>
+                <w:color w:val="0B7A6F"/>
+                <w:sz w:val="20"/>
+                <w:szCs w:val="20"/>
+              </w:rPr>
+              <w:t xml:space="preserve">Code</w:t>
+            </w:r>
+          </w:p>
+        </w:tc>
+        <w:tc>
+          <w:tcPr>
+            <w:tcW w:type="dxa" w:w="8192"/>
+            <w:tcBorders>
+              <w:top w:val="none" w:color="FFFFFF" w:sz="0"/>
+              <w:left w:val="none" w:color="FFFFFF" w:sz="0"/>
+              <w:bottom w:val="none" w:color="FFFFFF" w:sz="0"/>
+              <w:right w:val="none" w:color="FFFFFF" w:sz="0"/>
+            </w:tcBorders>
+            <w:shd w:fill="E6F3F1" w:color="auto" w:val="clear"/>
+            <w:tcMar>
+              <w:top w:type="dxa" w:w="50"/>
+              <w:left w:type="dxa" w:w="90"/>
+              <w:bottom w:type="dxa" w:w="50"/>
+              <w:right w:type="dxa" w:w="90"/>
+            </w:tcMar>
+          </w:tcPr>
+          <w:p>
+            <w:pPr>
+              <w:jc w:val="left"/>
+            </w:pPr>
+            <w:r>
+              <w:rPr>
+                <w:sz w:val="20"/>
+                <w:szCs w:val="20"/>
+              </w:rPr>
+              <w:t xml:space="preserve">Dépôt GitHub privé Ndeye-Fatou-SOW/TefesSat (dossier D:\Hackaton_Sensat) ; une copie des scripts (zip) ira dans le dossier Google Drive</w:t>
             </w:r>
           </w:p>
         </w:tc>
@@ -378,7 +449,7 @@
         <w:pStyle w:val="Heading2"/>
       </w:pPr>
       <w:r>
-        <w:t xml:space="preserve">1. Ce que le jury doit voir</w:t>
+        <w:t xml:space="preserve">1. Le dossier à remettre le 23 octobre (guide officiel)</w:t>
       </w:r>
     </w:p>
     <w:p>
@@ -386,27 +457,27 @@
         <w:jc w:val="both"/>
       </w:pPr>
       <w:r>
-        <w:t xml:space="preserve">SENSAT a donné la logique attendue : </w:t>
+        <w:t xml:space="preserve">Le jury note </w:t>
       </w:r>
       <w:r>
         <w:rPr>
           <w:b/>
           <w:bCs/>
         </w:rPr>
-        <w:t xml:space="preserve">le problème → les données → l’analyse → la solution → le résultat → l’impact</w:t>
-      </w:r>
-      <w:r>
-        <w:t xml:space="preserve">. Le jury veut une solution concrète, un cas local et </w:t>
+        <w:t xml:space="preserve">le dossier écrit</w:t>
+      </w:r>
+      <w:r>
+        <w:t xml:space="preserve">, selon cinq critères : utilité pour un besoin sénégalais et pour la décision (25 %), méthode et choix des données (25 %), </w:t>
       </w:r>
       <w:r>
         <w:rPr>
           <w:b/>
           <w:bCs/>
         </w:rPr>
-        <w:t xml:space="preserve">un résultat visible, obtenu avec des données réelles</w:t>
-      </w:r>
-      <w:r>
-        <w:t xml:space="preserve">. Tout ce que nous produisons doit servir l’un de ces six points.</w:t>
+        <w:t xml:space="preserve">qualité des résultats et contrôle des incertitudes (20 %)</w:t>
+      </w:r>
+      <w:r>
+        <w:t xml:space="preserve">, reproductibilité et documentation (15 %), clarté et faisabilité de la suite (15 %). « Une méthode simple, vérifiable et utile peut obtenir un meilleur résultat qu’un prototype complexe insuffisamment expliqué. »</w:t>
       </w:r>
     </w:p>
     <w:tbl>
@@ -456,7 +527,7 @@
                 <w:sz w:val="19"/>
                 <w:szCs w:val="19"/>
               </w:rPr>
-              <w:t xml:space="preserve">Livrable final</w:t>
+              <w:t xml:space="preserve">Livrable officiel</w:t>
             </w:r>
           </w:p>
         </w:tc>
@@ -486,7 +557,7 @@
                 <w:sz w:val="19"/>
                 <w:szCs w:val="19"/>
               </w:rPr>
-              <w:t xml:space="preserve">Description</w:t>
+              <w:t xml:space="preserve">Contenu attendu</w:t>
             </w:r>
           </w:p>
         </w:tc>
@@ -550,7 +621,7 @@
                 <w:sz w:val="19"/>
                 <w:szCs w:val="19"/>
               </w:rPr>
-              <w:t xml:space="preserve">Carte avant / après</w:t>
+              <w:t xml:space="preserve">Note de concept (3 à 5 pages)</w:t>
             </w:r>
           </w:p>
         </w:tc>
@@ -579,7 +650,7 @@
                 <w:sz w:val="19"/>
                 <w:szCs w:val="19"/>
               </w:rPr>
-              <w:t xml:space="preserve">Trait de côte 2015 et 2025 superposés, zones perdues en rouge</w:t>
+              <w:t xml:space="preserve">Problème, utilisateur, solution, données, exemples réalisés, limites, prochaine étape. Une première version existe (docs/Note_de_concept_TefesSat)</w:t>
             </w:r>
           </w:p>
         </w:tc>
@@ -608,7 +679,7 @@
                 <w:sz w:val="19"/>
                 <w:szCs w:val="19"/>
               </w:rPr>
-              <w:t xml:space="preserve">Abdoulaye</w:t>
+              <w:t xml:space="preserve">Ndèye Fatou</w:t>
             </w:r>
           </w:p>
         </w:tc>
@@ -643,7 +714,7 @@
                 <w:sz w:val="19"/>
                 <w:szCs w:val="19"/>
               </w:rPr>
-              <w:t xml:space="preserve">Animation de la brèche</w:t>
+              <w:t xml:space="preserve">Résultats géospatiaux</w:t>
             </w:r>
           </w:p>
         </w:tc>
@@ -673,7 +744,7 @@
                 <w:sz w:val="19"/>
                 <w:szCs w:val="19"/>
               </w:rPr>
-              <w:t xml:space="preserve">Évolution de la brèche depuis 2003, à partir des images Landsat</w:t>
+              <w:t xml:space="preserve">Effet de la digue (graphique), marges mer – maisons, carte avant / après, couches GeoJSON, avec dates et sources</w:t>
             </w:r>
           </w:p>
         </w:tc>
@@ -703,7 +774,7 @@
                 <w:sz w:val="19"/>
                 <w:szCs w:val="19"/>
               </w:rPr>
-              <w:t xml:space="preserve">Abdoulaye</w:t>
+              <w:t xml:space="preserve">Ndèye Fatou, Abdoulaye (carte avant / après)</w:t>
             </w:r>
           </w:p>
         </w:tc>
@@ -737,7 +808,7 @@
                 <w:sz w:val="19"/>
                 <w:szCs w:val="19"/>
               </w:rPr>
-              <w:t xml:space="preserve">Carte des vitesses de recul</w:t>
+              <w:t xml:space="preserve">Éléments de reproduction</w:t>
             </w:r>
           </w:p>
         </w:tc>
@@ -766,7 +837,7 @@
                 <w:sz w:val="19"/>
                 <w:szCs w:val="19"/>
               </w:rPr>
-              <w:t xml:space="preserve">Recul en m/an par tronçon de 50 m, de Guet Ndar à la brèche</w:t>
+              <w:t xml:space="preserve">Zip des scripts, README pas à pas, paramètres et liens des données</w:t>
             </w:r>
           </w:p>
         </w:tc>
@@ -830,7 +901,7 @@
                 <w:sz w:val="19"/>
                 <w:szCs w:val="19"/>
               </w:rPr>
-              <w:t xml:space="preserve">Carte de risque</w:t>
+              <w:t xml:space="preserve">Support de présentation</w:t>
             </w:r>
           </w:p>
         </w:tc>
@@ -860,7 +931,7 @@
                 <w:sz w:val="19"/>
                 <w:szCs w:val="19"/>
               </w:rPr>
-              <w:t xml:space="preserve">Niveau de risque (faible, moyen, élevé, très élevé) par tronçon, selon la vitesse de recul, l’altitude et le nombre de personnes exposées</w:t>
+              <w:t xml:space="preserve">Diapositives courtes en français, remises avec le dossier ; 7 minutes à l’oral si nous sommes sélectionnés</w:t>
             </w:r>
           </w:p>
         </w:tc>
@@ -890,7 +961,7 @@
                 <w:sz w:val="19"/>
                 <w:szCs w:val="19"/>
               </w:rPr>
-              <w:t xml:space="preserve">Ndèye Fatou</w:t>
+              <w:t xml:space="preserve">Les trois (Malick : mise en forme)</w:t>
             </w:r>
           </w:p>
         </w:tc>
@@ -924,7 +995,7 @@
                 <w:sz w:val="19"/>
                 <w:szCs w:val="19"/>
               </w:rPr>
-              <w:t xml:space="preserve">Chiffres clés</w:t>
+              <w:t xml:space="preserve">Inventaire des sources</w:t>
             </w:r>
           </w:p>
         </w:tc>
@@ -953,7 +1024,39 @@
                 <w:sz w:val="19"/>
                 <w:szCs w:val="19"/>
               </w:rPr>
-              <w:t xml:space="preserve">Recul moyen et maximum ; bâtiments, habitants et équipements (écoles, mosquées, postes de santé) menacés d’ici 2030, par quartier ; projection 2035 avec sa marge d’incertitude</w:t>
+              <w:t xml:space="preserve">Données, périodes, résolutions, licences, outils, </w:t>
+            </w:r>
+            <w:r>
+              <w:rPr>
+                <w:b/>
+                <w:bCs/>
+                <w:sz w:val="19"/>
+                <w:szCs w:val="19"/>
+              </w:rPr>
+              <w:t xml:space="preserve">outils d’IA utilisés</w:t>
+            </w:r>
+            <w:r>
+              <w:rPr>
+                <w:sz w:val="19"/>
+                <w:szCs w:val="19"/>
+              </w:rPr>
+              <w:t xml:space="preserve"> et </w:t>
+            </w:r>
+            <w:r>
+              <w:rPr>
+                <w:b/>
+                <w:bCs/>
+                <w:sz w:val="19"/>
+                <w:szCs w:val="19"/>
+              </w:rPr>
+              <w:t xml:space="preserve">contribution de chaque membre</w:t>
+            </w:r>
+            <w:r>
+              <w:rPr>
+                <w:sz w:val="19"/>
+                <w:szCs w:val="19"/>
+              </w:rPr>
+              <w:t xml:space="preserve"> (docs/Inventaire_des_sources_TefesSat)</w:t>
             </w:r>
           </w:p>
         </w:tc>
@@ -982,7 +1085,155 @@
                 <w:sz w:val="19"/>
                 <w:szCs w:val="19"/>
               </w:rPr>
-              <w:t xml:space="preserve">Ndèye Fatou</w:t>
+              <w:t xml:space="preserve">Ndèye Fatou ; chacun complète sa partie</w:t>
+            </w:r>
+          </w:p>
+        </w:tc>
+      </w:tr>
+    </w:tbl>
+    <w:p>
+      <w:pPr>
+        <w:spacing w:after="60"/>
+      </w:pPr>
+    </w:p>
+    <w:p>
+      <w:pPr>
+        <w:jc w:val="both"/>
+      </w:pPr>
+      <w:r>
+        <w:rPr>
+          <w:b/>
+          <w:bCs/>
+        </w:rPr>
+        <w:t xml:space="preserve">Règles importantes du guide :</w:t>
+      </w:r>
+      <w:r>
+        <w:t xml:space="preserve"> déclarer les outils d’intelligence artificielle utilisés ; citer toutes les données et respecter leurs licences ; un tableau de bord n’est pas obligatoire, et toute maquette doit être signalée comme telle ; choisir un ODD principal (ODD 11) et un complémentaire (ODD 13) ; ne jamais inventer de résultat.</w:t>
+      </w:r>
+    </w:p>
+    <w:p>
+      <w:pPr>
+        <w:jc w:val="both"/>
+      </w:pPr>
+      <w:r>
+        <w:rPr>
+          <w:b/>
+          <w:bCs/>
+        </w:rPr>
+        <w:t xml:space="preserve">Autres productions de l’équipe</w:t>
+      </w:r>
+      <w:r>
+        <w:t xml:space="preserve"> (elles nourrissent le dossier et la démonstration) :</w:t>
+      </w:r>
+    </w:p>
+    <w:tbl>
+      <w:tblPr>
+        <w:tblW w:type="dxa" w:w="10092"/>
+        <w:tblBorders>
+          <w:top w:val="single" w:color="auto" w:sz="4"/>
+          <w:left w:val="single" w:color="auto" w:sz="4"/>
+          <w:bottom w:val="single" w:color="auto" w:sz="4"/>
+          <w:right w:val="single" w:color="auto" w:sz="4"/>
+          <w:insideH w:val="single" w:color="auto" w:sz="4"/>
+          <w:insideV w:val="single" w:color="auto" w:sz="4"/>
+        </w:tblBorders>
+      </w:tblPr>
+      <w:tblGrid>
+        <w:gridCol w:w="2572"/>
+        <w:gridCol w:w="5508"/>
+        <w:gridCol w:w="2012"/>
+      </w:tblGrid>
+      <w:tr>
+        <w:trPr>
+          <w:tblHeader/>
+        </w:trPr>
+        <w:tc>
+          <w:tcPr>
+            <w:tcW w:type="dxa" w:w="2572"/>
+            <w:tcBorders>
+              <w:top w:val="single" w:color="CFDCD9" w:sz="4"/>
+              <w:left w:val="single" w:color="CFDCD9" w:sz="4"/>
+              <w:bottom w:val="single" w:color="CFDCD9" w:sz="4"/>
+              <w:right w:val="single" w:color="CFDCD9" w:sz="4"/>
+            </w:tcBorders>
+            <w:shd w:fill="0B7A6F" w:color="auto" w:val="clear"/>
+            <w:tcMar>
+              <w:top w:type="dxa" w:w="50"/>
+              <w:left w:type="dxa" w:w="90"/>
+              <w:bottom w:type="dxa" w:w="50"/>
+              <w:right w:type="dxa" w:w="90"/>
+            </w:tcMar>
+          </w:tcPr>
+          <w:p>
+            <w:r>
+              <w:rPr>
+                <w:b/>
+                <w:bCs/>
+                <w:color w:val="FFFFFF"/>
+                <w:sz w:val="19"/>
+                <w:szCs w:val="19"/>
+              </w:rPr>
+              <w:t xml:space="preserve">Production</w:t>
+            </w:r>
+          </w:p>
+        </w:tc>
+        <w:tc>
+          <w:tcPr>
+            <w:tcW w:type="dxa" w:w="5508"/>
+            <w:tcBorders>
+              <w:top w:val="single" w:color="CFDCD9" w:sz="4"/>
+              <w:left w:val="single" w:color="CFDCD9" w:sz="4"/>
+              <w:bottom w:val="single" w:color="CFDCD9" w:sz="4"/>
+              <w:right w:val="single" w:color="CFDCD9" w:sz="4"/>
+            </w:tcBorders>
+            <w:shd w:fill="0B7A6F" w:color="auto" w:val="clear"/>
+            <w:tcMar>
+              <w:top w:type="dxa" w:w="50"/>
+              <w:left w:type="dxa" w:w="90"/>
+              <w:bottom w:type="dxa" w:w="50"/>
+              <w:right w:type="dxa" w:w="90"/>
+            </w:tcMar>
+          </w:tcPr>
+          <w:p>
+            <w:r>
+              <w:rPr>
+                <w:b/>
+                <w:bCs/>
+                <w:color w:val="FFFFFF"/>
+                <w:sz w:val="19"/>
+                <w:szCs w:val="19"/>
+              </w:rPr>
+              <w:t xml:space="preserve">Description</w:t>
+            </w:r>
+          </w:p>
+        </w:tc>
+        <w:tc>
+          <w:tcPr>
+            <w:tcW w:type="dxa" w:w="2012"/>
+            <w:tcBorders>
+              <w:top w:val="single" w:color="CFDCD9" w:sz="4"/>
+              <w:left w:val="single" w:color="CFDCD9" w:sz="4"/>
+              <w:bottom w:val="single" w:color="CFDCD9" w:sz="4"/>
+              <w:right w:val="single" w:color="CFDCD9" w:sz="4"/>
+            </w:tcBorders>
+            <w:shd w:fill="0B7A6F" w:color="auto" w:val="clear"/>
+            <w:tcMar>
+              <w:top w:type="dxa" w:w="50"/>
+              <w:left w:type="dxa" w:w="90"/>
+              <w:bottom w:type="dxa" w:w="50"/>
+              <w:right w:type="dxa" w:w="90"/>
+            </w:tcMar>
+          </w:tcPr>
+          <w:p>
+            <w:r>
+              <w:rPr>
+                <w:b/>
+                <w:bCs/>
+                <w:color w:val="FFFFFF"/>
+                <w:sz w:val="19"/>
+                <w:szCs w:val="19"/>
+              </w:rPr>
+              <w:t xml:space="preserve">Responsable</w:t>
             </w:r>
           </w:p>
         </w:tc>
@@ -1000,24 +1251,23 @@
               <w:bottom w:val="single" w:color="CFDCD9" w:sz="4"/>
               <w:right w:val="single" w:color="CFDCD9" w:sz="4"/>
             </w:tcBorders>
-            <w:shd w:fill="F5F9F8" w:color="auto" w:val="clear"/>
-            <w:tcMar>
-              <w:top w:type="dxa" w:w="50"/>
-              <w:left w:type="dxa" w:w="90"/>
-              <w:bottom w:type="dxa" w:w="50"/>
-              <w:right w:type="dxa" w:w="90"/>
-            </w:tcMar>
-          </w:tcPr>
-          <w:p>
-            <w:pPr>
-              <w:jc w:val="left"/>
-            </w:pPr>
-            <w:r>
-              <w:rPr>
-                <w:sz w:val="19"/>
-                <w:szCs w:val="19"/>
-              </w:rPr>
-              <w:t xml:space="preserve">Effet des ouvrages de protection</w:t>
+            <w:tcMar>
+              <w:top w:type="dxa" w:w="50"/>
+              <w:left w:type="dxa" w:w="90"/>
+              <w:bottom w:type="dxa" w:w="50"/>
+              <w:right w:type="dxa" w:w="90"/>
+            </w:tcMar>
+          </w:tcPr>
+          <w:p>
+            <w:pPr>
+              <w:jc w:val="left"/>
+            </w:pPr>
+            <w:r>
+              <w:rPr>
+                <w:sz w:val="19"/>
+                <w:szCs w:val="19"/>
+              </w:rPr>
+              <w:t xml:space="preserve">Carte avant / après</w:t>
             </w:r>
           </w:p>
         </w:tc>
@@ -1030,24 +1280,23 @@
               <w:bottom w:val="single" w:color="CFDCD9" w:sz="4"/>
               <w:right w:val="single" w:color="CFDCD9" w:sz="4"/>
             </w:tcBorders>
-            <w:shd w:fill="F5F9F8" w:color="auto" w:val="clear"/>
-            <w:tcMar>
-              <w:top w:type="dxa" w:w="50"/>
-              <w:left w:type="dxa" w:w="90"/>
-              <w:bottom w:type="dxa" w:w="50"/>
-              <w:right w:type="dxa" w:w="90"/>
-            </w:tcMar>
-          </w:tcPr>
-          <w:p>
-            <w:pPr>
-              <w:jc w:val="left"/>
-            </w:pPr>
-            <w:r>
-              <w:rPr>
-                <w:sz w:val="19"/>
-                <w:szCs w:val="19"/>
-              </w:rPr>
-              <w:t xml:space="preserve">Recul avant et après la digue de Guet Ndar (2021–2022) : la protection fonctionne-t-elle ?</w:t>
+            <w:tcMar>
+              <w:top w:type="dxa" w:w="50"/>
+              <w:left w:type="dxa" w:w="90"/>
+              <w:bottom w:type="dxa" w:w="50"/>
+              <w:right w:type="dxa" w:w="90"/>
+            </w:tcMar>
+          </w:tcPr>
+          <w:p>
+            <w:pPr>
+              <w:jc w:val="left"/>
+            </w:pPr>
+            <w:r>
+              <w:rPr>
+                <w:sz w:val="19"/>
+                <w:szCs w:val="19"/>
+              </w:rPr>
+              <w:t xml:space="preserve">Trait de côte 2015 et 2025 superposés, zones perdues en rouge</w:t>
             </w:r>
           </w:p>
         </w:tc>
@@ -1060,24 +1309,23 @@
               <w:bottom w:val="single" w:color="CFDCD9" w:sz="4"/>
               <w:right w:val="single" w:color="CFDCD9" w:sz="4"/>
             </w:tcBorders>
-            <w:shd w:fill="F5F9F8" w:color="auto" w:val="clear"/>
-            <w:tcMar>
-              <w:top w:type="dxa" w:w="50"/>
-              <w:left w:type="dxa" w:w="90"/>
-              <w:bottom w:type="dxa" w:w="50"/>
-              <w:right w:type="dxa" w:w="90"/>
-            </w:tcMar>
-          </w:tcPr>
-          <w:p>
-            <w:pPr>
-              <w:jc w:val="left"/>
-            </w:pPr>
-            <w:r>
-              <w:rPr>
-                <w:sz w:val="19"/>
-                <w:szCs w:val="19"/>
-              </w:rPr>
-              <w:t xml:space="preserve">Ndèye Fatou</w:t>
+            <w:tcMar>
+              <w:top w:type="dxa" w:w="50"/>
+              <w:left w:type="dxa" w:w="90"/>
+              <w:bottom w:type="dxa" w:w="50"/>
+              <w:right w:type="dxa" w:w="90"/>
+            </w:tcMar>
+          </w:tcPr>
+          <w:p>
+            <w:pPr>
+              <w:jc w:val="left"/>
+            </w:pPr>
+            <w:r>
+              <w:rPr>
+                <w:sz w:val="19"/>
+                <w:szCs w:val="19"/>
+              </w:rPr>
+              <w:t xml:space="preserve">Abdoulaye</w:t>
             </w:r>
           </w:p>
         </w:tc>
@@ -1095,23 +1343,24 @@
               <w:bottom w:val="single" w:color="CFDCD9" w:sz="4"/>
               <w:right w:val="single" w:color="CFDCD9" w:sz="4"/>
             </w:tcBorders>
-            <w:tcMar>
-              <w:top w:type="dxa" w:w="50"/>
-              <w:left w:type="dxa" w:w="90"/>
-              <w:bottom w:type="dxa" w:w="50"/>
-              <w:right w:type="dxa" w:w="90"/>
-            </w:tcMar>
-          </w:tcPr>
-          <w:p>
-            <w:pPr>
-              <w:jc w:val="left"/>
-            </w:pPr>
-            <w:r>
-              <w:rPr>
-                <w:sz w:val="19"/>
-                <w:szCs w:val="19"/>
-              </w:rPr>
-              <w:t xml:space="preserve">Tableau de bord web</w:t>
+            <w:shd w:fill="F5F9F8" w:color="auto" w:val="clear"/>
+            <w:tcMar>
+              <w:top w:type="dxa" w:w="50"/>
+              <w:left w:type="dxa" w:w="90"/>
+              <w:bottom w:type="dxa" w:w="50"/>
+              <w:right w:type="dxa" w:w="90"/>
+            </w:tcMar>
+          </w:tcPr>
+          <w:p>
+            <w:pPr>
+              <w:jc w:val="left"/>
+            </w:pPr>
+            <w:r>
+              <w:rPr>
+                <w:sz w:val="19"/>
+                <w:szCs w:val="19"/>
+              </w:rPr>
+              <w:t xml:space="preserve">Animation de la brèche</w:t>
             </w:r>
           </w:p>
         </w:tc>
@@ -1124,23 +1373,24 @@
               <w:bottom w:val="single" w:color="CFDCD9" w:sz="4"/>
               <w:right w:val="single" w:color="CFDCD9" w:sz="4"/>
             </w:tcBorders>
-            <w:tcMar>
-              <w:top w:type="dxa" w:w="50"/>
-              <w:left w:type="dxa" w:w="90"/>
-              <w:bottom w:type="dxa" w:w="50"/>
-              <w:right w:type="dxa" w:w="90"/>
-            </w:tcMar>
-          </w:tcPr>
-          <w:p>
-            <w:pPr>
-              <w:jc w:val="left"/>
-            </w:pPr>
-            <w:r>
-              <w:rPr>
-                <w:sz w:val="19"/>
-                <w:szCs w:val="19"/>
-              </w:rPr>
-              <w:t xml:space="preserve">Carte interactive, lisible sur ordinateur et sur téléphone : on clique sur un tronçon pour voir son historique, sa vitesse de recul, son niveau de risque et ce qui est exposé</w:t>
+            <w:shd w:fill="F5F9F8" w:color="auto" w:val="clear"/>
+            <w:tcMar>
+              <w:top w:type="dxa" w:w="50"/>
+              <w:left w:type="dxa" w:w="90"/>
+              <w:bottom w:type="dxa" w:w="50"/>
+              <w:right w:type="dxa" w:w="90"/>
+            </w:tcMar>
+          </w:tcPr>
+          <w:p>
+            <w:pPr>
+              <w:jc w:val="left"/>
+            </w:pPr>
+            <w:r>
+              <w:rPr>
+                <w:sz w:val="19"/>
+                <w:szCs w:val="19"/>
+              </w:rPr>
+              <w:t xml:space="preserve">Évolution de la brèche depuis 2003, à partir des images Landsat</w:t>
             </w:r>
           </w:p>
         </w:tc>
@@ -1153,23 +1403,24 @@
               <w:bottom w:val="single" w:color="CFDCD9" w:sz="4"/>
               <w:right w:val="single" w:color="CFDCD9" w:sz="4"/>
             </w:tcBorders>
-            <w:tcMar>
-              <w:top w:type="dxa" w:w="50"/>
-              <w:left w:type="dxa" w:w="90"/>
-              <w:bottom w:type="dxa" w:w="50"/>
-              <w:right w:type="dxa" w:w="90"/>
-            </w:tcMar>
-          </w:tcPr>
-          <w:p>
-            <w:pPr>
-              <w:jc w:val="left"/>
-            </w:pPr>
-            <w:r>
-              <w:rPr>
-                <w:sz w:val="19"/>
-                <w:szCs w:val="19"/>
-              </w:rPr>
-              <w:t xml:space="preserve">Malick</w:t>
+            <w:shd w:fill="F5F9F8" w:color="auto" w:val="clear"/>
+            <w:tcMar>
+              <w:top w:type="dxa" w:w="50"/>
+              <w:left w:type="dxa" w:w="90"/>
+              <w:bottom w:type="dxa" w:w="50"/>
+              <w:right w:type="dxa" w:w="90"/>
+            </w:tcMar>
+          </w:tcPr>
+          <w:p>
+            <w:pPr>
+              <w:jc w:val="left"/>
+            </w:pPr>
+            <w:r>
+              <w:rPr>
+                <w:sz w:val="19"/>
+                <w:szCs w:val="19"/>
+              </w:rPr>
+              <w:t xml:space="preserve">Abdoulaye</w:t>
             </w:r>
           </w:p>
         </w:tc>
@@ -1187,24 +1438,23 @@
               <w:bottom w:val="single" w:color="CFDCD9" w:sz="4"/>
               <w:right w:val="single" w:color="CFDCD9" w:sz="4"/>
             </w:tcBorders>
-            <w:shd w:fill="F5F9F8" w:color="auto" w:val="clear"/>
-            <w:tcMar>
-              <w:top w:type="dxa" w:w="50"/>
-              <w:left w:type="dxa" w:w="90"/>
-              <w:bottom w:type="dxa" w:w="50"/>
-              <w:right w:type="dxa" w:w="90"/>
-            </w:tcMar>
-          </w:tcPr>
-          <w:p>
-            <w:pPr>
-              <w:jc w:val="left"/>
-            </w:pPr>
-            <w:r>
-              <w:rPr>
-                <w:sz w:val="19"/>
-                <w:szCs w:val="19"/>
-              </w:rPr>
-              <w:t xml:space="preserve">Version pour les habitants</w:t>
+            <w:tcMar>
+              <w:top w:type="dxa" w:w="50"/>
+              <w:left w:type="dxa" w:w="90"/>
+              <w:bottom w:type="dxa" w:w="50"/>
+              <w:right w:type="dxa" w:w="90"/>
+            </w:tcMar>
+          </w:tcPr>
+          <w:p>
+            <w:pPr>
+              <w:jc w:val="left"/>
+            </w:pPr>
+            <w:r>
+              <w:rPr>
+                <w:sz w:val="19"/>
+                <w:szCs w:val="19"/>
+              </w:rPr>
+              <w:t xml:space="preserve">Carte des vitesses de recul</w:t>
             </w:r>
           </w:p>
         </w:tc>
@@ -1217,24 +1467,23 @@
               <w:bottom w:val="single" w:color="CFDCD9" w:sz="4"/>
               <w:right w:val="single" w:color="CFDCD9" w:sz="4"/>
             </w:tcBorders>
-            <w:shd w:fill="F5F9F8" w:color="auto" w:val="clear"/>
-            <w:tcMar>
-              <w:top w:type="dxa" w:w="50"/>
-              <w:left w:type="dxa" w:w="90"/>
-              <w:bottom w:type="dxa" w:w="50"/>
-              <w:right w:type="dxa" w:w="90"/>
-            </w:tcMar>
-          </w:tcPr>
-          <w:p>
-            <w:pPr>
-              <w:jc w:val="left"/>
-            </w:pPr>
-            <w:r>
-              <w:rPr>
-                <w:sz w:val="19"/>
-                <w:szCs w:val="19"/>
-              </w:rPr>
-              <w:t xml:space="preserve">Carte simplifiée en français et en wolof (bouton FR | WO), et un message audio en wolof à trois voix (15 secondes chacun) à partager sur WhatsApp</w:t>
+            <w:tcMar>
+              <w:top w:type="dxa" w:w="50"/>
+              <w:left w:type="dxa" w:w="90"/>
+              <w:bottom w:type="dxa" w:w="50"/>
+              <w:right w:type="dxa" w:w="90"/>
+            </w:tcMar>
+          </w:tcPr>
+          <w:p>
+            <w:pPr>
+              <w:jc w:val="left"/>
+            </w:pPr>
+            <w:r>
+              <w:rPr>
+                <w:sz w:val="19"/>
+                <w:szCs w:val="19"/>
+              </w:rPr>
+              <w:t xml:space="preserve">Recul en m/an par tronçon de 50 m, de Guet Ndar à la brèche</w:t>
             </w:r>
           </w:p>
         </w:tc>
@@ -1247,24 +1496,23 @@
               <w:bottom w:val="single" w:color="CFDCD9" w:sz="4"/>
               <w:right w:val="single" w:color="CFDCD9" w:sz="4"/>
             </w:tcBorders>
-            <w:shd w:fill="F5F9F8" w:color="auto" w:val="clear"/>
-            <w:tcMar>
-              <w:top w:type="dxa" w:w="50"/>
-              <w:left w:type="dxa" w:w="90"/>
-              <w:bottom w:type="dxa" w:w="50"/>
-              <w:right w:type="dxa" w:w="90"/>
-            </w:tcMar>
-          </w:tcPr>
-          <w:p>
-            <w:pPr>
-              <w:jc w:val="left"/>
-            </w:pPr>
-            <w:r>
-              <w:rPr>
-                <w:sz w:val="19"/>
-                <w:szCs w:val="19"/>
-              </w:rPr>
-              <w:t xml:space="preserve">Malick (carte), les trois (traduction et audio)</w:t>
+            <w:tcMar>
+              <w:top w:type="dxa" w:w="50"/>
+              <w:left w:type="dxa" w:w="90"/>
+              <w:bottom w:type="dxa" w:w="50"/>
+              <w:right w:type="dxa" w:w="90"/>
+            </w:tcMar>
+          </w:tcPr>
+          <w:p>
+            <w:pPr>
+              <w:jc w:val="left"/>
+            </w:pPr>
+            <w:r>
+              <w:rPr>
+                <w:sz w:val="19"/>
+                <w:szCs w:val="19"/>
+              </w:rPr>
+              <w:t xml:space="preserve">Ndèye Fatou</w:t>
             </w:r>
           </w:p>
         </w:tc>
@@ -1282,23 +1530,24 @@
               <w:bottom w:val="single" w:color="CFDCD9" w:sz="4"/>
               <w:right w:val="single" w:color="CFDCD9" w:sz="4"/>
             </w:tcBorders>
-            <w:tcMar>
-              <w:top w:type="dxa" w:w="50"/>
-              <w:left w:type="dxa" w:w="90"/>
-              <w:bottom w:type="dxa" w:w="50"/>
-              <w:right w:type="dxa" w:w="90"/>
-            </w:tcMar>
-          </w:tcPr>
-          <w:p>
-            <w:pPr>
-              <w:jc w:val="left"/>
-            </w:pPr>
-            <w:r>
-              <w:rPr>
-                <w:sz w:val="19"/>
-                <w:szCs w:val="19"/>
-              </w:rPr>
-              <w:t xml:space="preserve">API de diffusion</w:t>
+            <w:shd w:fill="F5F9F8" w:color="auto" w:val="clear"/>
+            <w:tcMar>
+              <w:top w:type="dxa" w:w="50"/>
+              <w:left w:type="dxa" w:w="90"/>
+              <w:bottom w:type="dxa" w:w="50"/>
+              <w:right w:type="dxa" w:w="90"/>
+            </w:tcMar>
+          </w:tcPr>
+          <w:p>
+            <w:pPr>
+              <w:jc w:val="left"/>
+            </w:pPr>
+            <w:r>
+              <w:rPr>
+                <w:sz w:val="19"/>
+                <w:szCs w:val="19"/>
+              </w:rPr>
+              <w:t xml:space="preserve">Carte de risque</w:t>
             </w:r>
           </w:p>
         </w:tc>
@@ -1311,23 +1560,24 @@
               <w:bottom w:val="single" w:color="CFDCD9" w:sz="4"/>
               <w:right w:val="single" w:color="CFDCD9" w:sz="4"/>
             </w:tcBorders>
-            <w:tcMar>
-              <w:top w:type="dxa" w:w="50"/>
-              <w:left w:type="dxa" w:w="90"/>
-              <w:bottom w:type="dxa" w:w="50"/>
-              <w:right w:type="dxa" w:w="90"/>
-            </w:tcMar>
-          </w:tcPr>
-          <w:p>
-            <w:pPr>
-              <w:jc w:val="left"/>
-            </w:pPr>
-            <w:r>
-              <w:rPr>
-                <w:sz w:val="19"/>
-                <w:szCs w:val="19"/>
-              </w:rPr>
-              <w:t xml:space="preserve">Petite API (FastAPI) qui renvoie les résultats en GeoJSON, pour que la mairie ou d’autres outils puissent les réutiliser</w:t>
+            <w:shd w:fill="F5F9F8" w:color="auto" w:val="clear"/>
+            <w:tcMar>
+              <w:top w:type="dxa" w:w="50"/>
+              <w:left w:type="dxa" w:w="90"/>
+              <w:bottom w:type="dxa" w:w="50"/>
+              <w:right w:type="dxa" w:w="90"/>
+            </w:tcMar>
+          </w:tcPr>
+          <w:p>
+            <w:pPr>
+              <w:jc w:val="left"/>
+            </w:pPr>
+            <w:r>
+              <w:rPr>
+                <w:sz w:val="19"/>
+                <w:szCs w:val="19"/>
+              </w:rPr>
+              <w:t xml:space="preserve">Niveau de risque (faible, moyen, élevé, très élevé) par tronçon, selon la vitesse de recul, l’altitude et le nombre de personnes exposées</w:t>
             </w:r>
           </w:p>
         </w:tc>
@@ -1340,23 +1590,24 @@
               <w:bottom w:val="single" w:color="CFDCD9" w:sz="4"/>
               <w:right w:val="single" w:color="CFDCD9" w:sz="4"/>
             </w:tcBorders>
-            <w:tcMar>
-              <w:top w:type="dxa" w:w="50"/>
-              <w:left w:type="dxa" w:w="90"/>
-              <w:bottom w:type="dxa" w:w="50"/>
-              <w:right w:type="dxa" w:w="90"/>
-            </w:tcMar>
-          </w:tcPr>
-          <w:p>
-            <w:pPr>
-              <w:jc w:val="left"/>
-            </w:pPr>
-            <w:r>
-              <w:rPr>
-                <w:sz w:val="19"/>
-                <w:szCs w:val="19"/>
-              </w:rPr>
-              <w:t xml:space="preserve">Malick</w:t>
+            <w:shd w:fill="F5F9F8" w:color="auto" w:val="clear"/>
+            <w:tcMar>
+              <w:top w:type="dxa" w:w="50"/>
+              <w:left w:type="dxa" w:w="90"/>
+              <w:bottom w:type="dxa" w:w="50"/>
+              <w:right w:type="dxa" w:w="90"/>
+            </w:tcMar>
+          </w:tcPr>
+          <w:p>
+            <w:pPr>
+              <w:jc w:val="left"/>
+            </w:pPr>
+            <w:r>
+              <w:rPr>
+                <w:sz w:val="19"/>
+                <w:szCs w:val="19"/>
+              </w:rPr>
+              <w:t xml:space="preserve">Ndèye Fatou</w:t>
             </w:r>
           </w:p>
         </w:tc>
@@ -1374,24 +1625,23 @@
               <w:bottom w:val="single" w:color="CFDCD9" w:sz="4"/>
               <w:right w:val="single" w:color="CFDCD9" w:sz="4"/>
             </w:tcBorders>
-            <w:shd w:fill="F5F9F8" w:color="auto" w:val="clear"/>
-            <w:tcMar>
-              <w:top w:type="dxa" w:w="50"/>
-              <w:left w:type="dxa" w:w="90"/>
-              <w:bottom w:type="dxa" w:w="50"/>
-              <w:right w:type="dxa" w:w="90"/>
-            </w:tcMar>
-          </w:tcPr>
-          <w:p>
-            <w:pPr>
-              <w:jc w:val="left"/>
-            </w:pPr>
-            <w:r>
-              <w:rPr>
-                <w:sz w:val="19"/>
-                <w:szCs w:val="19"/>
-              </w:rPr>
-              <w:t xml:space="preserve">Vidéo de démonstration</w:t>
+            <w:tcMar>
+              <w:top w:type="dxa" w:w="50"/>
+              <w:left w:type="dxa" w:w="90"/>
+              <w:bottom w:type="dxa" w:w="50"/>
+              <w:right w:type="dxa" w:w="90"/>
+            </w:tcMar>
+          </w:tcPr>
+          <w:p>
+            <w:pPr>
+              <w:jc w:val="left"/>
+            </w:pPr>
+            <w:r>
+              <w:rPr>
+                <w:sz w:val="19"/>
+                <w:szCs w:val="19"/>
+              </w:rPr>
+              <w:t xml:space="preserve">Chiffres clés</w:t>
             </w:r>
           </w:p>
         </w:tc>
@@ -1404,24 +1654,23 @@
               <w:bottom w:val="single" w:color="CFDCD9" w:sz="4"/>
               <w:right w:val="single" w:color="CFDCD9" w:sz="4"/>
             </w:tcBorders>
-            <w:shd w:fill="F5F9F8" w:color="auto" w:val="clear"/>
-            <w:tcMar>
-              <w:top w:type="dxa" w:w="50"/>
-              <w:left w:type="dxa" w:w="90"/>
-              <w:bottom w:type="dxa" w:w="50"/>
-              <w:right w:type="dxa" w:w="90"/>
-            </w:tcMar>
-          </w:tcPr>
-          <w:p>
-            <w:pPr>
-              <w:jc w:val="left"/>
-            </w:pPr>
-            <w:r>
-              <w:rPr>
-                <w:sz w:val="19"/>
-                <w:szCs w:val="19"/>
-              </w:rPr>
-              <w:t xml:space="preserve">2 à 3 minutes, au cas où la connexion lâche pendant l’oral</w:t>
+            <w:tcMar>
+              <w:top w:type="dxa" w:w="50"/>
+              <w:left w:type="dxa" w:w="90"/>
+              <w:bottom w:type="dxa" w:w="50"/>
+              <w:right w:type="dxa" w:w="90"/>
+            </w:tcMar>
+          </w:tcPr>
+          <w:p>
+            <w:pPr>
+              <w:jc w:val="left"/>
+            </w:pPr>
+            <w:r>
+              <w:rPr>
+                <w:sz w:val="19"/>
+                <w:szCs w:val="19"/>
+              </w:rPr>
+              <w:t xml:space="preserve">Recul moyen et maximum ; bâtiments, habitants et équipements (écoles, mosquées, postes de santé) menacés d’ici 2030, par quartier ; projection 2035 avec sa marge d’incertitude</w:t>
             </w:r>
           </w:p>
         </w:tc>
@@ -1434,24 +1683,23 @@
               <w:bottom w:val="single" w:color="CFDCD9" w:sz="4"/>
               <w:right w:val="single" w:color="CFDCD9" w:sz="4"/>
             </w:tcBorders>
-            <w:shd w:fill="F5F9F8" w:color="auto" w:val="clear"/>
-            <w:tcMar>
-              <w:top w:type="dxa" w:w="50"/>
-              <w:left w:type="dxa" w:w="90"/>
-              <w:bottom w:type="dxa" w:w="50"/>
-              <w:right w:type="dxa" w:w="90"/>
-            </w:tcMar>
-          </w:tcPr>
-          <w:p>
-            <w:pPr>
-              <w:jc w:val="left"/>
-            </w:pPr>
-            <w:r>
-              <w:rPr>
-                <w:sz w:val="19"/>
-                <w:szCs w:val="19"/>
-              </w:rPr>
-              <w:t xml:space="preserve">Malick</w:t>
+            <w:tcMar>
+              <w:top w:type="dxa" w:w="50"/>
+              <w:left w:type="dxa" w:w="90"/>
+              <w:bottom w:type="dxa" w:w="50"/>
+              <w:right w:type="dxa" w:w="90"/>
+            </w:tcMar>
+          </w:tcPr>
+          <w:p>
+            <w:pPr>
+              <w:jc w:val="left"/>
+            </w:pPr>
+            <w:r>
+              <w:rPr>
+                <w:sz w:val="19"/>
+                <w:szCs w:val="19"/>
+              </w:rPr>
+              <w:t xml:space="preserve">Ndèye Fatou</w:t>
             </w:r>
           </w:p>
         </w:tc>
@@ -1469,23 +1717,24 @@
               <w:bottom w:val="single" w:color="CFDCD9" w:sz="4"/>
               <w:right w:val="single" w:color="CFDCD9" w:sz="4"/>
             </w:tcBorders>
-            <w:tcMar>
-              <w:top w:type="dxa" w:w="50"/>
-              <w:left w:type="dxa" w:w="90"/>
-              <w:bottom w:type="dxa" w:w="50"/>
-              <w:right w:type="dxa" w:w="90"/>
-            </w:tcMar>
-          </w:tcPr>
-          <w:p>
-            <w:pPr>
-              <w:jc w:val="left"/>
-            </w:pPr>
-            <w:r>
-              <w:rPr>
-                <w:sz w:val="19"/>
-                <w:szCs w:val="19"/>
-              </w:rPr>
-              <w:t xml:space="preserve">Présentation</w:t>
+            <w:shd w:fill="F5F9F8" w:color="auto" w:val="clear"/>
+            <w:tcMar>
+              <w:top w:type="dxa" w:w="50"/>
+              <w:left w:type="dxa" w:w="90"/>
+              <w:bottom w:type="dxa" w:w="50"/>
+              <w:right w:type="dxa" w:w="90"/>
+            </w:tcMar>
+          </w:tcPr>
+          <w:p>
+            <w:pPr>
+              <w:jc w:val="left"/>
+            </w:pPr>
+            <w:r>
+              <w:rPr>
+                <w:sz w:val="19"/>
+                <w:szCs w:val="19"/>
+              </w:rPr>
+              <w:t xml:space="preserve">Effet des ouvrages de protection</w:t>
             </w:r>
           </w:p>
         </w:tc>
@@ -1498,23 +1747,24 @@
               <w:bottom w:val="single" w:color="CFDCD9" w:sz="4"/>
               <w:right w:val="single" w:color="CFDCD9" w:sz="4"/>
             </w:tcBorders>
-            <w:tcMar>
-              <w:top w:type="dxa" w:w="50"/>
-              <w:left w:type="dxa" w:w="90"/>
-              <w:bottom w:type="dxa" w:w="50"/>
-              <w:right w:type="dxa" w:w="90"/>
-            </w:tcMar>
-          </w:tcPr>
-          <w:p>
-            <w:pPr>
-              <w:jc w:val="left"/>
-            </w:pPr>
-            <w:r>
-              <w:rPr>
-                <w:sz w:val="19"/>
-                <w:szCs w:val="19"/>
-              </w:rPr>
-              <w:t xml:space="preserve">10 à 12 diapositives, envoyée avant le 22 octobre à 23 h 59</w:t>
+            <w:shd w:fill="F5F9F8" w:color="auto" w:val="clear"/>
+            <w:tcMar>
+              <w:top w:type="dxa" w:w="50"/>
+              <w:left w:type="dxa" w:w="90"/>
+              <w:bottom w:type="dxa" w:w="50"/>
+              <w:right w:type="dxa" w:w="90"/>
+            </w:tcMar>
+          </w:tcPr>
+          <w:p>
+            <w:pPr>
+              <w:jc w:val="left"/>
+            </w:pPr>
+            <w:r>
+              <w:rPr>
+                <w:sz w:val="19"/>
+                <w:szCs w:val="19"/>
+              </w:rPr>
+              <w:t xml:space="preserve">Recul avant et après la digue de Guet Ndar (2021–2022) : la protection fonctionne-t-elle ?</w:t>
             </w:r>
           </w:p>
         </w:tc>
@@ -1527,23 +1777,398 @@
               <w:bottom w:val="single" w:color="CFDCD9" w:sz="4"/>
               <w:right w:val="single" w:color="CFDCD9" w:sz="4"/>
             </w:tcBorders>
-            <w:tcMar>
-              <w:top w:type="dxa" w:w="50"/>
-              <w:left w:type="dxa" w:w="90"/>
-              <w:bottom w:type="dxa" w:w="50"/>
-              <w:right w:type="dxa" w:w="90"/>
-            </w:tcMar>
-          </w:tcPr>
-          <w:p>
-            <w:pPr>
-              <w:jc w:val="left"/>
-            </w:pPr>
-            <w:r>
-              <w:rPr>
-                <w:sz w:val="19"/>
-                <w:szCs w:val="19"/>
-              </w:rPr>
-              <w:t xml:space="preserve">Les trois</w:t>
+            <w:shd w:fill="F5F9F8" w:color="auto" w:val="clear"/>
+            <w:tcMar>
+              <w:top w:type="dxa" w:w="50"/>
+              <w:left w:type="dxa" w:w="90"/>
+              <w:bottom w:type="dxa" w:w="50"/>
+              <w:right w:type="dxa" w:w="90"/>
+            </w:tcMar>
+          </w:tcPr>
+          <w:p>
+            <w:pPr>
+              <w:jc w:val="left"/>
+            </w:pPr>
+            <w:r>
+              <w:rPr>
+                <w:sz w:val="19"/>
+                <w:szCs w:val="19"/>
+              </w:rPr>
+              <w:t xml:space="preserve">Ndèye Fatou</w:t>
+            </w:r>
+          </w:p>
+        </w:tc>
+      </w:tr>
+      <w:tr>
+        <w:trPr>
+          <w:cantSplit/>
+        </w:trPr>
+        <w:tc>
+          <w:tcPr>
+            <w:tcW w:type="dxa" w:w="2572"/>
+            <w:tcBorders>
+              <w:top w:val="single" w:color="CFDCD9" w:sz="4"/>
+              <w:left w:val="single" w:color="CFDCD9" w:sz="4"/>
+              <w:bottom w:val="single" w:color="CFDCD9" w:sz="4"/>
+              <w:right w:val="single" w:color="CFDCD9" w:sz="4"/>
+            </w:tcBorders>
+            <w:tcMar>
+              <w:top w:type="dxa" w:w="50"/>
+              <w:left w:type="dxa" w:w="90"/>
+              <w:bottom w:type="dxa" w:w="50"/>
+              <w:right w:type="dxa" w:w="90"/>
+            </w:tcMar>
+          </w:tcPr>
+          <w:p>
+            <w:pPr>
+              <w:jc w:val="left"/>
+            </w:pPr>
+            <w:r>
+              <w:rPr>
+                <w:sz w:val="19"/>
+                <w:szCs w:val="19"/>
+              </w:rPr>
+              <w:t xml:space="preserve">Tableau de bord web (prototype)</w:t>
+            </w:r>
+          </w:p>
+        </w:tc>
+        <w:tc>
+          <w:tcPr>
+            <w:tcW w:type="dxa" w:w="5508"/>
+            <w:tcBorders>
+              <w:top w:val="single" w:color="CFDCD9" w:sz="4"/>
+              <w:left w:val="single" w:color="CFDCD9" w:sz="4"/>
+              <w:bottom w:val="single" w:color="CFDCD9" w:sz="4"/>
+              <w:right w:val="single" w:color="CFDCD9" w:sz="4"/>
+            </w:tcBorders>
+            <w:tcMar>
+              <w:top w:type="dxa" w:w="50"/>
+              <w:left w:type="dxa" w:w="90"/>
+              <w:bottom w:type="dxa" w:w="50"/>
+              <w:right w:type="dxa" w:w="90"/>
+            </w:tcMar>
+          </w:tcPr>
+          <w:p>
+            <w:pPr>
+              <w:jc w:val="left"/>
+            </w:pPr>
+            <w:r>
+              <w:rPr>
+                <w:sz w:val="19"/>
+                <w:szCs w:val="19"/>
+              </w:rPr>
+              <w:t xml:space="preserve">Carte interactive, lisible sur ordinateur et sur téléphone : on clique sur un tronçon pour voir son historique, sa vitesse de recul, son niveau de risque et ce qui est exposé. Facultatif selon le guide : signaler ce qui est maquette</w:t>
+            </w:r>
+          </w:p>
+        </w:tc>
+        <w:tc>
+          <w:tcPr>
+            <w:tcW w:type="dxa" w:w="2012"/>
+            <w:tcBorders>
+              <w:top w:val="single" w:color="CFDCD9" w:sz="4"/>
+              <w:left w:val="single" w:color="CFDCD9" w:sz="4"/>
+              <w:bottom w:val="single" w:color="CFDCD9" w:sz="4"/>
+              <w:right w:val="single" w:color="CFDCD9" w:sz="4"/>
+            </w:tcBorders>
+            <w:tcMar>
+              <w:top w:type="dxa" w:w="50"/>
+              <w:left w:type="dxa" w:w="90"/>
+              <w:bottom w:type="dxa" w:w="50"/>
+              <w:right w:type="dxa" w:w="90"/>
+            </w:tcMar>
+          </w:tcPr>
+          <w:p>
+            <w:pPr>
+              <w:jc w:val="left"/>
+            </w:pPr>
+            <w:r>
+              <w:rPr>
+                <w:sz w:val="19"/>
+                <w:szCs w:val="19"/>
+              </w:rPr>
+              <w:t xml:space="preserve">Malick</w:t>
+            </w:r>
+          </w:p>
+        </w:tc>
+      </w:tr>
+      <w:tr>
+        <w:trPr>
+          <w:cantSplit/>
+        </w:trPr>
+        <w:tc>
+          <w:tcPr>
+            <w:tcW w:type="dxa" w:w="2572"/>
+            <w:tcBorders>
+              <w:top w:val="single" w:color="CFDCD9" w:sz="4"/>
+              <w:left w:val="single" w:color="CFDCD9" w:sz="4"/>
+              <w:bottom w:val="single" w:color="CFDCD9" w:sz="4"/>
+              <w:right w:val="single" w:color="CFDCD9" w:sz="4"/>
+            </w:tcBorders>
+            <w:shd w:fill="F5F9F8" w:color="auto" w:val="clear"/>
+            <w:tcMar>
+              <w:top w:type="dxa" w:w="50"/>
+              <w:left w:type="dxa" w:w="90"/>
+              <w:bottom w:type="dxa" w:w="50"/>
+              <w:right w:type="dxa" w:w="90"/>
+            </w:tcMar>
+          </w:tcPr>
+          <w:p>
+            <w:pPr>
+              <w:jc w:val="left"/>
+            </w:pPr>
+            <w:r>
+              <w:rPr>
+                <w:sz w:val="19"/>
+                <w:szCs w:val="19"/>
+              </w:rPr>
+              <w:t xml:space="preserve">Version pour les habitants</w:t>
+            </w:r>
+          </w:p>
+        </w:tc>
+        <w:tc>
+          <w:tcPr>
+            <w:tcW w:type="dxa" w:w="5508"/>
+            <w:tcBorders>
+              <w:top w:val="single" w:color="CFDCD9" w:sz="4"/>
+              <w:left w:val="single" w:color="CFDCD9" w:sz="4"/>
+              <w:bottom w:val="single" w:color="CFDCD9" w:sz="4"/>
+              <w:right w:val="single" w:color="CFDCD9" w:sz="4"/>
+            </w:tcBorders>
+            <w:shd w:fill="F5F9F8" w:color="auto" w:val="clear"/>
+            <w:tcMar>
+              <w:top w:type="dxa" w:w="50"/>
+              <w:left w:type="dxa" w:w="90"/>
+              <w:bottom w:type="dxa" w:w="50"/>
+              <w:right w:type="dxa" w:w="90"/>
+            </w:tcMar>
+          </w:tcPr>
+          <w:p>
+            <w:pPr>
+              <w:jc w:val="left"/>
+            </w:pPr>
+            <w:r>
+              <w:rPr>
+                <w:sz w:val="19"/>
+                <w:szCs w:val="19"/>
+              </w:rPr>
+              <w:t xml:space="preserve">Carte simplifiée en français et en wolof (bouton FR | WO), et un message audio en wolof à trois voix (15 secondes chacun) à partager sur WhatsApp</w:t>
+            </w:r>
+          </w:p>
+        </w:tc>
+        <w:tc>
+          <w:tcPr>
+            <w:tcW w:type="dxa" w:w="2012"/>
+            <w:tcBorders>
+              <w:top w:val="single" w:color="CFDCD9" w:sz="4"/>
+              <w:left w:val="single" w:color="CFDCD9" w:sz="4"/>
+              <w:bottom w:val="single" w:color="CFDCD9" w:sz="4"/>
+              <w:right w:val="single" w:color="CFDCD9" w:sz="4"/>
+            </w:tcBorders>
+            <w:shd w:fill="F5F9F8" w:color="auto" w:val="clear"/>
+            <w:tcMar>
+              <w:top w:type="dxa" w:w="50"/>
+              <w:left w:type="dxa" w:w="90"/>
+              <w:bottom w:type="dxa" w:w="50"/>
+              <w:right w:type="dxa" w:w="90"/>
+            </w:tcMar>
+          </w:tcPr>
+          <w:p>
+            <w:pPr>
+              <w:jc w:val="left"/>
+            </w:pPr>
+            <w:r>
+              <w:rPr>
+                <w:sz w:val="19"/>
+                <w:szCs w:val="19"/>
+              </w:rPr>
+              <w:t xml:space="preserve">Malick (carte), les trois (traduction et audio)</w:t>
+            </w:r>
+          </w:p>
+        </w:tc>
+      </w:tr>
+      <w:tr>
+        <w:trPr>
+          <w:cantSplit/>
+        </w:trPr>
+        <w:tc>
+          <w:tcPr>
+            <w:tcW w:type="dxa" w:w="2572"/>
+            <w:tcBorders>
+              <w:top w:val="single" w:color="CFDCD9" w:sz="4"/>
+              <w:left w:val="single" w:color="CFDCD9" w:sz="4"/>
+              <w:bottom w:val="single" w:color="CFDCD9" w:sz="4"/>
+              <w:right w:val="single" w:color="CFDCD9" w:sz="4"/>
+            </w:tcBorders>
+            <w:tcMar>
+              <w:top w:type="dxa" w:w="50"/>
+              <w:left w:type="dxa" w:w="90"/>
+              <w:bottom w:type="dxa" w:w="50"/>
+              <w:right w:type="dxa" w:w="90"/>
+            </w:tcMar>
+          </w:tcPr>
+          <w:p>
+            <w:pPr>
+              <w:jc w:val="left"/>
+            </w:pPr>
+            <w:r>
+              <w:rPr>
+                <w:sz w:val="19"/>
+                <w:szCs w:val="19"/>
+              </w:rPr>
+              <w:t xml:space="preserve">API de diffusion</w:t>
+            </w:r>
+          </w:p>
+        </w:tc>
+        <w:tc>
+          <w:tcPr>
+            <w:tcW w:type="dxa" w:w="5508"/>
+            <w:tcBorders>
+              <w:top w:val="single" w:color="CFDCD9" w:sz="4"/>
+              <w:left w:val="single" w:color="CFDCD9" w:sz="4"/>
+              <w:bottom w:val="single" w:color="CFDCD9" w:sz="4"/>
+              <w:right w:val="single" w:color="CFDCD9" w:sz="4"/>
+            </w:tcBorders>
+            <w:tcMar>
+              <w:top w:type="dxa" w:w="50"/>
+              <w:left w:type="dxa" w:w="90"/>
+              <w:bottom w:type="dxa" w:w="50"/>
+              <w:right w:type="dxa" w:w="90"/>
+            </w:tcMar>
+          </w:tcPr>
+          <w:p>
+            <w:pPr>
+              <w:jc w:val="left"/>
+            </w:pPr>
+            <w:r>
+              <w:rPr>
+                <w:sz w:val="19"/>
+                <w:szCs w:val="19"/>
+              </w:rPr>
+              <w:t xml:space="preserve">Petite API (FastAPI) qui renvoie les résultats en GeoJSON, pour que la mairie ou d’autres outils puissent les réutiliser</w:t>
+            </w:r>
+          </w:p>
+        </w:tc>
+        <w:tc>
+          <w:tcPr>
+            <w:tcW w:type="dxa" w:w="2012"/>
+            <w:tcBorders>
+              <w:top w:val="single" w:color="CFDCD9" w:sz="4"/>
+              <w:left w:val="single" w:color="CFDCD9" w:sz="4"/>
+              <w:bottom w:val="single" w:color="CFDCD9" w:sz="4"/>
+              <w:right w:val="single" w:color="CFDCD9" w:sz="4"/>
+            </w:tcBorders>
+            <w:tcMar>
+              <w:top w:type="dxa" w:w="50"/>
+              <w:left w:type="dxa" w:w="90"/>
+              <w:bottom w:type="dxa" w:w="50"/>
+              <w:right w:type="dxa" w:w="90"/>
+            </w:tcMar>
+          </w:tcPr>
+          <w:p>
+            <w:pPr>
+              <w:jc w:val="left"/>
+            </w:pPr>
+            <w:r>
+              <w:rPr>
+                <w:sz w:val="19"/>
+                <w:szCs w:val="19"/>
+              </w:rPr>
+              <w:t xml:space="preserve">Malick</w:t>
+            </w:r>
+          </w:p>
+        </w:tc>
+      </w:tr>
+      <w:tr>
+        <w:trPr>
+          <w:cantSplit/>
+        </w:trPr>
+        <w:tc>
+          <w:tcPr>
+            <w:tcW w:type="dxa" w:w="2572"/>
+            <w:tcBorders>
+              <w:top w:val="single" w:color="CFDCD9" w:sz="4"/>
+              <w:left w:val="single" w:color="CFDCD9" w:sz="4"/>
+              <w:bottom w:val="single" w:color="CFDCD9" w:sz="4"/>
+              <w:right w:val="single" w:color="CFDCD9" w:sz="4"/>
+            </w:tcBorders>
+            <w:shd w:fill="F5F9F8" w:color="auto" w:val="clear"/>
+            <w:tcMar>
+              <w:top w:type="dxa" w:w="50"/>
+              <w:left w:type="dxa" w:w="90"/>
+              <w:bottom w:type="dxa" w:w="50"/>
+              <w:right w:type="dxa" w:w="90"/>
+            </w:tcMar>
+          </w:tcPr>
+          <w:p>
+            <w:pPr>
+              <w:jc w:val="left"/>
+            </w:pPr>
+            <w:r>
+              <w:rPr>
+                <w:sz w:val="19"/>
+                <w:szCs w:val="19"/>
+              </w:rPr>
+              <w:t xml:space="preserve">Vidéo de démonstration</w:t>
+            </w:r>
+          </w:p>
+        </w:tc>
+        <w:tc>
+          <w:tcPr>
+            <w:tcW w:type="dxa" w:w="5508"/>
+            <w:tcBorders>
+              <w:top w:val="single" w:color="CFDCD9" w:sz="4"/>
+              <w:left w:val="single" w:color="CFDCD9" w:sz="4"/>
+              <w:bottom w:val="single" w:color="CFDCD9" w:sz="4"/>
+              <w:right w:val="single" w:color="CFDCD9" w:sz="4"/>
+            </w:tcBorders>
+            <w:shd w:fill="F5F9F8" w:color="auto" w:val="clear"/>
+            <w:tcMar>
+              <w:top w:type="dxa" w:w="50"/>
+              <w:left w:type="dxa" w:w="90"/>
+              <w:bottom w:type="dxa" w:w="50"/>
+              <w:right w:type="dxa" w:w="90"/>
+            </w:tcMar>
+          </w:tcPr>
+          <w:p>
+            <w:pPr>
+              <w:jc w:val="left"/>
+            </w:pPr>
+            <w:r>
+              <w:rPr>
+                <w:sz w:val="19"/>
+                <w:szCs w:val="19"/>
+              </w:rPr>
+              <w:t xml:space="preserve">2 à 3 minutes, à mettre dans le dossier Google Drive</w:t>
+            </w:r>
+          </w:p>
+        </w:tc>
+        <w:tc>
+          <w:tcPr>
+            <w:tcW w:type="dxa" w:w="2012"/>
+            <w:tcBorders>
+              <w:top w:val="single" w:color="CFDCD9" w:sz="4"/>
+              <w:left w:val="single" w:color="CFDCD9" w:sz="4"/>
+              <w:bottom w:val="single" w:color="CFDCD9" w:sz="4"/>
+              <w:right w:val="single" w:color="CFDCD9" w:sz="4"/>
+            </w:tcBorders>
+            <w:shd w:fill="F5F9F8" w:color="auto" w:val="clear"/>
+            <w:tcMar>
+              <w:top w:type="dxa" w:w="50"/>
+              <w:left w:type="dxa" w:w="90"/>
+              <w:bottom w:type="dxa" w:w="50"/>
+              <w:right w:type="dxa" w:w="90"/>
+            </w:tcMar>
+          </w:tcPr>
+          <w:p>
+            <w:pPr>
+              <w:jc w:val="left"/>
+            </w:pPr>
+            <w:r>
+              <w:rPr>
+                <w:sz w:val="19"/>
+                <w:szCs w:val="19"/>
+              </w:rPr>
+              <w:t xml:space="preserve">Malick</w:t>
             </w:r>
           </w:p>
         </w:tc>
@@ -4861,7 +5486,22 @@
           <w:b/>
           <w:bCs/>
         </w:rPr>
-        <w:t xml:space="preserve">Mercredi 21 octobre (jour 2) : l’analyse et le tableau de bord</w:t>
+        <w:t xml:space="preserve">Point au 20 octobre, 13 h :</w:t>
+      </w:r>
+      <w:r>
+        <w:t xml:space="preserve"> côté analyse, tout est fait (altitude, population, bâtiments Google, Sentinel-1, carte de risque, effet de la digue, analyse de sensibilité) ; la note de concept et l’inventaire des sources existent en première version.</w:t>
+      </w:r>
+    </w:p>
+    <w:p>
+      <w:pPr>
+        <w:jc w:val="both"/>
+      </w:pPr>
+      <w:r>
+        <w:rPr>
+          <w:b/>
+          <w:bCs/>
+        </w:rPr>
+        <w:t xml:space="preserve">Mercredi 21 octobre : résultats des équipiers et tableau de bord</w:t>
       </w:r>
     </w:p>
     <w:tbl>
@@ -5005,7 +5645,7 @@
                 <w:sz w:val="19"/>
                 <w:szCs w:val="19"/>
               </w:rPr>
-              <w:t xml:space="preserve">Ndèye Fatou</w:t>
+              <w:t xml:space="preserve">Abdoulaye</w:t>
             </w:r>
           </w:p>
         </w:tc>
@@ -5034,7 +5674,7 @@
                 <w:sz w:val="19"/>
                 <w:szCs w:val="19"/>
               </w:rPr>
-              <w:t xml:space="preserve">Vérifier les résultats (valeurs aberrantes, R²) ; carte de risque (vitesse, altitude, habitants) ; chiffres clés par quartier (bâtiments, habitants, équipements)</w:t>
+              <w:t xml:space="preserve">Pousser sur GitHub la carte avant / après ; vérifier sur Google Earth les bâtiments de Guéthie (autour de 15,879° N, 16,510° O)</w:t>
             </w:r>
           </w:p>
         </w:tc>
@@ -5063,7 +5703,7 @@
                 <w:sz w:val="19"/>
                 <w:szCs w:val="19"/>
               </w:rPr>
-              <w:t xml:space="preserve">14 h</w:t>
+              <w:t xml:space="preserve">16 h</w:t>
             </w:r>
           </w:p>
         </w:tc>
@@ -5098,7 +5738,7 @@
                 <w:sz w:val="19"/>
                 <w:szCs w:val="19"/>
               </w:rPr>
-              <w:t xml:space="preserve">Ndèye Fatou</w:t>
+              <w:t xml:space="preserve">Abdoulaye</w:t>
             </w:r>
           </w:p>
         </w:tc>
@@ -5128,7 +5768,7 @@
                 <w:sz w:val="19"/>
                 <w:szCs w:val="19"/>
               </w:rPr>
-              <w:t xml:space="preserve">Effet de la digue de Guet Ndar : recul avant et après 2021–2022</w:t>
+              <w:t xml:space="preserve">Classification eau / sable par apprentissage automatique, comparée au seuil d’Otsu ; animation de la brèche (Landsat) si le temps le permet</w:t>
             </w:r>
           </w:p>
         </w:tc>
@@ -5158,7 +5798,7 @@
                 <w:sz w:val="19"/>
                 <w:szCs w:val="19"/>
               </w:rPr>
-              <w:t xml:space="preserve">18 h</w:t>
+              <w:t xml:space="preserve">20 h</w:t>
             </w:r>
           </w:p>
         </w:tc>
@@ -5192,7 +5832,7 @@
                 <w:sz w:val="19"/>
                 <w:szCs w:val="19"/>
               </w:rPr>
-              <w:t xml:space="preserve">Abdoulaye</w:t>
+              <w:t xml:space="preserve">Malick</w:t>
             </w:r>
           </w:p>
         </w:tc>
@@ -5221,7 +5861,7 @@
                 <w:sz w:val="19"/>
                 <w:szCs w:val="19"/>
               </w:rPr>
-              <w:t xml:space="preserve">Carte avant / après et animation de la brèche depuis 2003 (Landsat)</w:t>
+              <w:t xml:space="preserve">Brancher les vrais résultats sur le tableau de bord ; fiche de chaque tronçon ; bouton FR | WO ; signaler ce qui est maquette</w:t>
             </w:r>
           </w:p>
         </w:tc>
@@ -5250,7 +5890,7 @@
                 <w:sz w:val="19"/>
                 <w:szCs w:val="19"/>
               </w:rPr>
-              <w:t xml:space="preserve">16 h</w:t>
+              <w:t xml:space="preserve">20 h</w:t>
             </w:r>
           </w:p>
         </w:tc>
@@ -5285,7 +5925,7 @@
                 <w:sz w:val="19"/>
                 <w:szCs w:val="19"/>
               </w:rPr>
-              <w:t xml:space="preserve">Abdoulaye</w:t>
+              <w:t xml:space="preserve">Abdoulaye, Malick</w:t>
             </w:r>
           </w:p>
         </w:tc>
@@ -5315,7 +5955,7 @@
                 <w:sz w:val="19"/>
                 <w:szCs w:val="19"/>
               </w:rPr>
-              <w:t xml:space="preserve">Classification eau / sable par apprentissage automatique, comparée au seuil d’Otsu</w:t>
+              <w:t xml:space="preserve">Compléter dans l’inventaire des sources : sa contribution, ses outils, les outils d’IA utilisés (ou « aucun »)</w:t>
             </w:r>
           </w:p>
         </w:tc>
@@ -5345,7 +5985,7 @@
                 <w:sz w:val="19"/>
                 <w:szCs w:val="19"/>
               </w:rPr>
-              <w:t xml:space="preserve">20 h</w:t>
+              <w:t xml:space="preserve">21 h</w:t>
             </w:r>
           </w:p>
         </w:tc>
@@ -5379,7 +6019,7 @@
                 <w:sz w:val="19"/>
                 <w:szCs w:val="19"/>
               </w:rPr>
-              <w:t xml:space="preserve">Malick</w:t>
+              <w:t xml:space="preserve">Ndèye Fatou</w:t>
             </w:r>
           </w:p>
         </w:tc>
@@ -5408,7 +6048,7 @@
                 <w:sz w:val="19"/>
                 <w:szCs w:val="19"/>
               </w:rPr>
-              <w:t xml:space="preserve">Brancher les vrais résultats sur le tableau de bord ; fiche de chaque tronçon (historique, vitesse, risque, ce qui est exposé) ; bouton FR | WO</w:t>
+              <w:t xml:space="preserve">Relire la note de concept et l’inventaire ; ajouter les liens des articles sur la digue</w:t>
             </w:r>
           </w:p>
         </w:tc>
@@ -5437,7 +6077,7 @@
                 <w:sz w:val="19"/>
                 <w:szCs w:val="19"/>
               </w:rPr>
-              <w:t xml:space="preserve">20 h</w:t>
+              <w:t xml:space="preserve">18 h</w:t>
             </w:r>
           </w:p>
         </w:tc>
@@ -5502,7 +6142,7 @@
                 <w:sz w:val="19"/>
                 <w:szCs w:val="19"/>
               </w:rPr>
-              <w:t xml:space="preserve">Traduire et corriger en wolof les mots de la carte (environ 20)</w:t>
+              <w:t xml:space="preserve">Corriger le wolof (traductions et message audio)</w:t>
             </w:r>
           </w:p>
         </w:tc>
@@ -5533,98 +6173,6 @@
                 <w:szCs w:val="19"/>
               </w:rPr>
               <w:t xml:space="preserve">21 h</w:t>
-            </w:r>
-          </w:p>
-        </w:tc>
-      </w:tr>
-      <w:tr>
-        <w:trPr>
-          <w:cantSplit/>
-        </w:trPr>
-        <w:tc>
-          <w:tcPr>
-            <w:tcW w:type="dxa" w:w="1901"/>
-            <w:tcBorders>
-              <w:top w:val="single" w:color="CFDCD9" w:sz="4"/>
-              <w:left w:val="single" w:color="CFDCD9" w:sz="4"/>
-              <w:bottom w:val="single" w:color="CFDCD9" w:sz="4"/>
-              <w:right w:val="single" w:color="CFDCD9" w:sz="4"/>
-            </w:tcBorders>
-            <w:tcMar>
-              <w:top w:type="dxa" w:w="50"/>
-              <w:left w:type="dxa" w:w="90"/>
-              <w:bottom w:type="dxa" w:w="50"/>
-              <w:right w:type="dxa" w:w="90"/>
-            </w:tcMar>
-          </w:tcPr>
-          <w:p>
-            <w:pPr>
-              <w:jc w:val="left"/>
-            </w:pPr>
-            <w:r>
-              <w:rPr>
-                <w:sz w:val="19"/>
-                <w:szCs w:val="19"/>
-              </w:rPr>
-              <w:t xml:space="preserve">Les trois</w:t>
-            </w:r>
-          </w:p>
-        </w:tc>
-        <w:tc>
-          <w:tcPr>
-            <w:tcW w:type="dxa" w:w="6290"/>
-            <w:tcBorders>
-              <w:top w:val="single" w:color="CFDCD9" w:sz="4"/>
-              <w:left w:val="single" w:color="CFDCD9" w:sz="4"/>
-              <w:bottom w:val="single" w:color="CFDCD9" w:sz="4"/>
-              <w:right w:val="single" w:color="CFDCD9" w:sz="4"/>
-            </w:tcBorders>
-            <w:tcMar>
-              <w:top w:type="dxa" w:w="50"/>
-              <w:left w:type="dxa" w:w="90"/>
-              <w:bottom w:type="dxa" w:w="50"/>
-              <w:right w:type="dxa" w:w="90"/>
-            </w:tcMar>
-          </w:tcPr>
-          <w:p>
-            <w:pPr>
-              <w:jc w:val="left"/>
-            </w:pPr>
-            <w:r>
-              <w:rPr>
-                <w:sz w:val="19"/>
-                <w:szCs w:val="19"/>
-              </w:rPr>
-              <w:t xml:space="preserve">Premier brouillon de la présentation</w:t>
-            </w:r>
-          </w:p>
-        </w:tc>
-        <w:tc>
-          <w:tcPr>
-            <w:tcW w:type="dxa" w:w="1901"/>
-            <w:tcBorders>
-              <w:top w:val="single" w:color="CFDCD9" w:sz="4"/>
-              <w:left w:val="single" w:color="CFDCD9" w:sz="4"/>
-              <w:bottom w:val="single" w:color="CFDCD9" w:sz="4"/>
-              <w:right w:val="single" w:color="CFDCD9" w:sz="4"/>
-            </w:tcBorders>
-            <w:tcMar>
-              <w:top w:type="dxa" w:w="50"/>
-              <w:left w:type="dxa" w:w="90"/>
-              <w:bottom w:type="dxa" w:w="50"/>
-              <w:right w:type="dxa" w:w="90"/>
-            </w:tcMar>
-          </w:tcPr>
-          <w:p>
-            <w:pPr>
-              <w:jc w:val="left"/>
-            </w:pPr>
-            <w:r>
-              <w:rPr>
-                <w:sz w:val="19"/>
-                <w:szCs w:val="19"/>
-              </w:rPr>
-              <w:t xml:space="preserve">22 h</w:t>
             </w:r>
           </w:p>
         </w:tc>
@@ -5644,7 +6192,7 @@
           <w:b/>
           <w:bCs/>
         </w:rPr>
-        <w:t xml:space="preserve">Jeudi 22 octobre (jour 3) : la présentation</w:t>
+        <w:t xml:space="preserve">Jeudi 22 octobre : point d’étape et mentorat avec SENSAT</w:t>
       </w:r>
     </w:p>
     <w:tbl>
@@ -5817,7 +6365,7 @@
                 <w:sz w:val="19"/>
                 <w:szCs w:val="19"/>
               </w:rPr>
-              <w:t xml:space="preserve">Enregistrer chacun sa partie du message audio en wolof (15 secondes, texte dans le document du pitch)</w:t>
+              <w:t xml:space="preserve">Point d’étape et mentorat : présenter les premiers résultats, les difficultés et le plan de finalisation ; noter les conseils</w:t>
             </w:r>
           </w:p>
         </w:tc>
@@ -5846,7 +6394,7 @@
                 <w:sz w:val="19"/>
                 <w:szCs w:val="19"/>
               </w:rPr>
-              <w:t xml:space="preserve">12 h</w:t>
+              <w:t xml:space="preserve">heure communiquée par SENSAT</w:t>
             </w:r>
           </w:p>
         </w:tc>
@@ -5881,7 +6429,7 @@
                 <w:sz w:val="19"/>
                 <w:szCs w:val="19"/>
               </w:rPr>
-              <w:t xml:space="preserve">Malick</w:t>
+              <w:t xml:space="preserve">Ndèye Fatou</w:t>
             </w:r>
           </w:p>
         </w:tc>
@@ -5911,7 +6459,7 @@
                 <w:sz w:val="19"/>
                 <w:szCs w:val="19"/>
               </w:rPr>
-              <w:t xml:space="preserve">Finaliser le tableau de bord, enregistrer la vidéo de démonstration</w:t>
+              <w:t xml:space="preserve">Intégrer les conseils du mentorat dans la note de concept et les diapositives</w:t>
             </w:r>
           </w:p>
         </w:tc>
@@ -5941,7 +6489,7 @@
                 <w:sz w:val="19"/>
                 <w:szCs w:val="19"/>
               </w:rPr>
-              <w:t xml:space="preserve">14 h</w:t>
+              <w:t xml:space="preserve">20 h</w:t>
             </w:r>
           </w:p>
         </w:tc>
@@ -5975,7 +6523,7 @@
                 <w:sz w:val="19"/>
                 <w:szCs w:val="19"/>
               </w:rPr>
-              <w:t xml:space="preserve">Ndèye Fatou</w:t>
+              <w:t xml:space="preserve">Malick</w:t>
             </w:r>
           </w:p>
         </w:tc>
@@ -6004,7 +6552,7 @@
                 <w:sz w:val="19"/>
                 <w:szCs w:val="19"/>
               </w:rPr>
-              <w:t xml:space="preserve">Finaliser les diapositives, relire tous les chiffres, cocher chaque promesse du tableau de la section 2</w:t>
+              <w:t xml:space="preserve">Finaliser le prototype et enregistrer la vidéo de démonstration (2 à 3 minutes)</w:t>
             </w:r>
           </w:p>
         </w:tc>
@@ -6033,7 +6581,7 @@
                 <w:sz w:val="19"/>
                 <w:szCs w:val="19"/>
               </w:rPr>
-              <w:t xml:space="preserve">17 h</w:t>
+              <w:t xml:space="preserve">20 h</w:t>
             </w:r>
           </w:p>
         </w:tc>
@@ -6098,7 +6646,7 @@
                 <w:sz w:val="19"/>
                 <w:szCs w:val="19"/>
               </w:rPr>
-              <w:t xml:space="preserve">Répétition complète avec un minuteur</w:t>
+              <w:t xml:space="preserve">Enregistrer chacun sa partie du message audio en wolof (15 secondes)</w:t>
             </w:r>
           </w:p>
         </w:tc>
@@ -6128,7 +6676,137 @@
                 <w:sz w:val="19"/>
                 <w:szCs w:val="19"/>
               </w:rPr>
-              <w:t xml:space="preserve">19 h</w:t>
+              <w:t xml:space="preserve">20 h</w:t>
+            </w:r>
+          </w:p>
+        </w:tc>
+      </w:tr>
+    </w:tbl>
+    <w:p>
+      <w:pPr>
+        <w:spacing w:after="60"/>
+      </w:pPr>
+    </w:p>
+    <w:p>
+      <w:pPr>
+        <w:jc w:val="both"/>
+      </w:pPr>
+      <w:r>
+        <w:rPr>
+          <w:b/>
+          <w:bCs/>
+        </w:rPr>
+        <w:t xml:space="preserve">Vendredi 23 octobre : remise du dossier</w:t>
+      </w:r>
+    </w:p>
+    <w:tbl>
+      <w:tblPr>
+        <w:tblW w:type="dxa" w:w="10092"/>
+        <w:tblBorders>
+          <w:top w:val="single" w:color="auto" w:sz="4"/>
+          <w:left w:val="single" w:color="auto" w:sz="4"/>
+          <w:bottom w:val="single" w:color="auto" w:sz="4"/>
+          <w:right w:val="single" w:color="auto" w:sz="4"/>
+          <w:insideH w:val="single" w:color="auto" w:sz="4"/>
+          <w:insideV w:val="single" w:color="auto" w:sz="4"/>
+        </w:tblBorders>
+      </w:tblPr>
+      <w:tblGrid>
+        <w:gridCol w:w="1901"/>
+        <w:gridCol w:w="6290"/>
+        <w:gridCol w:w="1901"/>
+      </w:tblGrid>
+      <w:tr>
+        <w:trPr>
+          <w:tblHeader/>
+        </w:trPr>
+        <w:tc>
+          <w:tcPr>
+            <w:tcW w:type="dxa" w:w="1901"/>
+            <w:tcBorders>
+              <w:top w:val="single" w:color="CFDCD9" w:sz="4"/>
+              <w:left w:val="single" w:color="CFDCD9" w:sz="4"/>
+              <w:bottom w:val="single" w:color="CFDCD9" w:sz="4"/>
+              <w:right w:val="single" w:color="CFDCD9" w:sz="4"/>
+            </w:tcBorders>
+            <w:shd w:fill="0B7A6F" w:color="auto" w:val="clear"/>
+            <w:tcMar>
+              <w:top w:type="dxa" w:w="50"/>
+              <w:left w:type="dxa" w:w="90"/>
+              <w:bottom w:type="dxa" w:w="50"/>
+              <w:right w:type="dxa" w:w="90"/>
+            </w:tcMar>
+          </w:tcPr>
+          <w:p>
+            <w:r>
+              <w:rPr>
+                <w:b/>
+                <w:bCs/>
+                <w:color w:val="FFFFFF"/>
+                <w:sz w:val="19"/>
+                <w:szCs w:val="19"/>
+              </w:rPr>
+              <w:t xml:space="preserve">Qui</w:t>
+            </w:r>
+          </w:p>
+        </w:tc>
+        <w:tc>
+          <w:tcPr>
+            <w:tcW w:type="dxa" w:w="6290"/>
+            <w:tcBorders>
+              <w:top w:val="single" w:color="CFDCD9" w:sz="4"/>
+              <w:left w:val="single" w:color="CFDCD9" w:sz="4"/>
+              <w:bottom w:val="single" w:color="CFDCD9" w:sz="4"/>
+              <w:right w:val="single" w:color="CFDCD9" w:sz="4"/>
+            </w:tcBorders>
+            <w:shd w:fill="0B7A6F" w:color="auto" w:val="clear"/>
+            <w:tcMar>
+              <w:top w:type="dxa" w:w="50"/>
+              <w:left w:type="dxa" w:w="90"/>
+              <w:bottom w:type="dxa" w:w="50"/>
+              <w:right w:type="dxa" w:w="90"/>
+            </w:tcMar>
+          </w:tcPr>
+          <w:p>
+            <w:r>
+              <w:rPr>
+                <w:b/>
+                <w:bCs/>
+                <w:color w:val="FFFFFF"/>
+                <w:sz w:val="19"/>
+                <w:szCs w:val="19"/>
+              </w:rPr>
+              <w:t xml:space="preserve">Tâche</w:t>
+            </w:r>
+          </w:p>
+        </w:tc>
+        <w:tc>
+          <w:tcPr>
+            <w:tcW w:type="dxa" w:w="1901"/>
+            <w:tcBorders>
+              <w:top w:val="single" w:color="CFDCD9" w:sz="4"/>
+              <w:left w:val="single" w:color="CFDCD9" w:sz="4"/>
+              <w:bottom w:val="single" w:color="CFDCD9" w:sz="4"/>
+              <w:right w:val="single" w:color="CFDCD9" w:sz="4"/>
+            </w:tcBorders>
+            <w:shd w:fill="0B7A6F" w:color="auto" w:val="clear"/>
+            <w:tcMar>
+              <w:top w:type="dxa" w:w="50"/>
+              <w:left w:type="dxa" w:w="90"/>
+              <w:bottom w:type="dxa" w:w="50"/>
+              <w:right w:type="dxa" w:w="90"/>
+            </w:tcMar>
+          </w:tcPr>
+          <w:p>
+            <w:r>
+              <w:rPr>
+                <w:b/>
+                <w:bCs/>
+                <w:color w:val="FFFFFF"/>
+                <w:sz w:val="19"/>
+                <w:szCs w:val="19"/>
+              </w:rPr>
+              <w:t xml:space="preserve">À livrer avant</w:t>
             </w:r>
           </w:p>
         </w:tc>
@@ -6188,12 +6866,293 @@
             </w:pPr>
             <w:r>
               <w:rPr>
+                <w:sz w:val="19"/>
+                <w:szCs w:val="19"/>
+              </w:rPr>
+              <w:t xml:space="preserve">Relancer l’analyse une dernière fois, vérifier que tous les chiffres de la note, des diapositives et de l’inventaire sont identiques</w:t>
+            </w:r>
+          </w:p>
+        </w:tc>
+        <w:tc>
+          <w:tcPr>
+            <w:tcW w:type="dxa" w:w="1901"/>
+            <w:tcBorders>
+              <w:top w:val="single" w:color="CFDCD9" w:sz="4"/>
+              <w:left w:val="single" w:color="CFDCD9" w:sz="4"/>
+              <w:bottom w:val="single" w:color="CFDCD9" w:sz="4"/>
+              <w:right w:val="single" w:color="CFDCD9" w:sz="4"/>
+            </w:tcBorders>
+            <w:tcMar>
+              <w:top w:type="dxa" w:w="50"/>
+              <w:left w:type="dxa" w:w="90"/>
+              <w:bottom w:type="dxa" w:w="50"/>
+              <w:right w:type="dxa" w:w="90"/>
+            </w:tcMar>
+          </w:tcPr>
+          <w:p>
+            <w:pPr>
+              <w:jc w:val="left"/>
+            </w:pPr>
+            <w:r>
+              <w:rPr>
+                <w:sz w:val="19"/>
+                <w:szCs w:val="19"/>
+              </w:rPr>
+              <w:t xml:space="preserve">12 h</w:t>
+            </w:r>
+          </w:p>
+        </w:tc>
+      </w:tr>
+      <w:tr>
+        <w:trPr>
+          <w:cantSplit/>
+        </w:trPr>
+        <w:tc>
+          <w:tcPr>
+            <w:tcW w:type="dxa" w:w="1901"/>
+            <w:tcBorders>
+              <w:top w:val="single" w:color="CFDCD9" w:sz="4"/>
+              <w:left w:val="single" w:color="CFDCD9" w:sz="4"/>
+              <w:bottom w:val="single" w:color="CFDCD9" w:sz="4"/>
+              <w:right w:val="single" w:color="CFDCD9" w:sz="4"/>
+            </w:tcBorders>
+            <w:shd w:fill="F5F9F8" w:color="auto" w:val="clear"/>
+            <w:tcMar>
+              <w:top w:type="dxa" w:w="50"/>
+              <w:left w:type="dxa" w:w="90"/>
+              <w:bottom w:type="dxa" w:w="50"/>
+              <w:right w:type="dxa" w:w="90"/>
+            </w:tcMar>
+          </w:tcPr>
+          <w:p>
+            <w:pPr>
+              <w:jc w:val="left"/>
+            </w:pPr>
+            <w:r>
+              <w:rPr>
+                <w:sz w:val="19"/>
+                <w:szCs w:val="19"/>
+              </w:rPr>
+              <w:t xml:space="preserve">Ndèye Fatou</w:t>
+            </w:r>
+          </w:p>
+        </w:tc>
+        <w:tc>
+          <w:tcPr>
+            <w:tcW w:type="dxa" w:w="6290"/>
+            <w:tcBorders>
+              <w:top w:val="single" w:color="CFDCD9" w:sz="4"/>
+              <w:left w:val="single" w:color="CFDCD9" w:sz="4"/>
+              <w:bottom w:val="single" w:color="CFDCD9" w:sz="4"/>
+              <w:right w:val="single" w:color="CFDCD9" w:sz="4"/>
+            </w:tcBorders>
+            <w:shd w:fill="F5F9F8" w:color="auto" w:val="clear"/>
+            <w:tcMar>
+              <w:top w:type="dxa" w:w="50"/>
+              <w:left w:type="dxa" w:w="90"/>
+              <w:bottom w:type="dxa" w:w="50"/>
+              <w:right w:type="dxa" w:w="90"/>
+            </w:tcMar>
+          </w:tcPr>
+          <w:p>
+            <w:pPr>
+              <w:jc w:val="left"/>
+            </w:pPr>
+            <w:r>
+              <w:rPr>
+                <w:sz w:val="19"/>
+                <w:szCs w:val="19"/>
+              </w:rPr>
+              <w:t xml:space="preserve">Exporter la note, l’inventaire et la présentation en PDF ; préparer le zip des scripts</w:t>
+            </w:r>
+          </w:p>
+        </w:tc>
+        <w:tc>
+          <w:tcPr>
+            <w:tcW w:type="dxa" w:w="1901"/>
+            <w:tcBorders>
+              <w:top w:val="single" w:color="CFDCD9" w:sz="4"/>
+              <w:left w:val="single" w:color="CFDCD9" w:sz="4"/>
+              <w:bottom w:val="single" w:color="CFDCD9" w:sz="4"/>
+              <w:right w:val="single" w:color="CFDCD9" w:sz="4"/>
+            </w:tcBorders>
+            <w:shd w:fill="F5F9F8" w:color="auto" w:val="clear"/>
+            <w:tcMar>
+              <w:top w:type="dxa" w:w="50"/>
+              <w:left w:type="dxa" w:w="90"/>
+              <w:bottom w:type="dxa" w:w="50"/>
+              <w:right w:type="dxa" w:w="90"/>
+            </w:tcMar>
+          </w:tcPr>
+          <w:p>
+            <w:pPr>
+              <w:jc w:val="left"/>
+            </w:pPr>
+            <w:r>
+              <w:rPr>
+                <w:sz w:val="19"/>
+                <w:szCs w:val="19"/>
+              </w:rPr>
+              <w:t xml:space="preserve">15 h</w:t>
+            </w:r>
+          </w:p>
+        </w:tc>
+      </w:tr>
+      <w:tr>
+        <w:trPr>
+          <w:cantSplit/>
+        </w:trPr>
+        <w:tc>
+          <w:tcPr>
+            <w:tcW w:type="dxa" w:w="1901"/>
+            <w:tcBorders>
+              <w:top w:val="single" w:color="CFDCD9" w:sz="4"/>
+              <w:left w:val="single" w:color="CFDCD9" w:sz="4"/>
+              <w:bottom w:val="single" w:color="CFDCD9" w:sz="4"/>
+              <w:right w:val="single" w:color="CFDCD9" w:sz="4"/>
+            </w:tcBorders>
+            <w:tcMar>
+              <w:top w:type="dxa" w:w="50"/>
+              <w:left w:type="dxa" w:w="90"/>
+              <w:bottom w:type="dxa" w:w="50"/>
+              <w:right w:type="dxa" w:w="90"/>
+            </w:tcMar>
+          </w:tcPr>
+          <w:p>
+            <w:pPr>
+              <w:jc w:val="left"/>
+            </w:pPr>
+            <w:r>
+              <w:rPr>
+                <w:sz w:val="19"/>
+                <w:szCs w:val="19"/>
+              </w:rPr>
+              <w:t xml:space="preserve">Les trois</w:t>
+            </w:r>
+          </w:p>
+        </w:tc>
+        <w:tc>
+          <w:tcPr>
+            <w:tcW w:type="dxa" w:w="6290"/>
+            <w:tcBorders>
+              <w:top w:val="single" w:color="CFDCD9" w:sz="4"/>
+              <w:left w:val="single" w:color="CFDCD9" w:sz="4"/>
+              <w:bottom w:val="single" w:color="CFDCD9" w:sz="4"/>
+              <w:right w:val="single" w:color="CFDCD9" w:sz="4"/>
+            </w:tcBorders>
+            <w:tcMar>
+              <w:top w:type="dxa" w:w="50"/>
+              <w:left w:type="dxa" w:w="90"/>
+              <w:bottom w:type="dxa" w:w="50"/>
+              <w:right w:type="dxa" w:w="90"/>
+            </w:tcMar>
+          </w:tcPr>
+          <w:p>
+            <w:pPr>
+              <w:jc w:val="left"/>
+            </w:pPr>
+            <w:r>
+              <w:rPr>
+                <w:sz w:val="19"/>
+                <w:szCs w:val="19"/>
+              </w:rPr>
+              <w:t xml:space="preserve">Relecture finale de tout le dossier</w:t>
+            </w:r>
+          </w:p>
+        </w:tc>
+        <w:tc>
+          <w:tcPr>
+            <w:tcW w:type="dxa" w:w="1901"/>
+            <w:tcBorders>
+              <w:top w:val="single" w:color="CFDCD9" w:sz="4"/>
+              <w:left w:val="single" w:color="CFDCD9" w:sz="4"/>
+              <w:bottom w:val="single" w:color="CFDCD9" w:sz="4"/>
+              <w:right w:val="single" w:color="CFDCD9" w:sz="4"/>
+            </w:tcBorders>
+            <w:tcMar>
+              <w:top w:type="dxa" w:w="50"/>
+              <w:left w:type="dxa" w:w="90"/>
+              <w:bottom w:type="dxa" w:w="50"/>
+              <w:right w:type="dxa" w:w="90"/>
+            </w:tcMar>
+          </w:tcPr>
+          <w:p>
+            <w:pPr>
+              <w:jc w:val="left"/>
+            </w:pPr>
+            <w:r>
+              <w:rPr>
+                <w:sz w:val="19"/>
+                <w:szCs w:val="19"/>
+              </w:rPr>
+              <w:t xml:space="preserve">17 h</w:t>
+            </w:r>
+          </w:p>
+        </w:tc>
+      </w:tr>
+      <w:tr>
+        <w:trPr>
+          <w:cantSplit/>
+        </w:trPr>
+        <w:tc>
+          <w:tcPr>
+            <w:tcW w:type="dxa" w:w="1901"/>
+            <w:tcBorders>
+              <w:top w:val="single" w:color="CFDCD9" w:sz="4"/>
+              <w:left w:val="single" w:color="CFDCD9" w:sz="4"/>
+              <w:bottom w:val="single" w:color="CFDCD9" w:sz="4"/>
+              <w:right w:val="single" w:color="CFDCD9" w:sz="4"/>
+            </w:tcBorders>
+            <w:shd w:fill="F5F9F8" w:color="auto" w:val="clear"/>
+            <w:tcMar>
+              <w:top w:type="dxa" w:w="50"/>
+              <w:left w:type="dxa" w:w="90"/>
+              <w:bottom w:type="dxa" w:w="50"/>
+              <w:right w:type="dxa" w:w="90"/>
+            </w:tcMar>
+          </w:tcPr>
+          <w:p>
+            <w:pPr>
+              <w:jc w:val="left"/>
+            </w:pPr>
+            <w:r>
+              <w:rPr>
+                <w:sz w:val="19"/>
+                <w:szCs w:val="19"/>
+              </w:rPr>
+              <w:t xml:space="preserve">Ndèye Fatou</w:t>
+            </w:r>
+          </w:p>
+        </w:tc>
+        <w:tc>
+          <w:tcPr>
+            <w:tcW w:type="dxa" w:w="6290"/>
+            <w:tcBorders>
+              <w:top w:val="single" w:color="CFDCD9" w:sz="4"/>
+              <w:left w:val="single" w:color="CFDCD9" w:sz="4"/>
+              <w:bottom w:val="single" w:color="CFDCD9" w:sz="4"/>
+              <w:right w:val="single" w:color="CFDCD9" w:sz="4"/>
+            </w:tcBorders>
+            <w:shd w:fill="F5F9F8" w:color="auto" w:val="clear"/>
+            <w:tcMar>
+              <w:top w:type="dxa" w:w="50"/>
+              <w:left w:type="dxa" w:w="90"/>
+              <w:bottom w:type="dxa" w:w="50"/>
+              <w:right w:type="dxa" w:w="90"/>
+            </w:tcMar>
+          </w:tcPr>
+          <w:p>
+            <w:pPr>
+              <w:jc w:val="left"/>
+            </w:pPr>
+            <w:r>
+              <w:rPr>
                 <w:b/>
                 <w:bCs/>
                 <w:sz w:val="19"/>
                 <w:szCs w:val="19"/>
               </w:rPr>
-              <w:t xml:space="preserve">Envoi de la présentation à SENSAT</w:t>
+              <w:t xml:space="preserve">Créer le dossier Google Drive, le partager « Tous les utilisateurs disposant du lien », déposer le lien dans le formulaire</w:t>
             </w:r>
           </w:p>
         </w:tc>
@@ -6206,6 +7165,7 @@
               <w:bottom w:val="single" w:color="CFDCD9" w:sz="4"/>
               <w:right w:val="single" w:color="CFDCD9" w:sz="4"/>
             </w:tcBorders>
+            <w:shd w:fill="F5F9F8" w:color="auto" w:val="clear"/>
             <w:tcMar>
               <w:top w:type="dxa" w:w="50"/>
               <w:left w:type="dxa" w:w="90"/>
@@ -6224,7 +7184,7 @@
                 <w:sz w:val="19"/>
                 <w:szCs w:val="19"/>
               </w:rPr>
-              <w:t xml:space="preserve">20 h</w:t>
+              <w:t xml:space="preserve">18 h</w:t>
             </w:r>
             <w:r>
               <w:rPr>
@@ -6444,7 +7404,7 @@
                 <w:sz w:val="19"/>
                 <w:szCs w:val="19"/>
               </w:rPr>
-              <w:t xml:space="preserve">Les données de TRL arrivent tard</w:t>
+              <w:t xml:space="preserve">Un service de téléchargement est indisponible</w:t>
             </w:r>
           </w:p>
         </w:tc>
@@ -6473,7 +7433,7 @@
                 <w:sz w:val="19"/>
                 <w:szCs w:val="19"/>
               </w:rPr>
-              <w:t xml:space="preserve">Abdoulaye télécharge lui-même les images Sentinel-2 dans Google Earth Engine</w:t>
+              <w:t xml:space="preserve">Toutes les données utiles sont déjà téléchargées dans donnees/ ; les images sont aussi sur Copernicus Data Space</w:t>
             </w:r>
           </w:p>
         </w:tc>
@@ -6873,7 +7833,7 @@
         <w:pStyle w:val="Heading2"/>
       </w:pPr>
       <w:r>
-        <w:t xml:space="preserve">7. Structure de la présentation (10 à 12 diapositives)</w:t>
+        <w:t xml:space="preserve">7. Support de présentation (remis le 23) et oral du 26 octobre (7 min + 5 min de questions, si sélectionnés)</w:t>
       </w:r>
     </w:p>
     <w:p>
@@ -7082,7 +8042,7 @@
         <w:t xml:space="preserve">Impact et ODD</w:t>
       </w:r>
       <w:r>
-        <w:t xml:space="preserve"> : 13, 11, 14 et 1.</w:t>
+        <w:t xml:space="preserve"> : ODD 11 (cible 11.5) en principal, ODD 13 (cible 13.1) en complément, comme le demande le guide.</w:t>
       </w:r>
     </w:p>
     <w:p>
@@ -7254,10 +8214,29 @@
           <w:b/>
           <w:bCs/>
         </w:rPr>
+        <w:t xml:space="preserve">La déclaration honnête des outils d’IA</w:t>
+      </w:r>
+      <w:r>
+        <w:t xml:space="preserve"> et des contributions de chaque membre, comme l’exige le guide.</w:t>
+      </w:r>
+    </w:p>
+    <w:p>
+      <w:pPr>
+        <w:pStyle w:val="ListParagraph"/>
+        <w:numPr>
+          <w:ilvl w:val="0"/>
+          <w:numId w:val="2"/>
+        </w:numPr>
+      </w:pPr>
+      <w:r>
+        <w:rPr>
+          <w:b/>
+          <w:bCs/>
+        </w:rPr>
         <w:t xml:space="preserve">Le respect strict des délais</w:t>
       </w:r>
       <w:r>
-        <w:t xml:space="preserve"> : envoi à 20 h, pas à 23 h 58.</w:t>
+        <w:t xml:space="preserve"> : dépôt du dossier le 23 octobre à 18 h, pas à 23 h 58.</w:t>
       </w:r>
     </w:p>
     <w:sectPr>

</xml_diff>